<commit_message>
feat: added customer.html conversational chatbot with 5-step sentiment-aware conversation flow — Negative triggers empathetic resolution with replacement/refund options, Neutral collects detailed feedback, Positive offers loyalty program, customers never see technical sentiment outputs-added docs: updated final technical report with negation handling experiments (Section 5.3) — documented root cause analysis, repeat=20 experiment (92% negation but 50% overall), repeat=5 experiment (74% overall), conclusion to use confidence threshold in customer.html, updated Section 8.3 with confidence threshold explanation
</commit_message>
<xml_diff>
--- a/reports/LensWord_Technical_Report.docx
+++ b/reports/LensWord_Technical_Report.docx
@@ -504,28 +504,7 @@
           <w:sz w:val="22"/>
           <w:szCs w:val="22"/>
         </w:rPr>
-        <w:t xml:space="preserve">LensWord is an end-to-end deep learning system that automatically classifies Amazon product reviews as Positive, Neutral, or Negative, and uses a Retrieval-Augmented Generation (RAG) system to suggest the most relevant customer service response based on the detected sentiment.</w:t>
-      </w:r>
-    </w:p>
-    <w:p>
-      <w:pPr>
-        <w:spacing w:after="80" w:before="80"/>
-      </w:pPr>
-      <w:r>
-        <w:t xml:space="preserve"/>
-      </w:r>
-    </w:p>
-    <w:p>
-      <w:pPr>
-        <w:spacing w:after="80" w:before="80"/>
-      </w:pPr>
-      <w:r>
-        <w:rPr>
-          <w:rFonts w:ascii="Arial" w:cs="Arial" w:eastAsia="Arial" w:hAnsi="Arial"/>
-          <w:sz w:val="22"/>
-          <w:szCs w:val="22"/>
-        </w:rPr>
-        <w:t xml:space="preserve">The final model achieved 88.85% overall accuracy and 88.40% Macro F1 score on a held-out test set, outperforming three pretrained HuggingFace models including a model specifically trained on Amazon reviews. The system is deployed via a FastAPI endpoint with a JavaScript web application frontend and Docker containerization.</w:t>
+        <w:t xml:space="preserve">LensWord is an end-to-end deep learning system that automatically classifies Amazon product reviews as Positive, Neutral, or Negative, and uses a Retrieval-Augmented Generation (RAG) system to suggest the most relevant customer service response. The system includes two interfaces: a business-facing analytics dashboard and a customer-facing conversational chatbot.</w:t>
       </w:r>
     </w:p>
     <w:p>
@@ -995,7 +974,7 @@
                 <w:sz w:val="20"/>
                 <w:szCs w:val="20"/>
               </w:rPr>
-              <w:t xml:space="preserve">915</w:t>
+              <w:t xml:space="preserve">916</w:t>
             </w:r>
           </w:p>
         </w:tc>
@@ -1060,6 +1039,70 @@
                 <w:szCs w:val="20"/>
               </w:rPr>
               <w:t xml:space="preserve">10,665</w:t>
+            </w:r>
+          </w:p>
+        </w:tc>
+      </w:tr>
+      <w:tr>
+        <w:tc>
+          <w:tcPr>
+            <w:tcW w:type="dxa" w:w="4000"/>
+            <w:tcBorders>
+              <w:top w:val="single" w:color="CCCCCC" w:sz="1"/>
+              <w:left w:val="single" w:color="CCCCCC" w:sz="1"/>
+              <w:bottom w:val="single" w:color="CCCCCC" w:sz="1"/>
+              <w:right w:val="single" w:color="CCCCCC" w:sz="1"/>
+            </w:tcBorders>
+            <w:shd w:fill="FFFFFF" w:val="clear"/>
+            <w:tcMar>
+              <w:top w:type="dxa" w:w="80"/>
+              <w:left w:type="dxa" w:w="120"/>
+              <w:bottom w:type="dxa" w:w="80"/>
+              <w:right w:type="dxa" w:w="120"/>
+            </w:tcMar>
+          </w:tcPr>
+          <w:p>
+            <w:r>
+              <w:rPr>
+                <w:rFonts w:ascii="Arial" w:cs="Arial" w:eastAsia="Arial" w:hAnsi="Arial"/>
+                <w:b w:val="false"/>
+                <w:bCs w:val="false"/>
+                <w:color w:val="000000"/>
+                <w:sz w:val="20"/>
+                <w:szCs w:val="20"/>
+              </w:rPr>
+              <w:t xml:space="preserve">Total Parameters</w:t>
+            </w:r>
+          </w:p>
+        </w:tc>
+        <w:tc>
+          <w:tcPr>
+            <w:tcW w:type="dxa" w:w="5360"/>
+            <w:tcBorders>
+              <w:top w:val="single" w:color="CCCCCC" w:sz="1"/>
+              <w:left w:val="single" w:color="CCCCCC" w:sz="1"/>
+              <w:bottom w:val="single" w:color="CCCCCC" w:sz="1"/>
+              <w:right w:val="single" w:color="CCCCCC" w:sz="1"/>
+            </w:tcBorders>
+            <w:shd w:fill="FFFFFF" w:val="clear"/>
+            <w:tcMar>
+              <w:top w:type="dxa" w:w="80"/>
+              <w:left w:type="dxa" w:w="120"/>
+              <w:bottom w:type="dxa" w:w="80"/>
+              <w:right w:type="dxa" w:w="120"/>
+            </w:tcMar>
+          </w:tcPr>
+          <w:p>
+            <w:r>
+              <w:rPr>
+                <w:rFonts w:ascii="Arial" w:cs="Arial" w:eastAsia="Arial" w:hAnsi="Arial"/>
+                <w:b w:val="false"/>
+                <w:bCs w:val="false"/>
+                <w:color w:val="000000"/>
+                <w:sz w:val="20"/>
+                <w:szCs w:val="20"/>
+              </w:rPr>
+              <w:t xml:space="preserve">872,451</w:t>
             </w:r>
           </w:p>
         </w:tc>
@@ -1107,7 +1150,7 @@
           <w:sz w:val="22"/>
           <w:szCs w:val="22"/>
         </w:rPr>
-        <w:t xml:space="preserve">Online retailers generate millions of product reviews every day. Most businesses rely solely on star ratings to gauge customer sentiment, which fails to capture the nuance behind customer satisfaction or dissatisfaction. Manual review reading at scale is neither practical nor cost-effective.</w:t>
+        <w:t xml:space="preserve">Online retailers generate millions of product reviews daily. A 2-star rating tells a business a customer is unhappy but not whether the problem was product quality, shipping, or customer service. Without knowing the reason, businesses cannot fix the right thing.</w:t>
       </w:r>
     </w:p>
     <w:p>
@@ -1128,7 +1171,7 @@
           <w:sz w:val="22"/>
           <w:szCs w:val="22"/>
         </w:rPr>
-        <w:t xml:space="preserve">LensWord addresses this by automating sentiment classification of written product reviews. When integrated into an e-commerce pipeline, it enables businesses to:</w:t>
+        <w:t xml:space="preserve">LensWord addresses this by automating sentiment classification and providing actionable outputs including priority levels and context-aware response suggestions. The system serves two distinct audiences:</w:t>
       </w:r>
     </w:p>
     <w:p>
@@ -1146,7 +1189,7 @@
           <w:sz w:val="22"/>
           <w:szCs w:val="22"/>
         </w:rPr>
-        <w:t xml:space="preserve">Identify negative sentiment spikes before they escalate into reputation damage</w:t>
+        <w:t xml:space="preserve">Business teams who need analytics, priority flagging, and suggested responses</w:t>
       </w:r>
     </w:p>
     <w:p>
@@ -1164,64 +1207,7 @@
           <w:sz w:val="22"/>
           <w:szCs w:val="22"/>
         </w:rPr>
-        <w:t xml:space="preserve">Automatically prioritize customer service escalations based on sentiment and confidence</w:t>
-      </w:r>
-    </w:p>
-    <w:p>
-      <w:pPr>
-        <w:pStyle w:val="ListParagraph"/>
-        <w:numPr>
-          <w:ilvl w:val="0"/>
-          <w:numId w:val="2"/>
-        </w:numPr>
-        <w:spacing w:after="60" w:before="60"/>
-      </w:pPr>
-      <w:r>
-        <w:rPr>
-          <w:rFonts w:ascii="Arial" w:cs="Arial" w:eastAsia="Arial" w:hAnsi="Arial"/>
-          <w:sz w:val="22"/>
-          <w:szCs w:val="22"/>
-        </w:rPr>
-        <w:t xml:space="preserve">Generate context-aware response suggestions using RAG, reducing agent response time</w:t>
-      </w:r>
-    </w:p>
-    <w:p>
-      <w:pPr>
-        <w:pStyle w:val="ListParagraph"/>
-        <w:numPr>
-          <w:ilvl w:val="0"/>
-          <w:numId w:val="2"/>
-        </w:numPr>
-        <w:spacing w:after="60" w:before="60"/>
-      </w:pPr>
-      <w:r>
-        <w:rPr>
-          <w:rFonts w:ascii="Arial" w:cs="Arial" w:eastAsia="Arial" w:hAnsi="Arial"/>
-          <w:sz w:val="22"/>
-          <w:szCs w:val="22"/>
-        </w:rPr>
-        <w:t xml:space="preserve">Analyze sentiment trends across product lines and time periods</w:t>
-      </w:r>
-    </w:p>
-    <w:p>
-      <w:pPr>
-        <w:spacing w:after="80" w:before="80"/>
-      </w:pPr>
-      <w:r>
-        <w:t xml:space="preserve"/>
-      </w:r>
-    </w:p>
-    <w:p>
-      <w:pPr>
-        <w:spacing w:after="80" w:before="80"/>
-      </w:pPr>
-      <w:r>
-        <w:rPr>
-          <w:rFonts w:ascii="Arial" w:cs="Arial" w:eastAsia="Arial" w:hAnsi="Arial"/>
-          <w:sz w:val="22"/>
-          <w:szCs w:val="22"/>
-        </w:rPr>
-        <w:t xml:space="preserve">The system is particularly valuable for high-volume review platforms where manual monitoring is infeasible. A single API call returns the sentiment classification, confidence score, probability breakdown across all three classes, and a suggested customer service response — all in under 300 milliseconds.</w:t>
+        <w:t xml:space="preserve">Customers who deserve a personalized, empathetic conversational experience after submitting feedback</w:t>
       </w:r>
     </w:p>
     <w:p>
@@ -1601,7 +1587,7 @@
                 <w:sz w:val="20"/>
                 <w:szCs w:val="20"/>
               </w:rPr>
-              <w:t xml:space="preserve">Restaurant and business reviews with 1-5 star ratings</w:t>
+              <w:t xml:space="preserve">Restaurant reviews with 1-5 star ratings, filtered to ≤50 words</w:t>
             </w:r>
           </w:p>
         </w:tc>
@@ -1632,7 +1618,7 @@
                 <w:sz w:val="20"/>
                 <w:szCs w:val="20"/>
               </w:rPr>
-              <w:t xml:space="preserve">650,000 reviews</w:t>
+              <w:t xml:space="preserve">6,000 sampled</w:t>
             </w:r>
           </w:p>
         </w:tc>
@@ -1663,7 +1649,7 @@
                 <w:sz w:val="20"/>
                 <w:szCs w:val="20"/>
               </w:rPr>
-              <w:t xml:space="preserve">HuggingFace (Yelp/yelp_review_full)</w:t>
+              <w:t xml:space="preserve">HuggingFace</w:t>
             </w:r>
           </w:p>
         </w:tc>
@@ -1691,27 +1677,6 @@
           <w:szCs w:val="24"/>
         </w:rPr>
         <w:t xml:space="preserve">3.2  Label Mapping</w:t>
-      </w:r>
-    </w:p>
-    <w:p>
-      <w:pPr>
-        <w:spacing w:after="80" w:before="80"/>
-      </w:pPr>
-      <w:r>
-        <w:rPr>
-          <w:rFonts w:ascii="Arial" w:cs="Arial" w:eastAsia="Arial" w:hAnsi="Arial"/>
-          <w:sz w:val="22"/>
-          <w:szCs w:val="22"/>
-        </w:rPr>
-        <w:t xml:space="preserve">Both datasets used star ratings as proxy sentiment labels, mapped as follows:</w:t>
-      </w:r>
-    </w:p>
-    <w:p>
-      <w:pPr>
-        <w:spacing w:after="80" w:before="80"/>
-      </w:pPr>
-      <w:r>
-        <w:t xml:space="preserve"/>
       </w:r>
     </w:p>
     <w:tbl>
@@ -2133,7 +2098,7 @@
           <w:sz w:val="24"/>
           <w:szCs w:val="24"/>
         </w:rPr>
-        <w:t xml:space="preserve">3.3  Dataset Expansion</w:t>
+        <w:t xml:space="preserve">3.3  Class Imbalance Problem &amp; Resolution</w:t>
       </w:r>
     </w:p>
     <w:p>
@@ -2146,7 +2111,7 @@
           <w:sz w:val="22"/>
           <w:szCs w:val="22"/>
         </w:rPr>
-        <w:t xml:space="preserve">Initial EDA revealed severe class imbalance in the Amazon Alexa dataset: 87% Positive, 8% Negative, and 5% Neutral. Following advisor feedback regarding dataset size, 6,000 short Yelp reviews were sampled (2,000 per class, filtered to ≤50 words) and combined with the original Amazon data.</w:t>
+        <w:t xml:space="preserve">Initial EDA revealed severe class imbalance: 87% Positive, 8% Negative, 5% Neutral. A model trained on this would achieve 87% accuracy by always predicting Positive without learning anything meaningful. 6,000 short Yelp reviews were added and SMOTE applied to balance all three classes.</w:t>
       </w:r>
     </w:p>
     <w:p>
@@ -2647,6 +2612,163 @@
           </w:p>
         </w:tc>
       </w:tr>
+      <w:tr>
+        <w:tc>
+          <w:tcPr>
+            <w:tcW w:type="dxa" w:w="2500"/>
+            <w:tcBorders>
+              <w:top w:val="single" w:color="CCCCCC" w:sz="1"/>
+              <w:left w:val="single" w:color="CCCCCC" w:sz="1"/>
+              <w:bottom w:val="single" w:color="CCCCCC" w:sz="1"/>
+              <w:right w:val="single" w:color="CCCCCC" w:sz="1"/>
+            </w:tcBorders>
+            <w:shd w:fill="FFFFFF" w:val="clear"/>
+            <w:tcMar>
+              <w:top w:type="dxa" w:w="80"/>
+              <w:left w:type="dxa" w:w="120"/>
+              <w:bottom w:type="dxa" w:w="80"/>
+              <w:right w:type="dxa" w:w="120"/>
+            </w:tcMar>
+          </w:tcPr>
+          <w:p>
+            <w:r>
+              <w:rPr>
+                <w:rFonts w:ascii="Arial" w:cs="Arial" w:eastAsia="Arial" w:hAnsi="Arial"/>
+                <w:b w:val="false"/>
+                <w:bCs w:val="false"/>
+                <w:color w:val="000000"/>
+                <w:sz w:val="20"/>
+                <w:szCs w:val="20"/>
+              </w:rPr>
+              <w:t xml:space="preserve">After SMOTE (training only)</w:t>
+            </w:r>
+          </w:p>
+        </w:tc>
+        <w:tc>
+          <w:tcPr>
+            <w:tcW w:type="dxa" w:w="1800"/>
+            <w:tcBorders>
+              <w:top w:val="single" w:color="CCCCCC" w:sz="1"/>
+              <w:left w:val="single" w:color="CCCCCC" w:sz="1"/>
+              <w:bottom w:val="single" w:color="CCCCCC" w:sz="1"/>
+              <w:right w:val="single" w:color="CCCCCC" w:sz="1"/>
+            </w:tcBorders>
+            <w:shd w:fill="FFFFFF" w:val="clear"/>
+            <w:tcMar>
+              <w:top w:type="dxa" w:w="80"/>
+              <w:left w:type="dxa" w:w="120"/>
+              <w:bottom w:type="dxa" w:w="80"/>
+              <w:right w:type="dxa" w:w="120"/>
+            </w:tcMar>
+          </w:tcPr>
+          <w:p>
+            <w:r>
+              <w:rPr>
+                <w:rFonts w:ascii="Arial" w:cs="Arial" w:eastAsia="Arial" w:hAnsi="Arial"/>
+                <w:b w:val="false"/>
+                <w:bCs w:val="false"/>
+                <w:color w:val="000000"/>
+                <w:sz w:val="20"/>
+                <w:szCs w:val="20"/>
+              </w:rPr>
+              <w:t xml:space="preserve">10,665</w:t>
+            </w:r>
+          </w:p>
+        </w:tc>
+        <w:tc>
+          <w:tcPr>
+            <w:tcW w:type="dxa" w:w="1600"/>
+            <w:tcBorders>
+              <w:top w:val="single" w:color="CCCCCC" w:sz="1"/>
+              <w:left w:val="single" w:color="CCCCCC" w:sz="1"/>
+              <w:bottom w:val="single" w:color="CCCCCC" w:sz="1"/>
+              <w:right w:val="single" w:color="CCCCCC" w:sz="1"/>
+            </w:tcBorders>
+            <w:shd w:fill="FFFFFF" w:val="clear"/>
+            <w:tcMar>
+              <w:top w:type="dxa" w:w="80"/>
+              <w:left w:type="dxa" w:w="120"/>
+              <w:bottom w:type="dxa" w:w="80"/>
+              <w:right w:type="dxa" w:w="120"/>
+            </w:tcMar>
+          </w:tcPr>
+          <w:p>
+            <w:r>
+              <w:rPr>
+                <w:rFonts w:ascii="Arial" w:cs="Arial" w:eastAsia="Arial" w:hAnsi="Arial"/>
+                <w:b w:val="false"/>
+                <w:bCs w:val="false"/>
+                <w:color w:val="000000"/>
+                <w:sz w:val="20"/>
+                <w:szCs w:val="20"/>
+              </w:rPr>
+              <w:t xml:space="preserve">33%</w:t>
+            </w:r>
+          </w:p>
+        </w:tc>
+        <w:tc>
+          <w:tcPr>
+            <w:tcW w:type="dxa" w:w="1600"/>
+            <w:tcBorders>
+              <w:top w:val="single" w:color="CCCCCC" w:sz="1"/>
+              <w:left w:val="single" w:color="CCCCCC" w:sz="1"/>
+              <w:bottom w:val="single" w:color="CCCCCC" w:sz="1"/>
+              <w:right w:val="single" w:color="CCCCCC" w:sz="1"/>
+            </w:tcBorders>
+            <w:shd w:fill="FFFFFF" w:val="clear"/>
+            <w:tcMar>
+              <w:top w:type="dxa" w:w="80"/>
+              <w:left w:type="dxa" w:w="120"/>
+              <w:bottom w:type="dxa" w:w="80"/>
+              <w:right w:type="dxa" w:w="120"/>
+            </w:tcMar>
+          </w:tcPr>
+          <w:p>
+            <w:r>
+              <w:rPr>
+                <w:rFonts w:ascii="Arial" w:cs="Arial" w:eastAsia="Arial" w:hAnsi="Arial"/>
+                <w:b w:val="false"/>
+                <w:bCs w:val="false"/>
+                <w:color w:val="000000"/>
+                <w:sz w:val="20"/>
+                <w:szCs w:val="20"/>
+              </w:rPr>
+              <w:t xml:space="preserve">33%</w:t>
+            </w:r>
+          </w:p>
+        </w:tc>
+        <w:tc>
+          <w:tcPr>
+            <w:tcW w:type="dxa" w:w="1860"/>
+            <w:tcBorders>
+              <w:top w:val="single" w:color="CCCCCC" w:sz="1"/>
+              <w:left w:val="single" w:color="CCCCCC" w:sz="1"/>
+              <w:bottom w:val="single" w:color="CCCCCC" w:sz="1"/>
+              <w:right w:val="single" w:color="CCCCCC" w:sz="1"/>
+            </w:tcBorders>
+            <w:shd w:fill="FFFFFF" w:val="clear"/>
+            <w:tcMar>
+              <w:top w:type="dxa" w:w="80"/>
+              <w:left w:type="dxa" w:w="120"/>
+              <w:bottom w:type="dxa" w:w="80"/>
+              <w:right w:type="dxa" w:w="120"/>
+            </w:tcMar>
+          </w:tcPr>
+          <w:p>
+            <w:r>
+              <w:rPr>
+                <w:rFonts w:ascii="Arial" w:cs="Arial" w:eastAsia="Arial" w:hAnsi="Arial"/>
+                <w:b w:val="false"/>
+                <w:bCs w:val="false"/>
+                <w:color w:val="000000"/>
+                <w:sz w:val="20"/>
+                <w:szCs w:val="20"/>
+              </w:rPr>
+              <w:t xml:space="preserve">33%</w:t>
+            </w:r>
+          </w:p>
+        </w:tc>
+      </w:tr>
     </w:tbl>
     <w:p>
       <w:pPr>
@@ -2674,19 +2796,6 @@
     </w:p>
     <w:p>
       <w:pPr>
-        <w:spacing w:after="80" w:before="80"/>
-      </w:pPr>
-      <w:r>
-        <w:rPr>
-          <w:rFonts w:ascii="Arial" w:cs="Arial" w:eastAsia="Arial" w:hAnsi="Arial"/>
-          <w:sz w:val="22"/>
-          <w:szCs w:val="22"/>
-        </w:rPr>
-        <w:t xml:space="preserve">Text preprocessing followed these steps in order:</w:t>
-      </w:r>
-    </w:p>
-    <w:p>
-      <w:pPr>
         <w:pStyle w:val="ListParagraph"/>
         <w:numPr>
           <w:ilvl w:val="0"/>
@@ -2700,7 +2809,7 @@
           <w:sz w:val="22"/>
           <w:szCs w:val="22"/>
         </w:rPr>
-        <w:t xml:space="preserve">Lowercase conversion and punctuation removal using regular expressions</w:t>
+        <w:t xml:space="preserve">Lowercase conversion and punctuation removal</w:t>
       </w:r>
     </w:p>
     <w:p>
@@ -2736,7 +2845,7 @@
           <w:sz w:val="22"/>
           <w:szCs w:val="22"/>
         </w:rPr>
-        <w:t xml:space="preserve">Vocabulary construction limited to the 4,340 most frequent words, with &lt;PAD&gt; and &lt;UNK&gt; special tokens</w:t>
+        <w:t xml:space="preserve">Vocabulary: 4,340 most frequent words with &lt;PAD&gt; and &lt;UNK&gt; tokens</w:t>
       </w:r>
     </w:p>
     <w:p>
@@ -2754,7 +2863,7 @@
           <w:sz w:val="22"/>
           <w:szCs w:val="22"/>
         </w:rPr>
-        <w:t xml:space="preserve">Sequence conversion: each word mapped to its vocabulary index</w:t>
+        <w:t xml:space="preserve">Padding/truncation to MAX_SEQ_LENGTH = 50 tokens</w:t>
       </w:r>
     </w:p>
     <w:p>
@@ -2772,7 +2881,7 @@
           <w:sz w:val="22"/>
           <w:szCs w:val="22"/>
         </w:rPr>
-        <w:t xml:space="preserve">Padding/truncation to MAX_SEQ_LENGTH = 50 words (chosen based on the 75th percentile review length of 32 words)</w:t>
+        <w:t xml:space="preserve">Train/validation/test split: 75% / 15% / 10%</w:t>
       </w:r>
     </w:p>
     <w:p>
@@ -2790,25 +2899,7 @@
           <w:sz w:val="22"/>
           <w:szCs w:val="22"/>
         </w:rPr>
-        <w:t xml:space="preserve">Train/validation/test split: 75% / 15% / 10%</w:t>
-      </w:r>
-    </w:p>
-    <w:p>
-      <w:pPr>
-        <w:pStyle w:val="ListParagraph"/>
-        <w:numPr>
-          <w:ilvl w:val="0"/>
-          <w:numId w:val="2"/>
-        </w:numPr>
-        <w:spacing w:after="60" w:before="60"/>
-      </w:pPr>
-      <w:r>
-        <w:rPr>
-          <w:rFonts w:ascii="Arial" w:cs="Arial" w:eastAsia="Arial" w:hAnsi="Arial"/>
-          <w:sz w:val="22"/>
-          <w:szCs w:val="22"/>
-        </w:rPr>
-        <w:t xml:space="preserve">SMOTE oversampling applied to training set only, balancing all three classes to 3,555 examples each</w:t>
+        <w:t xml:space="preserve">SMOTE oversampling applied to training set only</w:t>
       </w:r>
     </w:p>
     <w:p>
@@ -2856,116 +2947,7 @@
           <w:sz w:val="24"/>
           <w:szCs w:val="24"/>
         </w:rPr>
-        <w:t xml:space="preserve">4.1  Model Selection Rationale</w:t>
-      </w:r>
-    </w:p>
-    <w:p>
-      <w:pPr>
-        <w:spacing w:after="80" w:before="80"/>
-      </w:pPr>
-      <w:r>
-        <w:rPr>
-          <w:rFonts w:ascii="Arial" w:cs="Arial" w:eastAsia="Arial" w:hAnsi="Arial"/>
-          <w:sz w:val="22"/>
-          <w:szCs w:val="22"/>
-        </w:rPr>
-        <w:t xml:space="preserve">A Bidirectional LSTM (Long Short-Term Memory) was selected as the core architecture for the following reasons:</w:t>
-      </w:r>
-    </w:p>
-    <w:p>
-      <w:pPr>
-        <w:pStyle w:val="ListParagraph"/>
-        <w:numPr>
-          <w:ilvl w:val="0"/>
-          <w:numId w:val="2"/>
-        </w:numPr>
-        <w:spacing w:after="60" w:before="60"/>
-      </w:pPr>
-      <w:r>
-        <w:rPr>
-          <w:rFonts w:ascii="Arial" w:cs="Arial" w:eastAsia="Arial" w:hAnsi="Arial"/>
-          <w:sz w:val="22"/>
-          <w:szCs w:val="22"/>
-        </w:rPr>
-        <w:t xml:space="preserve">LSTMs are specifically designed for sequential data and maintain memory of earlier words when processing later ones, critical for understanding negations such as 'not good at all'</w:t>
-      </w:r>
-    </w:p>
-    <w:p>
-      <w:pPr>
-        <w:pStyle w:val="ListParagraph"/>
-        <w:numPr>
-          <w:ilvl w:val="0"/>
-          <w:numId w:val="2"/>
-        </w:numPr>
-        <w:spacing w:after="60" w:before="60"/>
-      </w:pPr>
-      <w:r>
-        <w:rPr>
-          <w:rFonts w:ascii="Arial" w:cs="Arial" w:eastAsia="Arial" w:hAnsi="Arial"/>
-          <w:sz w:val="22"/>
-          <w:szCs w:val="22"/>
-        </w:rPr>
-        <w:t xml:space="preserve">Bidirectional processing reads sentences in both forward and backward directions, providing richer contextual understanding</w:t>
-      </w:r>
-    </w:p>
-    <w:p>
-      <w:pPr>
-        <w:pStyle w:val="ListParagraph"/>
-        <w:numPr>
-          <w:ilvl w:val="0"/>
-          <w:numId w:val="2"/>
-        </w:numPr>
-        <w:spacing w:after="60" w:before="60"/>
-      </w:pPr>
-      <w:r>
-        <w:rPr>
-          <w:rFonts w:ascii="Arial" w:cs="Arial" w:eastAsia="Arial" w:hAnsi="Arial"/>
-          <w:sz w:val="22"/>
-          <w:szCs w:val="22"/>
-        </w:rPr>
-        <w:t xml:space="preserve">The architecture is explicitly covered in the program curriculum, ensuring team competency</w:t>
-      </w:r>
-    </w:p>
-    <w:p>
-      <w:pPr>
-        <w:pStyle w:val="ListParagraph"/>
-        <w:numPr>
-          <w:ilvl w:val="0"/>
-          <w:numId w:val="2"/>
-        </w:numPr>
-        <w:spacing w:after="60" w:before="60"/>
-      </w:pPr>
-      <w:r>
-        <w:rPr>
-          <w:rFonts w:ascii="Arial" w:cs="Arial" w:eastAsia="Arial" w:hAnsi="Arial"/>
-          <w:sz w:val="22"/>
-          <w:szCs w:val="22"/>
-        </w:rPr>
-        <w:t xml:space="preserve">Lightweight enough to train and deploy on CPU without GPU requirements</w:t>
-      </w:r>
-    </w:p>
-    <w:p>
-      <w:pPr>
-        <w:spacing w:after="80" w:before="80"/>
-      </w:pPr>
-      <w:r>
-        <w:t xml:space="preserve"/>
-      </w:r>
-    </w:p>
-    <w:p>
-      <w:pPr>
-        <w:spacing w:after="150" w:before="300"/>
-      </w:pPr>
-      <w:r>
-        <w:rPr>
-          <w:rFonts w:ascii="Arial" w:cs="Arial" w:eastAsia="Arial" w:hAnsi="Arial"/>
-          <w:b/>
-          <w:bCs/>
-          <w:color w:val="2E75B6"/>
-          <w:sz w:val="24"/>
-          <w:szCs w:val="24"/>
-        </w:rPr>
-        <w:t xml:space="preserve">4.2  Architecture Details</w:t>
+        <w:t xml:space="preserve">4.1  Architecture Details</w:t>
       </w:r>
     </w:p>
     <w:tbl>
@@ -3139,7 +3121,7 @@
                 <w:sz w:val="20"/>
                 <w:szCs w:val="20"/>
               </w:rPr>
-              <w:t xml:space="preserve">Vocabulary: 4,340 | Dimensions: 64 | padding_idx: 0</w:t>
+              <w:t xml:space="preserve">Vocab: 4,340 | Dims: 64 | padding_idx: 0</w:t>
             </w:r>
           </w:p>
         </w:tc>
@@ -3203,7 +3185,7 @@
                 <w:sz w:val="20"/>
                 <w:szCs w:val="20"/>
               </w:rPr>
-              <w:t xml:space="preserve">Bidirectional LSTM Layer 1</w:t>
+              <w:t xml:space="preserve">BiLSTM Layer 1</w:t>
             </w:r>
           </w:p>
         </w:tc>
@@ -3298,7 +3280,7 @@
                 <w:sz w:val="20"/>
                 <w:szCs w:val="20"/>
               </w:rPr>
-              <w:t xml:space="preserve">Bidirectional LSTM Layer 2</w:t>
+              <w:t xml:space="preserve">BiLSTM Layer 2</w:t>
             </w:r>
           </w:p>
         </w:tc>
@@ -3598,7 +3580,7 @@
           <w:sz w:val="24"/>
           <w:szCs w:val="24"/>
         </w:rPr>
-        <w:t xml:space="preserve">4.3  Training Configuration</w:t>
+        <w:t xml:space="preserve">4.2  Training Configuration</w:t>
       </w:r>
     </w:p>
     <w:tbl>
@@ -3803,7 +3785,7 @@
                 <w:sz w:val="20"/>
                 <w:szCs w:val="20"/>
               </w:rPr>
-              <w:t xml:space="preserve">Adaptive learning rate, well-suited for NLP tasks</w:t>
+              <w:t xml:space="preserve">Adaptive learning rate for NLP tasks</w:t>
             </w:r>
           </w:p>
         </w:tc>
@@ -3836,7 +3818,7 @@
                 <w:sz w:val="20"/>
                 <w:szCs w:val="20"/>
               </w:rPr>
-              <w:t xml:space="preserve">Initial Learning Rate</w:t>
+              <w:t xml:space="preserve">Learning Rate</w:t>
             </w:r>
           </w:p>
         </w:tc>
@@ -3898,7 +3880,7 @@
                 <w:sz w:val="20"/>
                 <w:szCs w:val="20"/>
               </w:rPr>
-              <w:t xml:space="preserve">Standard starting point for Adam optimizer</w:t>
+              <w:t xml:space="preserve">Standard Adam starting point</w:t>
             </w:r>
           </w:p>
         </w:tc>
@@ -4088,7 +4070,7 @@
                 <w:sz w:val="20"/>
                 <w:szCs w:val="20"/>
               </w:rPr>
-              <w:t xml:space="preserve">Upweights Negative and Neutral to address imbalance</w:t>
+              <w:t xml:space="preserve">Upweights Negative and Neutral</w:t>
             </w:r>
           </w:p>
         </w:tc>
@@ -4183,7 +4165,7 @@
                 <w:sz w:val="20"/>
                 <w:szCs w:val="20"/>
               </w:rPr>
-              <w:t xml:space="preserve">Balances memory efficiency and gradient stability</w:t>
+              <w:t xml:space="preserve">Balances memory and gradient stability</w:t>
             </w:r>
           </w:p>
         </w:tc>
@@ -4216,7 +4198,7 @@
                 <w:sz w:val="20"/>
                 <w:szCs w:val="20"/>
               </w:rPr>
-              <w:t xml:space="preserve">Max Epochs</w:t>
+              <w:t xml:space="preserve">Early Stopping</w:t>
             </w:r>
           </w:p>
         </w:tc>
@@ -4247,7 +4229,7 @@
                 <w:sz w:val="20"/>
                 <w:szCs w:val="20"/>
               </w:rPr>
-              <w:t xml:space="preserve">15</w:t>
+              <w:t xml:space="preserve">Patience=5</w:t>
             </w:r>
           </w:p>
         </w:tc>
@@ -4278,7 +4260,7 @@
                 <w:sz w:val="20"/>
                 <w:szCs w:val="20"/>
               </w:rPr>
-              <w:t xml:space="preserve">Determined empirically; model peaked at Epoch 15</w:t>
+              <w:t xml:space="preserve">Stops if no improvement for 5 epochs</w:t>
             </w:r>
           </w:p>
         </w:tc>
@@ -4311,7 +4293,7 @@
                 <w:sz w:val="20"/>
                 <w:szCs w:val="20"/>
               </w:rPr>
-              <w:t xml:space="preserve">Early Stopping Patience</w:t>
+              <w:t xml:space="preserve">LR Scheduler</w:t>
             </w:r>
           </w:p>
         </w:tc>
@@ -4342,7 +4324,7 @@
                 <w:sz w:val="20"/>
                 <w:szCs w:val="20"/>
               </w:rPr>
-              <w:t xml:space="preserve">5</w:t>
+              <w:t xml:space="preserve">ReduceLROnPlateau (factor=0.5, patience=2)</w:t>
             </w:r>
           </w:p>
         </w:tc>
@@ -4373,7 +4355,7 @@
                 <w:sz w:val="20"/>
                 <w:szCs w:val="20"/>
               </w:rPr>
-              <w:t xml:space="preserve">Stops training if no val accuracy improvement for 5 epochs</w:t>
+              <w:t xml:space="preserve">Halves LR when val loss plateaus</w:t>
             </w:r>
           </w:p>
         </w:tc>
@@ -4406,7 +4388,7 @@
                 <w:sz w:val="20"/>
                 <w:szCs w:val="20"/>
               </w:rPr>
-              <w:t xml:space="preserve">LR Scheduler</w:t>
+              <w:t xml:space="preserve">Gradient Clipping</w:t>
             </w:r>
           </w:p>
         </w:tc>
@@ -4437,7 +4419,7 @@
                 <w:sz w:val="20"/>
                 <w:szCs w:val="20"/>
               </w:rPr>
-              <w:t xml:space="preserve">ReduceLROnPlateau (factor=0.5, patience=2)</w:t>
+              <w:t xml:space="preserve">max_norm=1.0</w:t>
             </w:r>
           </w:p>
         </w:tc>
@@ -4468,7 +4450,7 @@
                 <w:sz w:val="20"/>
                 <w:szCs w:val="20"/>
               </w:rPr>
-              <w:t xml:space="preserve">Halves LR when val loss plateaus</w:t>
+              <w:t xml:space="preserve">Prevents exploding gradients</w:t>
             </w:r>
           </w:p>
         </w:tc>
@@ -4522,30 +4504,9 @@
         <w:t xml:space="preserve">5.1  Iterative Model Improvement</w:t>
       </w:r>
     </w:p>
-    <w:p>
-      <w:pPr>
-        <w:spacing w:after="80" w:before="80"/>
-      </w:pPr>
-      <w:r>
-        <w:rPr>
-          <w:rFonts w:ascii="Arial" w:cs="Arial" w:eastAsia="Arial" w:hAnsi="Arial"/>
-          <w:sz w:val="22"/>
-          <w:szCs w:val="22"/>
-        </w:rPr>
-        <w:t xml:space="preserve">The model was improved through a series of deliberate experiments, each addressing a specific identified weakness:</w:t>
-      </w:r>
-    </w:p>
-    <w:p>
-      <w:pPr>
-        <w:spacing w:after="80" w:before="80"/>
-      </w:pPr>
-      <w:r>
-        <w:t xml:space="preserve"/>
-      </w:r>
-    </w:p>
     <w:tbl>
       <w:tblPr>
-        <w:tblW w:type="dxa" w:w="9660"/>
+        <w:tblW w:type="dxa" w:w="9360"/>
         <w:tblBorders>
           <w:top w:val="single" w:color="auto" w:sz="4"/>
           <w:left w:val="single" w:color="auto" w:sz="4"/>
@@ -4561,7 +4522,7 @@
         <w:gridCol w:w="1200"/>
         <w:gridCol w:w="900"/>
         <w:gridCol w:w="900"/>
-        <w:gridCol w:w="3260"/>
+        <w:gridCol w:w="2960"/>
       </w:tblGrid>
       <w:tr>
         <w:tc>
@@ -4721,7 +4682,7 @@
         </w:tc>
         <w:tc>
           <w:tcPr>
-            <w:tcW w:type="dxa" w:w="3260"/>
+            <w:tcW w:type="dxa" w:w="2960"/>
             <w:tcBorders>
               <w:top w:val="single" w:color="CCCCCC" w:sz="1"/>
               <w:left w:val="single" w:color="CCCCCC" w:sz="1"/>
@@ -4779,7 +4740,7 @@
                 <w:sz w:val="20"/>
                 <w:szCs w:val="20"/>
               </w:rPr>
-              <w:t xml:space="preserve">1. Baseline LSTM (3,149 reviews)</w:t>
+              <w:t xml:space="preserve">1. Baseline LSTM</w:t>
             </w:r>
           </w:p>
         </w:tc>
@@ -4909,32 +4870,32 @@
         </w:tc>
         <w:tc>
           <w:tcPr>
-            <w:tcW w:type="dxa" w:w="3260"/>
-            <w:tcBorders>
-              <w:top w:val="single" w:color="CCCCCC" w:sz="1"/>
-              <w:left w:val="single" w:color="CCCCCC" w:sz="1"/>
-              <w:bottom w:val="single" w:color="CCCCCC" w:sz="1"/>
-              <w:right w:val="single" w:color="CCCCCC" w:sz="1"/>
-            </w:tcBorders>
-            <w:shd w:fill="FFFFFF" w:val="clear"/>
-            <w:tcMar>
-              <w:top w:type="dxa" w:w="80"/>
-              <w:left w:type="dxa" w:w="120"/>
-              <w:bottom w:type="dxa" w:w="80"/>
-              <w:right w:type="dxa" w:w="120"/>
-            </w:tcMar>
-          </w:tcPr>
-          <w:p>
-            <w:r>
-              <w:rPr>
-                <w:rFonts w:ascii="Arial" w:cs="Arial" w:eastAsia="Arial" w:hAnsi="Arial"/>
-                <w:b w:val="false"/>
-                <w:bCs w:val="false"/>
-                <w:color w:val="000000"/>
-                <w:sz w:val="20"/>
-                <w:szCs w:val="20"/>
-              </w:rPr>
-              <w:t xml:space="preserve">High accuracy masked by class imbalance</w:t>
+            <w:tcW w:type="dxa" w:w="2960"/>
+            <w:tcBorders>
+              <w:top w:val="single" w:color="CCCCCC" w:sz="1"/>
+              <w:left w:val="single" w:color="CCCCCC" w:sz="1"/>
+              <w:bottom w:val="single" w:color="CCCCCC" w:sz="1"/>
+              <w:right w:val="single" w:color="CCCCCC" w:sz="1"/>
+            </w:tcBorders>
+            <w:shd w:fill="FFFFFF" w:val="clear"/>
+            <w:tcMar>
+              <w:top w:type="dxa" w:w="80"/>
+              <w:left w:type="dxa" w:w="120"/>
+              <w:bottom w:type="dxa" w:w="80"/>
+              <w:right w:type="dxa" w:w="120"/>
+            </w:tcMar>
+          </w:tcPr>
+          <w:p>
+            <w:r>
+              <w:rPr>
+                <w:rFonts w:ascii="Arial" w:cs="Arial" w:eastAsia="Arial" w:hAnsi="Arial"/>
+                <w:b w:val="false"/>
+                <w:bCs w:val="false"/>
+                <w:color w:val="000000"/>
+                <w:sz w:val="20"/>
+                <w:szCs w:val="20"/>
+              </w:rPr>
+              <w:t xml:space="preserve">Class imbalance identified</w:t>
             </w:r>
           </w:p>
         </w:tc>
@@ -4967,7 +4928,7 @@
                 <w:sz w:val="20"/>
                 <w:szCs w:val="20"/>
               </w:rPr>
-              <w:t xml:space="preserve">2. + SMOTE balancing</w:t>
+              <w:t xml:space="preserve">2. + SMOTE</w:t>
             </w:r>
           </w:p>
         </w:tc>
@@ -5097,32 +5058,32 @@
         </w:tc>
         <w:tc>
           <w:tcPr>
-            <w:tcW w:type="dxa" w:w="3260"/>
-            <w:tcBorders>
-              <w:top w:val="single" w:color="CCCCCC" w:sz="1"/>
-              <w:left w:val="single" w:color="CCCCCC" w:sz="1"/>
-              <w:bottom w:val="single" w:color="CCCCCC" w:sz="1"/>
-              <w:right w:val="single" w:color="CCCCCC" w:sz="1"/>
-            </w:tcBorders>
-            <w:shd w:fill="FFFFFF" w:val="clear"/>
-            <w:tcMar>
-              <w:top w:type="dxa" w:w="80"/>
-              <w:left w:type="dxa" w:w="120"/>
-              <w:bottom w:type="dxa" w:w="80"/>
-              <w:right w:type="dxa" w:w="120"/>
-            </w:tcMar>
-          </w:tcPr>
-          <w:p>
-            <w:r>
-              <w:rPr>
-                <w:rFonts w:ascii="Arial" w:cs="Arial" w:eastAsia="Arial" w:hAnsi="Arial"/>
-                <w:b w:val="false"/>
-                <w:bCs w:val="false"/>
-                <w:color w:val="000000"/>
-                <w:sz w:val="20"/>
-                <w:szCs w:val="20"/>
-              </w:rPr>
-              <w:t xml:space="preserve">Improved minority class detection</w:t>
+            <w:tcW w:type="dxa" w:w="2960"/>
+            <w:tcBorders>
+              <w:top w:val="single" w:color="CCCCCC" w:sz="1"/>
+              <w:left w:val="single" w:color="CCCCCC" w:sz="1"/>
+              <w:bottom w:val="single" w:color="CCCCCC" w:sz="1"/>
+              <w:right w:val="single" w:color="CCCCCC" w:sz="1"/>
+            </w:tcBorders>
+            <w:shd w:fill="FFFFFF" w:val="clear"/>
+            <w:tcMar>
+              <w:top w:type="dxa" w:w="80"/>
+              <w:left w:type="dxa" w:w="120"/>
+              <w:bottom w:type="dxa" w:w="80"/>
+              <w:right w:type="dxa" w:w="120"/>
+            </w:tcMar>
+          </w:tcPr>
+          <w:p>
+            <w:r>
+              <w:rPr>
+                <w:rFonts w:ascii="Arial" w:cs="Arial" w:eastAsia="Arial" w:hAnsi="Arial"/>
+                <w:b w:val="false"/>
+                <w:bCs w:val="false"/>
+                <w:color w:val="000000"/>
+                <w:sz w:val="20"/>
+                <w:szCs w:val="20"/>
+              </w:rPr>
+              <w:t xml:space="preserve">Minority classes improved</w:t>
             </w:r>
           </w:p>
         </w:tc>
@@ -5285,7 +5246,7 @@
         </w:tc>
         <w:tc>
           <w:tcPr>
-            <w:tcW w:type="dxa" w:w="3260"/>
+            <w:tcW w:type="dxa" w:w="2960"/>
             <w:tcBorders>
               <w:top w:val="single" w:color="CCCCCC" w:sz="1"/>
               <w:left w:val="single" w:color="CCCCCC" w:sz="1"/>
@@ -5343,7 +5304,7 @@
                 <w:sz w:val="20"/>
                 <w:szCs w:val="20"/>
               </w:rPr>
-              <w:t xml:space="preserve">4. Class weight 5.0 (experiment)</w:t>
+              <w:t xml:space="preserve">4. Class Weight 5.0</w:t>
             </w:r>
           </w:p>
         </w:tc>
@@ -5473,32 +5434,32 @@
         </w:tc>
         <w:tc>
           <w:tcPr>
-            <w:tcW w:type="dxa" w:w="3260"/>
-            <w:tcBorders>
-              <w:top w:val="single" w:color="CCCCCC" w:sz="1"/>
-              <w:left w:val="single" w:color="CCCCCC" w:sz="1"/>
-              <w:bottom w:val="single" w:color="CCCCCC" w:sz="1"/>
-              <w:right w:val="single" w:color="CCCCCC" w:sz="1"/>
-            </w:tcBorders>
-            <w:shd w:fill="FFFFFF" w:val="clear"/>
-            <w:tcMar>
-              <w:top w:type="dxa" w:w="80"/>
-              <w:left w:type="dxa" w:w="120"/>
-              <w:bottom w:type="dxa" w:w="80"/>
-              <w:right w:type="dxa" w:w="120"/>
-            </w:tcMar>
-          </w:tcPr>
-          <w:p>
-            <w:r>
-              <w:rPr>
-                <w:rFonts w:ascii="Arial" w:cs="Arial" w:eastAsia="Arial" w:hAnsi="Arial"/>
-                <w:b w:val="false"/>
-                <w:bCs w:val="false"/>
-                <w:color w:val="000000"/>
-                <w:sz w:val="20"/>
-                <w:szCs w:val="20"/>
-              </w:rPr>
-              <w:t xml:space="preserve">Overcorrection — Neutral F1 collapsed to 0</w:t>
+            <w:tcW w:type="dxa" w:w="2960"/>
+            <w:tcBorders>
+              <w:top w:val="single" w:color="CCCCCC" w:sz="1"/>
+              <w:left w:val="single" w:color="CCCCCC" w:sz="1"/>
+              <w:bottom w:val="single" w:color="CCCCCC" w:sz="1"/>
+              <w:right w:val="single" w:color="CCCCCC" w:sz="1"/>
+            </w:tcBorders>
+            <w:shd w:fill="FFFFFF" w:val="clear"/>
+            <w:tcMar>
+              <w:top w:type="dxa" w:w="80"/>
+              <w:left w:type="dxa" w:w="120"/>
+              <w:bottom w:type="dxa" w:w="80"/>
+              <w:right w:type="dxa" w:w="120"/>
+            </w:tcMar>
+          </w:tcPr>
+          <w:p>
+            <w:r>
+              <w:rPr>
+                <w:rFonts w:ascii="Arial" w:cs="Arial" w:eastAsia="Arial" w:hAnsi="Arial"/>
+                <w:b w:val="false"/>
+                <w:bCs w:val="false"/>
+                <w:color w:val="000000"/>
+                <w:sz w:val="20"/>
+                <w:szCs w:val="20"/>
+              </w:rPr>
+              <w:t xml:space="preserve">Documented failure — Neutral F1=0</w:t>
             </w:r>
           </w:p>
         </w:tc>
@@ -5531,7 +5492,7 @@
                 <w:sz w:val="20"/>
                 <w:szCs w:val="20"/>
               </w:rPr>
-              <w:t xml:space="preserve">5. + Expanded Dataset (9,149 reviews)</w:t>
+              <w:t xml:space="preserve">5. + Expanded Dataset</w:t>
             </w:r>
           </w:p>
         </w:tc>
@@ -5661,32 +5622,32 @@
         </w:tc>
         <w:tc>
           <w:tcPr>
-            <w:tcW w:type="dxa" w:w="3260"/>
-            <w:tcBorders>
-              <w:top w:val="single" w:color="CCCCCC" w:sz="1"/>
-              <w:left w:val="single" w:color="CCCCCC" w:sz="1"/>
-              <w:bottom w:val="single" w:color="CCCCCC" w:sz="1"/>
-              <w:right w:val="single" w:color="CCCCCC" w:sz="1"/>
-            </w:tcBorders>
-            <w:shd w:fill="FFFFFF" w:val="clear"/>
-            <w:tcMar>
-              <w:top w:type="dxa" w:w="80"/>
-              <w:left w:type="dxa" w:w="120"/>
-              <w:bottom w:type="dxa" w:w="80"/>
-              <w:right w:type="dxa" w:w="120"/>
-            </w:tcMar>
-          </w:tcPr>
-          <w:p>
-            <w:r>
-              <w:rPr>
-                <w:rFonts w:ascii="Arial" w:cs="Arial" w:eastAsia="Arial" w:hAnsi="Arial"/>
-                <w:b w:val="false"/>
-                <w:bCs w:val="false"/>
-                <w:color w:val="000000"/>
-                <w:sz w:val="20"/>
-                <w:szCs w:val="20"/>
-              </w:rPr>
-              <w:t xml:space="preserve">Dramatic improvement in minority classes</w:t>
+            <w:tcW w:type="dxa" w:w="2960"/>
+            <w:tcBorders>
+              <w:top w:val="single" w:color="CCCCCC" w:sz="1"/>
+              <w:left w:val="single" w:color="CCCCCC" w:sz="1"/>
+              <w:bottom w:val="single" w:color="CCCCCC" w:sz="1"/>
+              <w:right w:val="single" w:color="CCCCCC" w:sz="1"/>
+            </w:tcBorders>
+            <w:shd w:fill="FFFFFF" w:val="clear"/>
+            <w:tcMar>
+              <w:top w:type="dxa" w:w="80"/>
+              <w:left w:type="dxa" w:w="120"/>
+              <w:bottom w:type="dxa" w:w="80"/>
+              <w:right w:type="dxa" w:w="120"/>
+            </w:tcMar>
+          </w:tcPr>
+          <w:p>
+            <w:r>
+              <w:rPr>
+                <w:rFonts w:ascii="Arial" w:cs="Arial" w:eastAsia="Arial" w:hAnsi="Arial"/>
+                <w:b w:val="false"/>
+                <w:bCs w:val="false"/>
+                <w:color w:val="000000"/>
+                <w:sz w:val="20"/>
+                <w:szCs w:val="20"/>
+              </w:rPr>
+              <w:t xml:space="preserve">Biggest improvement</w:t>
             </w:r>
           </w:p>
         </w:tc>
@@ -5713,7 +5674,7 @@
           <w:sz w:val="24"/>
           <w:szCs w:val="24"/>
         </w:rPr>
-        <w:t xml:space="preserve">5.2  Key Finding: Class Weight Overcorrection</w:t>
+        <w:t xml:space="preserve">5.2  Overfitting Analysis &amp; Remediation</w:t>
       </w:r>
     </w:p>
     <w:p>
@@ -5726,7 +5687,7 @@
           <w:sz w:val="22"/>
           <w:szCs w:val="22"/>
         </w:rPr>
-        <w:t xml:space="preserve">During experimentation, increasing the Negative class weight from 3.0 to 5.0 resulted in catastrophic performance degradation — Macro F1 dropped from 76.49% to 39.18%, with Neutral F1 collapsing to 0.00. This demonstrated that the model completely stopped predicting Neutral, confirmed by sklearn's UndefinedMetricWarning indicating no Neutral predictions were generated. This finding highlighted the sensitivity of class weighting and the importance of incremental rather than aggressive adjustments.</w:t>
+        <w:t xml:space="preserve">Training accuracy reached 99.44% while validation accuracy was 89.61% — a gap of approximately 10%. Remediation experiments were conducted on Google Colab T4 GPU with dropout increased to 0.5, L2 weight decay (1e-4), and gradient clipping. While training accuracy reduced to 96%, validation accuracy also dropped to 85.43%. The original model was retained as it generalized better on the test set.</w:t>
       </w:r>
     </w:p>
     <w:p>
@@ -5735,211 +5696,6 @@
       </w:pPr>
       <w:r>
         <w:t xml:space="preserve"/>
-      </w:r>
-    </w:p>
-    <w:p>
-      <w:pPr>
-        <w:spacing w:after="150" w:before="300"/>
-      </w:pPr>
-      <w:r>
-        <w:rPr>
-          <w:rFonts w:ascii="Arial" w:cs="Arial" w:eastAsia="Arial" w:hAnsi="Arial"/>
-          <w:b/>
-          <w:bCs/>
-          <w:color w:val="2E75B6"/>
-          <w:sz w:val="24"/>
-          <w:szCs w:val="24"/>
-        </w:rPr>
-        <w:t xml:space="preserve">5.3  Key Finding: Dataset Expansion</w:t>
-      </w:r>
-    </w:p>
-    <w:p>
-      <w:pPr>
-        <w:spacing w:after="80" w:before="80"/>
-      </w:pPr>
-      <w:r>
-        <w:rPr>
-          <w:rFonts w:ascii="Arial" w:cs="Arial" w:eastAsia="Arial" w:hAnsi="Arial"/>
-          <w:sz w:val="22"/>
-          <w:szCs w:val="22"/>
-        </w:rPr>
-        <w:t xml:space="preserve">Following advisor feedback regarding dataset size, expanding from 3,149 to 9,149 reviews by incorporating Yelp data produced the most significant improvement across all experiments. Macro F1 improved from 76.49% to 88.40%, with Negative F1 improving from 0.62 to 0.89 and Neutral F1 from 0.71 to 0.86. This confirmed that data quantity and diversity were the primary limiting factors, not model architecture complexity.</w:t>
-      </w:r>
-    </w:p>
-    <w:p>
-      <w:pPr>
-        <w:spacing w:after="80" w:before="80"/>
-      </w:pPr>
-      <w:r>
-        <w:t xml:space="preserve"/>
-      </w:r>
-    </w:p>
-    <w:p>
-      <w:pPr>
-        <w:spacing w:after="150" w:before="300"/>
-      </w:pPr>
-      <w:r>
-        <w:rPr>
-          <w:rFonts w:ascii="Arial" w:cs="Arial" w:eastAsia="Arial" w:hAnsi="Arial"/>
-          <w:b/>
-          <w:bCs/>
-          <w:color w:val="2E75B6"/>
-          <w:sz w:val="24"/>
-          <w:szCs w:val="24"/>
-        </w:rPr>
-        <w:t xml:space="preserve">5.4  Confusion Matrix Analysis</w:t>
-      </w:r>
-    </w:p>
-    <w:p>
-      <w:pPr>
-        <w:spacing w:after="80" w:before="80"/>
-      </w:pPr>
-      <w:r>
-        <w:rPr>
-          <w:rFonts w:ascii="Arial" w:cs="Arial" w:eastAsia="Arial" w:hAnsi="Arial"/>
-          <w:sz w:val="22"/>
-          <w:szCs w:val="22"/>
-        </w:rPr>
-        <w:t xml:space="preserve">Analysis of the confusion matrix for the final model revealed strong diagonal dominance across all three classes, indicating balanced performance. The model correctly classified 286 out of 315 test reviews, with misclassifications concentrated in ambiguous cases where sentiment was expressed implicitly rather than through explicit positive or negative vocabulary.</w:t>
-      </w:r>
-    </w:p>
-    <w:p>
-      <w:pPr>
-        <w:spacing w:after="80" w:before="80"/>
-      </w:pPr>
-      <w:r>
-        <w:t xml:space="preserve"/>
-      </w:r>
-    </w:p>
-    <w:p>
-      <w:pPr>
-        <w:spacing w:after="150" w:before="300"/>
-      </w:pPr>
-      <w:r>
-        <w:rPr>
-          <w:rFonts w:ascii="Arial" w:cs="Arial" w:eastAsia="Arial" w:hAnsi="Arial"/>
-          <w:b/>
-          <w:bCs/>
-          <w:color w:val="2E75B6"/>
-          <w:sz w:val="24"/>
-          <w:szCs w:val="24"/>
-        </w:rPr>
-        <w:t xml:space="preserve">5.5  Misclassification Analysis</w:t>
-      </w:r>
-    </w:p>
-    <w:p>
-      <w:pPr>
-        <w:spacing w:after="80" w:before="80"/>
-      </w:pPr>
-      <w:r>
-        <w:rPr>
-          <w:rFonts w:ascii="Arial" w:cs="Arial" w:eastAsia="Arial" w:hAnsi="Arial"/>
-          <w:sz w:val="22"/>
-          <w:szCs w:val="22"/>
-        </w:rPr>
-        <w:t xml:space="preserve">Three common failure patterns were identified through analysis of misclassified examples:</w:t>
-      </w:r>
-    </w:p>
-    <w:p>
-      <w:pPr>
-        <w:pStyle w:val="ListParagraph"/>
-        <w:numPr>
-          <w:ilvl w:val="0"/>
-          <w:numId w:val="2"/>
-        </w:numPr>
-        <w:spacing w:after="60" w:before="60"/>
-      </w:pPr>
-      <w:r>
-        <w:rPr>
-          <w:rFonts w:ascii="Arial" w:cs="Arial" w:eastAsia="Arial" w:hAnsi="Arial"/>
-          <w:sz w:val="22"/>
-          <w:szCs w:val="22"/>
-        </w:rPr>
-        <w:t xml:space="preserve">Mixed sentiment reviews where customers expressed both frustration and satisfaction within the same review</w:t>
-      </w:r>
-    </w:p>
-    <w:p>
-      <w:pPr>
-        <w:pStyle w:val="ListParagraph"/>
-        <w:numPr>
-          <w:ilvl w:val="0"/>
-          <w:numId w:val="2"/>
-        </w:numPr>
-        <w:spacing w:after="60" w:before="60"/>
-      </w:pPr>
-      <w:r>
-        <w:rPr>
-          <w:rFonts w:ascii="Arial" w:cs="Arial" w:eastAsia="Arial" w:hAnsi="Arial"/>
-          <w:sz w:val="22"/>
-          <w:szCs w:val="22"/>
-        </w:rPr>
-        <w:t xml:space="preserve">Very short reviews (1-3 words) lacking sufficient context for confident classification</w:t>
-      </w:r>
-    </w:p>
-    <w:p>
-      <w:pPr>
-        <w:pStyle w:val="ListParagraph"/>
-        <w:numPr>
-          <w:ilvl w:val="0"/>
-          <w:numId w:val="2"/>
-        </w:numPr>
-        <w:spacing w:after="60" w:before="60"/>
-      </w:pPr>
-      <w:r>
-        <w:rPr>
-          <w:rFonts w:ascii="Arial" w:cs="Arial" w:eastAsia="Arial" w:hAnsi="Arial"/>
-          <w:sz w:val="22"/>
-          <w:szCs w:val="22"/>
-        </w:rPr>
-        <w:t xml:space="preserve">Reviews where negative sentiment was implied through context rather than explicit negative vocabulary</w:t>
-      </w:r>
-    </w:p>
-    <w:p>
-      <w:pPr>
-        <w:spacing w:after="80" w:before="80"/>
-      </w:pPr>
-      <w:r>
-        <w:t xml:space="preserve"/>
-      </w:r>
-    </w:p>
-    <w:p>
-      <w:r>
-        <w:br w:type="page"/>
-      </w:r>
-    </w:p>
-    <w:p>
-      <w:pPr>
-        <w:pBdr>
-          <w:bottom w:val="single" w:color="2E75B6" w:sz="6" w:space="4"/>
-        </w:pBdr>
-        <w:spacing w:after="200" w:before="400"/>
-      </w:pPr>
-      <w:r>
-        <w:rPr>
-          <w:rFonts w:ascii="Arial" w:cs="Arial" w:eastAsia="Arial" w:hAnsi="Arial"/>
-          <w:b/>
-          <w:bCs/>
-          <w:color w:val="1F4E79"/>
-          <w:sz w:val="28"/>
-          <w:szCs w:val="28"/>
-        </w:rPr>
-        <w:t xml:space="preserve">6. HuggingFace Model Comparison</w:t>
-      </w:r>
-    </w:p>
-    <w:p>
-      <w:pPr>
-        <w:spacing w:after="150" w:before="300"/>
-      </w:pPr>
-      <w:r>
-        <w:rPr>
-          <w:rFonts w:ascii="Arial" w:cs="Arial" w:eastAsia="Arial" w:hAnsi="Arial"/>
-          <w:b/>
-          <w:bCs/>
-          <w:color w:val="2E75B6"/>
-          <w:sz w:val="24"/>
-          <w:szCs w:val="24"/>
-        </w:rPr>
-        <w:t xml:space="preserve">6.1  Models Evaluated</w:t>
       </w:r>
     </w:p>
     <w:tbl>
@@ -5956,8 +5712,9 @@
       </w:tblPr>
       <w:tblGrid>
         <w:gridCol w:w="3500"/>
-        <w:gridCol w:w="3000"/>
-        <w:gridCol w:w="2860"/>
+        <w:gridCol w:w="1700"/>
+        <w:gridCol w:w="1700"/>
+        <w:gridCol w:w="2460"/>
       </w:tblGrid>
       <w:tr>
         <w:tc>
@@ -5987,13 +5744,13 @@
                 <w:sz w:val="20"/>
                 <w:szCs w:val="20"/>
               </w:rPr>
-              <w:t xml:space="preserve">Model</w:t>
-            </w:r>
-          </w:p>
-        </w:tc>
-        <w:tc>
-          <w:tcPr>
-            <w:tcW w:type="dxa" w:w="3000"/>
+              <w:t xml:space="preserve">Configuration</w:t>
+            </w:r>
+          </w:p>
+        </w:tc>
+        <w:tc>
+          <w:tcPr>
+            <w:tcW w:type="dxa" w:w="1700"/>
             <w:tcBorders>
               <w:top w:val="single" w:color="CCCCCC" w:sz="1"/>
               <w:left w:val="single" w:color="CCCCCC" w:sz="1"/>
@@ -6018,13 +5775,13 @@
                 <w:sz w:val="20"/>
                 <w:szCs w:val="20"/>
               </w:rPr>
-              <w:t xml:space="preserve">Training Domain</w:t>
-            </w:r>
-          </w:p>
-        </w:tc>
-        <w:tc>
-          <w:tcPr>
-            <w:tcW w:type="dxa" w:w="2860"/>
+              <w:t xml:space="preserve">Train Acc</w:t>
+            </w:r>
+          </w:p>
+        </w:tc>
+        <w:tc>
+          <w:tcPr>
+            <w:tcW w:type="dxa" w:w="1700"/>
             <w:tcBorders>
               <w:top w:val="single" w:color="CCCCCC" w:sz="1"/>
               <w:left w:val="single" w:color="CCCCCC" w:sz="1"/>
@@ -6049,7 +5806,38 @@
                 <w:sz w:val="20"/>
                 <w:szCs w:val="20"/>
               </w:rPr>
-              <w:t xml:space="preserve">Output Format</w:t>
+              <w:t xml:space="preserve">Val Acc</w:t>
+            </w:r>
+          </w:p>
+        </w:tc>
+        <w:tc>
+          <w:tcPr>
+            <w:tcW w:type="dxa" w:w="2460"/>
+            <w:tcBorders>
+              <w:top w:val="single" w:color="CCCCCC" w:sz="1"/>
+              <w:left w:val="single" w:color="CCCCCC" w:sz="1"/>
+              <w:bottom w:val="single" w:color="CCCCCC" w:sz="1"/>
+              <w:right w:val="single" w:color="CCCCCC" w:sz="1"/>
+            </w:tcBorders>
+            <w:shd w:fill="D6E4F0" w:val="clear"/>
+            <w:tcMar>
+              <w:top w:type="dxa" w:w="80"/>
+              <w:left w:type="dxa" w:w="120"/>
+              <w:bottom w:type="dxa" w:w="80"/>
+              <w:right w:type="dxa" w:w="120"/>
+            </w:tcMar>
+          </w:tcPr>
+          <w:p>
+            <w:r>
+              <w:rPr>
+                <w:rFonts w:ascii="Arial" w:cs="Arial" w:eastAsia="Arial" w:hAnsi="Arial"/>
+                <w:b/>
+                <w:bCs/>
+                <w:color w:val="1F4E79"/>
+                <w:sz w:val="20"/>
+                <w:szCs w:val="20"/>
+              </w:rPr>
+              <w:t xml:space="preserve">Gap</w:t>
             </w:r>
           </w:p>
         </w:tc>
@@ -6082,69 +5870,100 @@
                 <w:sz w:val="20"/>
                 <w:szCs w:val="20"/>
               </w:rPr>
-              <w:t xml:space="preserve">nlptown/bert-base-multilingual-uncased-sentiment</w:t>
-            </w:r>
-          </w:p>
-        </w:tc>
-        <w:tc>
-          <w:tcPr>
-            <w:tcW w:type="dxa" w:w="3000"/>
-            <w:tcBorders>
-              <w:top w:val="single" w:color="CCCCCC" w:sz="1"/>
-              <w:left w:val="single" w:color="CCCCCC" w:sz="1"/>
-              <w:bottom w:val="single" w:color="CCCCCC" w:sz="1"/>
-              <w:right w:val="single" w:color="CCCCCC" w:sz="1"/>
-            </w:tcBorders>
-            <w:shd w:fill="FFFFFF" w:val="clear"/>
-            <w:tcMar>
-              <w:top w:type="dxa" w:w="80"/>
-              <w:left w:type="dxa" w:w="120"/>
-              <w:bottom w:type="dxa" w:w="80"/>
-              <w:right w:type="dxa" w:w="120"/>
-            </w:tcMar>
-          </w:tcPr>
-          <w:p>
-            <w:r>
-              <w:rPr>
-                <w:rFonts w:ascii="Arial" w:cs="Arial" w:eastAsia="Arial" w:hAnsi="Arial"/>
-                <w:b w:val="false"/>
-                <w:bCs w:val="false"/>
-                <w:color w:val="000000"/>
-                <w:sz w:val="20"/>
-                <w:szCs w:val="20"/>
-              </w:rPr>
-              <w:t xml:space="preserve">Amazon, Yelp, TripAdvisor reviews</w:t>
-            </w:r>
-          </w:p>
-        </w:tc>
-        <w:tc>
-          <w:tcPr>
-            <w:tcW w:type="dxa" w:w="2860"/>
-            <w:tcBorders>
-              <w:top w:val="single" w:color="CCCCCC" w:sz="1"/>
-              <w:left w:val="single" w:color="CCCCCC" w:sz="1"/>
-              <w:bottom w:val="single" w:color="CCCCCC" w:sz="1"/>
-              <w:right w:val="single" w:color="CCCCCC" w:sz="1"/>
-            </w:tcBorders>
-            <w:shd w:fill="FFFFFF" w:val="clear"/>
-            <w:tcMar>
-              <w:top w:type="dxa" w:w="80"/>
-              <w:left w:type="dxa" w:w="120"/>
-              <w:bottom w:type="dxa" w:w="80"/>
-              <w:right w:type="dxa" w:w="120"/>
-            </w:tcMar>
-          </w:tcPr>
-          <w:p>
-            <w:r>
-              <w:rPr>
-                <w:rFonts w:ascii="Arial" w:cs="Arial" w:eastAsia="Arial" w:hAnsi="Arial"/>
-                <w:b w:val="false"/>
-                <w:bCs w:val="false"/>
-                <w:color w:val="000000"/>
-                <w:sz w:val="20"/>
-                <w:szCs w:val="20"/>
-              </w:rPr>
-              <w:t xml:space="preserve">1-5 stars</w:t>
+              <w:t xml:space="preserve">Original (dropout=0.3)</w:t>
+            </w:r>
+          </w:p>
+        </w:tc>
+        <w:tc>
+          <w:tcPr>
+            <w:tcW w:type="dxa" w:w="1700"/>
+            <w:tcBorders>
+              <w:top w:val="single" w:color="CCCCCC" w:sz="1"/>
+              <w:left w:val="single" w:color="CCCCCC" w:sz="1"/>
+              <w:bottom w:val="single" w:color="CCCCCC" w:sz="1"/>
+              <w:right w:val="single" w:color="CCCCCC" w:sz="1"/>
+            </w:tcBorders>
+            <w:shd w:fill="FFFFFF" w:val="clear"/>
+            <w:tcMar>
+              <w:top w:type="dxa" w:w="80"/>
+              <w:left w:type="dxa" w:w="120"/>
+              <w:bottom w:type="dxa" w:w="80"/>
+              <w:right w:type="dxa" w:w="120"/>
+            </w:tcMar>
+          </w:tcPr>
+          <w:p>
+            <w:r>
+              <w:rPr>
+                <w:rFonts w:ascii="Arial" w:cs="Arial" w:eastAsia="Arial" w:hAnsi="Arial"/>
+                <w:b w:val="false"/>
+                <w:bCs w:val="false"/>
+                <w:color w:val="000000"/>
+                <w:sz w:val="20"/>
+                <w:szCs w:val="20"/>
+              </w:rPr>
+              <w:t xml:space="preserve">99.44%</w:t>
+            </w:r>
+          </w:p>
+        </w:tc>
+        <w:tc>
+          <w:tcPr>
+            <w:tcW w:type="dxa" w:w="1700"/>
+            <w:tcBorders>
+              <w:top w:val="single" w:color="CCCCCC" w:sz="1"/>
+              <w:left w:val="single" w:color="CCCCCC" w:sz="1"/>
+              <w:bottom w:val="single" w:color="CCCCCC" w:sz="1"/>
+              <w:right w:val="single" w:color="CCCCCC" w:sz="1"/>
+            </w:tcBorders>
+            <w:shd w:fill="FFFFFF" w:val="clear"/>
+            <w:tcMar>
+              <w:top w:type="dxa" w:w="80"/>
+              <w:left w:type="dxa" w:w="120"/>
+              <w:bottom w:type="dxa" w:w="80"/>
+              <w:right w:type="dxa" w:w="120"/>
+            </w:tcMar>
+          </w:tcPr>
+          <w:p>
+            <w:r>
+              <w:rPr>
+                <w:rFonts w:ascii="Arial" w:cs="Arial" w:eastAsia="Arial" w:hAnsi="Arial"/>
+                <w:b w:val="false"/>
+                <w:bCs w:val="false"/>
+                <w:color w:val="000000"/>
+                <w:sz w:val="20"/>
+                <w:szCs w:val="20"/>
+              </w:rPr>
+              <w:t xml:space="preserve">89.61%</w:t>
+            </w:r>
+          </w:p>
+        </w:tc>
+        <w:tc>
+          <w:tcPr>
+            <w:tcW w:type="dxa" w:w="2460"/>
+            <w:tcBorders>
+              <w:top w:val="single" w:color="CCCCCC" w:sz="1"/>
+              <w:left w:val="single" w:color="CCCCCC" w:sz="1"/>
+              <w:bottom w:val="single" w:color="CCCCCC" w:sz="1"/>
+              <w:right w:val="single" w:color="CCCCCC" w:sz="1"/>
+            </w:tcBorders>
+            <w:shd w:fill="FFFFFF" w:val="clear"/>
+            <w:tcMar>
+              <w:top w:type="dxa" w:w="80"/>
+              <w:left w:type="dxa" w:w="120"/>
+              <w:bottom w:type="dxa" w:w="80"/>
+              <w:right w:type="dxa" w:w="120"/>
+            </w:tcMar>
+          </w:tcPr>
+          <w:p>
+            <w:r>
+              <w:rPr>
+                <w:rFonts w:ascii="Arial" w:cs="Arial" w:eastAsia="Arial" w:hAnsi="Arial"/>
+                <w:b w:val="false"/>
+                <w:bCs w:val="false"/>
+                <w:color w:val="000000"/>
+                <w:sz w:val="20"/>
+                <w:szCs w:val="20"/>
+              </w:rPr>
+              <w:t xml:space="preserve">~10%</w:t>
             </w:r>
           </w:p>
         </w:tc>
@@ -6177,164 +5996,100 @@
                 <w:sz w:val="20"/>
                 <w:szCs w:val="20"/>
               </w:rPr>
-              <w:t xml:space="preserve">LiYuan/amazon-review-sentiment-analysis</w:t>
-            </w:r>
-          </w:p>
-        </w:tc>
-        <w:tc>
-          <w:tcPr>
-            <w:tcW w:type="dxa" w:w="3000"/>
-            <w:tcBorders>
-              <w:top w:val="single" w:color="CCCCCC" w:sz="1"/>
-              <w:left w:val="single" w:color="CCCCCC" w:sz="1"/>
-              <w:bottom w:val="single" w:color="CCCCCC" w:sz="1"/>
-              <w:right w:val="single" w:color="CCCCCC" w:sz="1"/>
-            </w:tcBorders>
-            <w:shd w:fill="FFFFFF" w:val="clear"/>
-            <w:tcMar>
-              <w:top w:type="dxa" w:w="80"/>
-              <w:left w:type="dxa" w:w="120"/>
-              <w:bottom w:type="dxa" w:w="80"/>
-              <w:right w:type="dxa" w:w="120"/>
-            </w:tcMar>
-          </w:tcPr>
-          <w:p>
-            <w:r>
-              <w:rPr>
-                <w:rFonts w:ascii="Arial" w:cs="Arial" w:eastAsia="Arial" w:hAnsi="Arial"/>
-                <w:b w:val="false"/>
-                <w:bCs w:val="false"/>
-                <w:color w:val="000000"/>
-                <w:sz w:val="20"/>
-                <w:szCs w:val="20"/>
-              </w:rPr>
-              <w:t xml:space="preserve">Amazon reviews specifically</w:t>
-            </w:r>
-          </w:p>
-        </w:tc>
-        <w:tc>
-          <w:tcPr>
-            <w:tcW w:type="dxa" w:w="2860"/>
-            <w:tcBorders>
-              <w:top w:val="single" w:color="CCCCCC" w:sz="1"/>
-              <w:left w:val="single" w:color="CCCCCC" w:sz="1"/>
-              <w:bottom w:val="single" w:color="CCCCCC" w:sz="1"/>
-              <w:right w:val="single" w:color="CCCCCC" w:sz="1"/>
-            </w:tcBorders>
-            <w:shd w:fill="FFFFFF" w:val="clear"/>
-            <w:tcMar>
-              <w:top w:type="dxa" w:w="80"/>
-              <w:left w:type="dxa" w:w="120"/>
-              <w:bottom w:type="dxa" w:w="80"/>
-              <w:right w:type="dxa" w:w="120"/>
-            </w:tcMar>
-          </w:tcPr>
-          <w:p>
-            <w:r>
-              <w:rPr>
-                <w:rFonts w:ascii="Arial" w:cs="Arial" w:eastAsia="Arial" w:hAnsi="Arial"/>
-                <w:b w:val="false"/>
-                <w:bCs w:val="false"/>
-                <w:color w:val="000000"/>
-                <w:sz w:val="20"/>
-                <w:szCs w:val="20"/>
-              </w:rPr>
-              <w:t xml:space="preserve">1-5 stars</w:t>
-            </w:r>
-          </w:p>
-        </w:tc>
-      </w:tr>
-      <w:tr>
-        <w:tc>
-          <w:tcPr>
-            <w:tcW w:type="dxa" w:w="3500"/>
-            <w:tcBorders>
-              <w:top w:val="single" w:color="CCCCCC" w:sz="1"/>
-              <w:left w:val="single" w:color="CCCCCC" w:sz="1"/>
-              <w:bottom w:val="single" w:color="CCCCCC" w:sz="1"/>
-              <w:right w:val="single" w:color="CCCCCC" w:sz="1"/>
-            </w:tcBorders>
-            <w:shd w:fill="FFFFFF" w:val="clear"/>
-            <w:tcMar>
-              <w:top w:type="dxa" w:w="80"/>
-              <w:left w:type="dxa" w:w="120"/>
-              <w:bottom w:type="dxa" w:w="80"/>
-              <w:right w:type="dxa" w:w="120"/>
-            </w:tcMar>
-          </w:tcPr>
-          <w:p>
-            <w:r>
-              <w:rPr>
-                <w:rFonts w:ascii="Arial" w:cs="Arial" w:eastAsia="Arial" w:hAnsi="Arial"/>
-                <w:b w:val="false"/>
-                <w:bCs w:val="false"/>
-                <w:color w:val="000000"/>
-                <w:sz w:val="20"/>
-                <w:szCs w:val="20"/>
-              </w:rPr>
-              <w:t xml:space="preserve">cardiffnlp/twitter-roberta-base-sentiment-latest</w:t>
-            </w:r>
-          </w:p>
-        </w:tc>
-        <w:tc>
-          <w:tcPr>
-            <w:tcW w:type="dxa" w:w="3000"/>
-            <w:tcBorders>
-              <w:top w:val="single" w:color="CCCCCC" w:sz="1"/>
-              <w:left w:val="single" w:color="CCCCCC" w:sz="1"/>
-              <w:bottom w:val="single" w:color="CCCCCC" w:sz="1"/>
-              <w:right w:val="single" w:color="CCCCCC" w:sz="1"/>
-            </w:tcBorders>
-            <w:shd w:fill="FFFFFF" w:val="clear"/>
-            <w:tcMar>
-              <w:top w:type="dxa" w:w="80"/>
-              <w:left w:type="dxa" w:w="120"/>
-              <w:bottom w:type="dxa" w:w="80"/>
-              <w:right w:type="dxa" w:w="120"/>
-            </w:tcMar>
-          </w:tcPr>
-          <w:p>
-            <w:r>
-              <w:rPr>
-                <w:rFonts w:ascii="Arial" w:cs="Arial" w:eastAsia="Arial" w:hAnsi="Arial"/>
-                <w:b w:val="false"/>
-                <w:bCs w:val="false"/>
-                <w:color w:val="000000"/>
-                <w:sz w:val="20"/>
-                <w:szCs w:val="20"/>
-              </w:rPr>
-              <w:t xml:space="preserve">124 million tweets</w:t>
-            </w:r>
-          </w:p>
-        </w:tc>
-        <w:tc>
-          <w:tcPr>
-            <w:tcW w:type="dxa" w:w="2860"/>
-            <w:tcBorders>
-              <w:top w:val="single" w:color="CCCCCC" w:sz="1"/>
-              <w:left w:val="single" w:color="CCCCCC" w:sz="1"/>
-              <w:bottom w:val="single" w:color="CCCCCC" w:sz="1"/>
-              <w:right w:val="single" w:color="CCCCCC" w:sz="1"/>
-            </w:tcBorders>
-            <w:shd w:fill="FFFFFF" w:val="clear"/>
-            <w:tcMar>
-              <w:top w:type="dxa" w:w="80"/>
-              <w:left w:type="dxa" w:w="120"/>
-              <w:bottom w:type="dxa" w:w="80"/>
-              <w:right w:type="dxa" w:w="120"/>
-            </w:tcMar>
-          </w:tcPr>
-          <w:p>
-            <w:r>
-              <w:rPr>
-                <w:rFonts w:ascii="Arial" w:cs="Arial" w:eastAsia="Arial" w:hAnsi="Arial"/>
-                <w:b w:val="false"/>
-                <w:bCs w:val="false"/>
-                <w:color w:val="000000"/>
-                <w:sz w:val="20"/>
-                <w:szCs w:val="20"/>
-              </w:rPr>
-              <w:t xml:space="preserve">Negative/Neutral/Positive</w:t>
+              <w:t xml:space="preserve">Dropout=0.5 + L2 (35 epochs)</w:t>
+            </w:r>
+          </w:p>
+        </w:tc>
+        <w:tc>
+          <w:tcPr>
+            <w:tcW w:type="dxa" w:w="1700"/>
+            <w:tcBorders>
+              <w:top w:val="single" w:color="CCCCCC" w:sz="1"/>
+              <w:left w:val="single" w:color="CCCCCC" w:sz="1"/>
+              <w:bottom w:val="single" w:color="CCCCCC" w:sz="1"/>
+              <w:right w:val="single" w:color="CCCCCC" w:sz="1"/>
+            </w:tcBorders>
+            <w:shd w:fill="FFFFFF" w:val="clear"/>
+            <w:tcMar>
+              <w:top w:type="dxa" w:w="80"/>
+              <w:left w:type="dxa" w:w="120"/>
+              <w:bottom w:type="dxa" w:w="80"/>
+              <w:right w:type="dxa" w:w="120"/>
+            </w:tcMar>
+          </w:tcPr>
+          <w:p>
+            <w:r>
+              <w:rPr>
+                <w:rFonts w:ascii="Arial" w:cs="Arial" w:eastAsia="Arial" w:hAnsi="Arial"/>
+                <w:b w:val="false"/>
+                <w:bCs w:val="false"/>
+                <w:color w:val="000000"/>
+                <w:sz w:val="20"/>
+                <w:szCs w:val="20"/>
+              </w:rPr>
+              <w:t xml:space="preserve">96.34%</w:t>
+            </w:r>
+          </w:p>
+        </w:tc>
+        <w:tc>
+          <w:tcPr>
+            <w:tcW w:type="dxa" w:w="1700"/>
+            <w:tcBorders>
+              <w:top w:val="single" w:color="CCCCCC" w:sz="1"/>
+              <w:left w:val="single" w:color="CCCCCC" w:sz="1"/>
+              <w:bottom w:val="single" w:color="CCCCCC" w:sz="1"/>
+              <w:right w:val="single" w:color="CCCCCC" w:sz="1"/>
+            </w:tcBorders>
+            <w:shd w:fill="FFFFFF" w:val="clear"/>
+            <w:tcMar>
+              <w:top w:type="dxa" w:w="80"/>
+              <w:left w:type="dxa" w:w="120"/>
+              <w:bottom w:type="dxa" w:w="80"/>
+              <w:right w:type="dxa" w:w="120"/>
+            </w:tcMar>
+          </w:tcPr>
+          <w:p>
+            <w:r>
+              <w:rPr>
+                <w:rFonts w:ascii="Arial" w:cs="Arial" w:eastAsia="Arial" w:hAnsi="Arial"/>
+                <w:b w:val="false"/>
+                <w:bCs w:val="false"/>
+                <w:color w:val="000000"/>
+                <w:sz w:val="20"/>
+                <w:szCs w:val="20"/>
+              </w:rPr>
+              <w:t xml:space="preserve">85.43%</w:t>
+            </w:r>
+          </w:p>
+        </w:tc>
+        <w:tc>
+          <w:tcPr>
+            <w:tcW w:type="dxa" w:w="2460"/>
+            <w:tcBorders>
+              <w:top w:val="single" w:color="CCCCCC" w:sz="1"/>
+              <w:left w:val="single" w:color="CCCCCC" w:sz="1"/>
+              <w:bottom w:val="single" w:color="CCCCCC" w:sz="1"/>
+              <w:right w:val="single" w:color="CCCCCC" w:sz="1"/>
+            </w:tcBorders>
+            <w:shd w:fill="FFFFFF" w:val="clear"/>
+            <w:tcMar>
+              <w:top w:type="dxa" w:w="80"/>
+              <w:left w:type="dxa" w:w="120"/>
+              <w:bottom w:type="dxa" w:w="80"/>
+              <w:right w:type="dxa" w:w="120"/>
+            </w:tcMar>
+          </w:tcPr>
+          <w:p>
+            <w:r>
+              <w:rPr>
+                <w:rFonts w:ascii="Arial" w:cs="Arial" w:eastAsia="Arial" w:hAnsi="Arial"/>
+                <w:b w:val="false"/>
+                <w:bCs w:val="false"/>
+                <w:color w:val="000000"/>
+                <w:sz w:val="20"/>
+                <w:szCs w:val="20"/>
+              </w:rPr>
+              <w:t xml:space="preserve">~11%</w:t>
             </w:r>
           </w:p>
         </w:tc>
@@ -6361,7 +6116,1014 @@
           <w:sz w:val="24"/>
           <w:szCs w:val="24"/>
         </w:rPr>
-        <w:t xml:space="preserve">6.2  Comparison Results</w:t>
+        <w:t xml:space="preserve">5.3  Negation Handling Experiment &amp; Findings</w:t>
+      </w:r>
+    </w:p>
+    <w:p>
+      <w:pPr>
+        <w:spacing w:after="80" w:before="80"/>
+      </w:pPr>
+      <w:r>
+        <w:rPr>
+          <w:rFonts w:ascii="Arial" w:cs="Arial" w:eastAsia="Arial" w:hAnsi="Arial"/>
+          <w:sz w:val="22"/>
+          <w:szCs w:val="22"/>
+        </w:rPr>
+        <w:t xml:space="preserve">During testing of the customer-facing interface, a critical misclassification was identified: the review 'i didnt like the product at all' was classified as Positive. This revealed that the model struggled with negation patterns — short phrases where negative sentiment is expressed through words like 'didnt', 'not', 'wouldn't' rather than explicit negative vocabulary.</w:t>
+      </w:r>
+    </w:p>
+    <w:p>
+      <w:pPr>
+        <w:spacing w:after="80" w:before="80"/>
+      </w:pPr>
+      <w:r>
+        <w:t xml:space="preserve"/>
+      </w:r>
+    </w:p>
+    <w:p>
+      <w:pPr>
+        <w:spacing w:after="100" w:before="200"/>
+      </w:pPr>
+      <w:r>
+        <w:rPr>
+          <w:rFonts w:ascii="Arial" w:cs="Arial" w:eastAsia="Arial" w:hAnsi="Arial"/>
+          <w:b/>
+          <w:bCs/>
+          <w:color w:val="1F4E79"/>
+          <w:sz w:val="22"/>
+          <w:szCs w:val="22"/>
+        </w:rPr>
+        <w:t xml:space="preserve">Root Cause Analysis</w:t>
+      </w:r>
+    </w:p>
+    <w:p>
+      <w:pPr>
+        <w:spacing w:after="80" w:before="80"/>
+      </w:pPr>
+      <w:r>
+        <w:rPr>
+          <w:rFonts w:ascii="Arial" w:cs="Arial" w:eastAsia="Arial" w:hAnsi="Arial"/>
+          <w:sz w:val="22"/>
+          <w:szCs w:val="22"/>
+        </w:rPr>
+        <w:t xml:space="preserve">After text cleaning, the word 'didnt' may not be strongly associated with negative sentiment in our vocabulary because the training data contained insufficient examples of negation patterns. The model learned to associate 'like' and 'product' with Positive sentiment, overriding the negation signal.</w:t>
+      </w:r>
+    </w:p>
+    <w:p>
+      <w:pPr>
+        <w:spacing w:after="80" w:before="80"/>
+      </w:pPr>
+      <w:r>
+        <w:t xml:space="preserve"/>
+      </w:r>
+    </w:p>
+    <w:p>
+      <w:pPr>
+        <w:spacing w:after="100" w:before="200"/>
+      </w:pPr>
+      <w:r>
+        <w:rPr>
+          <w:rFonts w:ascii="Arial" w:cs="Arial" w:eastAsia="Arial" w:hAnsi="Arial"/>
+          <w:b/>
+          <w:bCs/>
+          <w:color w:val="1F4E79"/>
+          <w:sz w:val="22"/>
+          <w:szCs w:val="22"/>
+        </w:rPr>
+        <w:t xml:space="preserve">Experiment 1 — Negation Examples Repeated 20x</w:t>
+      </w:r>
+    </w:p>
+    <w:p>
+      <w:pPr>
+        <w:pStyle w:val="ListParagraph"/>
+        <w:numPr>
+          <w:ilvl w:val="0"/>
+          <w:numId w:val="2"/>
+        </w:numPr>
+        <w:spacing w:after="60" w:before="60"/>
+      </w:pPr>
+      <w:r>
+        <w:rPr>
+          <w:rFonts w:ascii="Arial" w:cs="Arial" w:eastAsia="Arial" w:hAnsi="Arial"/>
+          <w:sz w:val="22"/>
+          <w:szCs w:val="22"/>
+        </w:rPr>
+        <w:t xml:space="preserve">Added 45 targeted negation examples (35 Negative, 7 Neutral, 3 Positive)</w:t>
+      </w:r>
+    </w:p>
+    <w:p>
+      <w:pPr>
+        <w:pStyle w:val="ListParagraph"/>
+        <w:numPr>
+          <w:ilvl w:val="0"/>
+          <w:numId w:val="2"/>
+        </w:numPr>
+        <w:spacing w:after="60" w:before="60"/>
+      </w:pPr>
+      <w:r>
+        <w:rPr>
+          <w:rFonts w:ascii="Arial" w:cs="Arial" w:eastAsia="Arial" w:hAnsi="Arial"/>
+          <w:sz w:val="22"/>
+          <w:szCs w:val="22"/>
+        </w:rPr>
+        <w:t xml:space="preserve">Repeated 20 times and combined with original training data (16,065 total samples)</w:t>
+      </w:r>
+    </w:p>
+    <w:p>
+      <w:pPr>
+        <w:pStyle w:val="ListParagraph"/>
+        <w:numPr>
+          <w:ilvl w:val="0"/>
+          <w:numId w:val="2"/>
+        </w:numPr>
+        <w:spacing w:after="60" w:before="60"/>
+      </w:pPr>
+      <w:r>
+        <w:rPr>
+          <w:rFonts w:ascii="Arial" w:cs="Arial" w:eastAsia="Arial" w:hAnsi="Arial"/>
+          <w:sz w:val="22"/>
+          <w:szCs w:val="22"/>
+        </w:rPr>
+        <w:t xml:space="preserve">Retrained on Google Colab T4 GPU for 35 epochs</w:t>
+      </w:r>
+    </w:p>
+    <w:p>
+      <w:pPr>
+        <w:pStyle w:val="ListParagraph"/>
+        <w:numPr>
+          <w:ilvl w:val="0"/>
+          <w:numId w:val="2"/>
+        </w:numPr>
+        <w:spacing w:after="60" w:before="60"/>
+      </w:pPr>
+      <w:r>
+        <w:rPr>
+          <w:rFonts w:ascii="Arial" w:cs="Arial" w:eastAsia="Arial" w:hAnsi="Arial"/>
+          <w:sz w:val="22"/>
+          <w:szCs w:val="22"/>
+        </w:rPr>
+        <w:t xml:space="preserve">Result: Negation accuracy improved to 92% but strong positive classification broke (50% overall accuracy)</w:t>
+      </w:r>
+    </w:p>
+    <w:p>
+      <w:pPr>
+        <w:pStyle w:val="ListParagraph"/>
+        <w:numPr>
+          <w:ilvl w:val="0"/>
+          <w:numId w:val="2"/>
+        </w:numPr>
+        <w:spacing w:after="60" w:before="60"/>
+      </w:pPr>
+      <w:r>
+        <w:rPr>
+          <w:rFonts w:ascii="Arial" w:cs="Arial" w:eastAsia="Arial" w:hAnsi="Arial"/>
+          <w:sz w:val="22"/>
+          <w:szCs w:val="22"/>
+        </w:rPr>
+        <w:t xml:space="preserve">Conclusion: repeat=20 over-weighted negative patterns causing the model to classify 'absolutely love this product' as Negative</w:t>
+      </w:r>
+    </w:p>
+    <w:p>
+      <w:pPr>
+        <w:spacing w:after="80" w:before="80"/>
+      </w:pPr>
+      <w:r>
+        <w:t xml:space="preserve"/>
+      </w:r>
+    </w:p>
+    <w:p>
+      <w:pPr>
+        <w:spacing w:after="100" w:before="200"/>
+      </w:pPr>
+      <w:r>
+        <w:rPr>
+          <w:rFonts w:ascii="Arial" w:cs="Arial" w:eastAsia="Arial" w:hAnsi="Arial"/>
+          <w:b/>
+          <w:bCs/>
+          <w:color w:val="1F4E79"/>
+          <w:sz w:val="22"/>
+          <w:szCs w:val="22"/>
+        </w:rPr>
+        <w:t xml:space="preserve">Experiment 2 — Negation Examples Repeated 5x</w:t>
+      </w:r>
+    </w:p>
+    <w:p>
+      <w:pPr>
+        <w:pStyle w:val="ListParagraph"/>
+        <w:numPr>
+          <w:ilvl w:val="0"/>
+          <w:numId w:val="2"/>
+        </w:numPr>
+        <w:spacing w:after="60" w:before="60"/>
+      </w:pPr>
+      <w:r>
+        <w:rPr>
+          <w:rFonts w:ascii="Arial" w:cs="Arial" w:eastAsia="Arial" w:hAnsi="Arial"/>
+          <w:sz w:val="22"/>
+          <w:szCs w:val="22"/>
+        </w:rPr>
+        <w:t xml:space="preserve">Reduced repeat to 5x (15,390 total training samples)</w:t>
+      </w:r>
+    </w:p>
+    <w:p>
+      <w:pPr>
+        <w:pStyle w:val="ListParagraph"/>
+        <w:numPr>
+          <w:ilvl w:val="0"/>
+          <w:numId w:val="2"/>
+        </w:numPr>
+        <w:spacing w:after="60" w:before="60"/>
+      </w:pPr>
+      <w:r>
+        <w:rPr>
+          <w:rFonts w:ascii="Arial" w:cs="Arial" w:eastAsia="Arial" w:hAnsi="Arial"/>
+          <w:sz w:val="22"/>
+          <w:szCs w:val="22"/>
+        </w:rPr>
+        <w:t xml:space="preserve">Retrained on Google Colab T4 GPU for 35 epochs</w:t>
+      </w:r>
+    </w:p>
+    <w:p>
+      <w:pPr>
+        <w:pStyle w:val="ListParagraph"/>
+        <w:numPr>
+          <w:ilvl w:val="0"/>
+          <w:numId w:val="2"/>
+        </w:numPr>
+        <w:spacing w:after="60" w:before="60"/>
+      </w:pPr>
+      <w:r>
+        <w:rPr>
+          <w:rFonts w:ascii="Arial" w:cs="Arial" w:eastAsia="Arial" w:hAnsi="Arial"/>
+          <w:sz w:val="22"/>
+          <w:szCs w:val="22"/>
+        </w:rPr>
+        <w:t xml:space="preserve">Result: 74% overall accuracy on test phrases — negation improved but strong positives still misclassified</w:t>
+      </w:r>
+    </w:p>
+    <w:p>
+      <w:pPr>
+        <w:pStyle w:val="ListParagraph"/>
+        <w:numPr>
+          <w:ilvl w:val="0"/>
+          <w:numId w:val="2"/>
+        </w:numPr>
+        <w:spacing w:after="60" w:before="60"/>
+      </w:pPr>
+      <w:r>
+        <w:rPr>
+          <w:rFonts w:ascii="Arial" w:cs="Arial" w:eastAsia="Arial" w:hAnsi="Arial"/>
+          <w:sz w:val="22"/>
+          <w:szCs w:val="22"/>
+        </w:rPr>
+        <w:t xml:space="preserve">'i hate this product' classified as Positive, 'absolutely love this product' classified as Negative</w:t>
+      </w:r>
+    </w:p>
+    <w:p>
+      <w:pPr>
+        <w:spacing w:after="80" w:before="80"/>
+      </w:pPr>
+      <w:r>
+        <w:t xml:space="preserve"/>
+      </w:r>
+    </w:p>
+    <w:p>
+      <w:pPr>
+        <w:spacing w:after="100" w:before="200"/>
+      </w:pPr>
+      <w:r>
+        <w:rPr>
+          <w:rFonts w:ascii="Arial" w:cs="Arial" w:eastAsia="Arial" w:hAnsi="Arial"/>
+          <w:b/>
+          <w:bCs/>
+          <w:color w:val="1F4E79"/>
+          <w:sz w:val="22"/>
+          <w:szCs w:val="22"/>
+        </w:rPr>
+        <w:t xml:space="preserve">Conclusion &amp; Resolution</w:t>
+      </w:r>
+    </w:p>
+    <w:p>
+      <w:pPr>
+        <w:spacing w:after="80" w:before="80"/>
+      </w:pPr>
+      <w:r>
+        <w:rPr>
+          <w:rFonts w:ascii="Arial" w:cs="Arial" w:eastAsia="Arial" w:hAnsi="Arial"/>
+          <w:sz w:val="22"/>
+          <w:szCs w:val="22"/>
+        </w:rPr>
+        <w:t xml:space="preserve">Both experiments demonstrated that the root cause is insufficient diverse training data rather than a model architecture or hyperparameter issue. Targeted negation examples improved negation handling but introduced new misclassifications in strong positive and negative patterns, indicating the model lacked enough general examples to balance both.</w:t>
+      </w:r>
+    </w:p>
+    <w:p>
+      <w:pPr>
+        <w:spacing w:after="80" w:before="80"/>
+      </w:pPr>
+      <w:r>
+        <w:t xml:space="preserve"/>
+      </w:r>
+    </w:p>
+    <w:p>
+      <w:pPr>
+        <w:spacing w:after="80" w:before="80"/>
+      </w:pPr>
+      <w:r>
+        <w:rPr>
+          <w:rFonts w:ascii="Arial" w:cs="Arial" w:eastAsia="Arial" w:hAnsi="Arial"/>
+          <w:sz w:val="22"/>
+          <w:szCs w:val="22"/>
+        </w:rPr>
+        <w:t xml:space="preserve">The original model (89.61% validation accuracy, 88.40% Macro F1) was retained as the production model. The negation limitation was addressed at the application layer by adding a confidence threshold to customer.html: when the model confidence falls below 75%, the customer interface asks the customer directly how they feel rather than relying on a low-confidence prediction.</w:t>
+      </w:r>
+    </w:p>
+    <w:p>
+      <w:pPr>
+        <w:spacing w:after="80" w:before="80"/>
+      </w:pPr>
+      <w:r>
+        <w:t xml:space="preserve"/>
+      </w:r>
+    </w:p>
+    <w:tbl>
+      <w:tblPr>
+        <w:tblW w:type="dxa" w:w="9360"/>
+        <w:tblBorders>
+          <w:top w:val="single" w:color="auto" w:sz="4"/>
+          <w:left w:val="single" w:color="auto" w:sz="4"/>
+          <w:bottom w:val="single" w:color="auto" w:sz="4"/>
+          <w:right w:val="single" w:color="auto" w:sz="4"/>
+          <w:insideH w:val="single" w:color="auto" w:sz="4"/>
+          <w:insideV w:val="single" w:color="auto" w:sz="4"/>
+        </w:tblBorders>
+      </w:tblPr>
+      <w:tblGrid>
+        <w:gridCol w:w="2200"/>
+        <w:gridCol w:w="1800"/>
+        <w:gridCol w:w="1800"/>
+        <w:gridCol w:w="3560"/>
+      </w:tblGrid>
+      <w:tr>
+        <w:tc>
+          <w:tcPr>
+            <w:tcW w:type="dxa" w:w="2200"/>
+            <w:tcBorders>
+              <w:top w:val="single" w:color="CCCCCC" w:sz="1"/>
+              <w:left w:val="single" w:color="CCCCCC" w:sz="1"/>
+              <w:bottom w:val="single" w:color="CCCCCC" w:sz="1"/>
+              <w:right w:val="single" w:color="CCCCCC" w:sz="1"/>
+            </w:tcBorders>
+            <w:shd w:fill="D6E4F0" w:val="clear"/>
+            <w:tcMar>
+              <w:top w:type="dxa" w:w="80"/>
+              <w:left w:type="dxa" w:w="120"/>
+              <w:bottom w:type="dxa" w:w="80"/>
+              <w:right w:type="dxa" w:w="120"/>
+            </w:tcMar>
+          </w:tcPr>
+          <w:p>
+            <w:r>
+              <w:rPr>
+                <w:rFonts w:ascii="Arial" w:cs="Arial" w:eastAsia="Arial" w:hAnsi="Arial"/>
+                <w:b/>
+                <w:bCs/>
+                <w:color w:val="1F4E79"/>
+                <w:sz w:val="20"/>
+                <w:szCs w:val="20"/>
+              </w:rPr>
+              <w:t xml:space="preserve">Approach</w:t>
+            </w:r>
+          </w:p>
+        </w:tc>
+        <w:tc>
+          <w:tcPr>
+            <w:tcW w:type="dxa" w:w="1800"/>
+            <w:tcBorders>
+              <w:top w:val="single" w:color="CCCCCC" w:sz="1"/>
+              <w:left w:val="single" w:color="CCCCCC" w:sz="1"/>
+              <w:bottom w:val="single" w:color="CCCCCC" w:sz="1"/>
+              <w:right w:val="single" w:color="CCCCCC" w:sz="1"/>
+            </w:tcBorders>
+            <w:shd w:fill="D6E4F0" w:val="clear"/>
+            <w:tcMar>
+              <w:top w:type="dxa" w:w="80"/>
+              <w:left w:type="dxa" w:w="120"/>
+              <w:bottom w:type="dxa" w:w="80"/>
+              <w:right w:type="dxa" w:w="120"/>
+            </w:tcMar>
+          </w:tcPr>
+          <w:p>
+            <w:r>
+              <w:rPr>
+                <w:rFonts w:ascii="Arial" w:cs="Arial" w:eastAsia="Arial" w:hAnsi="Arial"/>
+                <w:b/>
+                <w:bCs/>
+                <w:color w:val="1F4E79"/>
+                <w:sz w:val="20"/>
+                <w:szCs w:val="20"/>
+              </w:rPr>
+              <w:t xml:space="preserve">Negation Accuracy</w:t>
+            </w:r>
+          </w:p>
+        </w:tc>
+        <w:tc>
+          <w:tcPr>
+            <w:tcW w:type="dxa" w:w="1800"/>
+            <w:tcBorders>
+              <w:top w:val="single" w:color="CCCCCC" w:sz="1"/>
+              <w:left w:val="single" w:color="CCCCCC" w:sz="1"/>
+              <w:bottom w:val="single" w:color="CCCCCC" w:sz="1"/>
+              <w:right w:val="single" w:color="CCCCCC" w:sz="1"/>
+            </w:tcBorders>
+            <w:shd w:fill="D6E4F0" w:val="clear"/>
+            <w:tcMar>
+              <w:top w:type="dxa" w:w="80"/>
+              <w:left w:type="dxa" w:w="120"/>
+              <w:bottom w:type="dxa" w:w="80"/>
+              <w:right w:type="dxa" w:w="120"/>
+            </w:tcMar>
+          </w:tcPr>
+          <w:p>
+            <w:r>
+              <w:rPr>
+                <w:rFonts w:ascii="Arial" w:cs="Arial" w:eastAsia="Arial" w:hAnsi="Arial"/>
+                <w:b/>
+                <w:bCs/>
+                <w:color w:val="1F4E79"/>
+                <w:sz w:val="20"/>
+                <w:szCs w:val="20"/>
+              </w:rPr>
+              <w:t xml:space="preserve">Overall Accuracy</w:t>
+            </w:r>
+          </w:p>
+        </w:tc>
+        <w:tc>
+          <w:tcPr>
+            <w:tcW w:type="dxa" w:w="3560"/>
+            <w:tcBorders>
+              <w:top w:val="single" w:color="CCCCCC" w:sz="1"/>
+              <w:left w:val="single" w:color="CCCCCC" w:sz="1"/>
+              <w:bottom w:val="single" w:color="CCCCCC" w:sz="1"/>
+              <w:right w:val="single" w:color="CCCCCC" w:sz="1"/>
+            </w:tcBorders>
+            <w:shd w:fill="D6E4F0" w:val="clear"/>
+            <w:tcMar>
+              <w:top w:type="dxa" w:w="80"/>
+              <w:left w:type="dxa" w:w="120"/>
+              <w:bottom w:type="dxa" w:w="80"/>
+              <w:right w:type="dxa" w:w="120"/>
+            </w:tcMar>
+          </w:tcPr>
+          <w:p>
+            <w:r>
+              <w:rPr>
+                <w:rFonts w:ascii="Arial" w:cs="Arial" w:eastAsia="Arial" w:hAnsi="Arial"/>
+                <w:b/>
+                <w:bCs/>
+                <w:color w:val="1F4E79"/>
+                <w:sz w:val="20"/>
+                <w:szCs w:val="20"/>
+              </w:rPr>
+              <w:t xml:space="preserve">Decision</w:t>
+            </w:r>
+          </w:p>
+        </w:tc>
+      </w:tr>
+      <w:tr>
+        <w:tc>
+          <w:tcPr>
+            <w:tcW w:type="dxa" w:w="2200"/>
+            <w:tcBorders>
+              <w:top w:val="single" w:color="CCCCCC" w:sz="1"/>
+              <w:left w:val="single" w:color="CCCCCC" w:sz="1"/>
+              <w:bottom w:val="single" w:color="CCCCCC" w:sz="1"/>
+              <w:right w:val="single" w:color="CCCCCC" w:sz="1"/>
+            </w:tcBorders>
+            <w:shd w:fill="FFFFFF" w:val="clear"/>
+            <w:tcMar>
+              <w:top w:type="dxa" w:w="80"/>
+              <w:left w:type="dxa" w:w="120"/>
+              <w:bottom w:type="dxa" w:w="80"/>
+              <w:right w:type="dxa" w:w="120"/>
+            </w:tcMar>
+          </w:tcPr>
+          <w:p>
+            <w:r>
+              <w:rPr>
+                <w:rFonts w:ascii="Arial" w:cs="Arial" w:eastAsia="Arial" w:hAnsi="Arial"/>
+                <w:b w:val="false"/>
+                <w:bCs w:val="false"/>
+                <w:color w:val="000000"/>
+                <w:sz w:val="20"/>
+                <w:szCs w:val="20"/>
+              </w:rPr>
+              <w:t xml:space="preserve">Original model</w:t>
+            </w:r>
+          </w:p>
+        </w:tc>
+        <w:tc>
+          <w:tcPr>
+            <w:tcW w:type="dxa" w:w="1800"/>
+            <w:tcBorders>
+              <w:top w:val="single" w:color="CCCCCC" w:sz="1"/>
+              <w:left w:val="single" w:color="CCCCCC" w:sz="1"/>
+              <w:bottom w:val="single" w:color="CCCCCC" w:sz="1"/>
+              <w:right w:val="single" w:color="CCCCCC" w:sz="1"/>
+            </w:tcBorders>
+            <w:shd w:fill="FFFFFF" w:val="clear"/>
+            <w:tcMar>
+              <w:top w:type="dxa" w:w="80"/>
+              <w:left w:type="dxa" w:w="120"/>
+              <w:bottom w:type="dxa" w:w="80"/>
+              <w:right w:type="dxa" w:w="120"/>
+            </w:tcMar>
+          </w:tcPr>
+          <w:p>
+            <w:r>
+              <w:rPr>
+                <w:rFonts w:ascii="Arial" w:cs="Arial" w:eastAsia="Arial" w:hAnsi="Arial"/>
+                <w:b w:val="false"/>
+                <w:bCs w:val="false"/>
+                <w:color w:val="000000"/>
+                <w:sz w:val="20"/>
+                <w:szCs w:val="20"/>
+              </w:rPr>
+              <w:t xml:space="preserve">Low on negation</w:t>
+            </w:r>
+          </w:p>
+        </w:tc>
+        <w:tc>
+          <w:tcPr>
+            <w:tcW w:type="dxa" w:w="1800"/>
+            <w:tcBorders>
+              <w:top w:val="single" w:color="CCCCCC" w:sz="1"/>
+              <w:left w:val="single" w:color="CCCCCC" w:sz="1"/>
+              <w:bottom w:val="single" w:color="CCCCCC" w:sz="1"/>
+              <w:right w:val="single" w:color="CCCCCC" w:sz="1"/>
+            </w:tcBorders>
+            <w:shd w:fill="FFFFFF" w:val="clear"/>
+            <w:tcMar>
+              <w:top w:type="dxa" w:w="80"/>
+              <w:left w:type="dxa" w:w="120"/>
+              <w:bottom w:type="dxa" w:w="80"/>
+              <w:right w:type="dxa" w:w="120"/>
+            </w:tcMar>
+          </w:tcPr>
+          <w:p>
+            <w:r>
+              <w:rPr>
+                <w:rFonts w:ascii="Arial" w:cs="Arial" w:eastAsia="Arial" w:hAnsi="Arial"/>
+                <w:b w:val="false"/>
+                <w:bCs w:val="false"/>
+                <w:color w:val="000000"/>
+                <w:sz w:val="20"/>
+                <w:szCs w:val="20"/>
+              </w:rPr>
+              <w:t xml:space="preserve">89.61% val</w:t>
+            </w:r>
+          </w:p>
+        </w:tc>
+        <w:tc>
+          <w:tcPr>
+            <w:tcW w:type="dxa" w:w="3560"/>
+            <w:tcBorders>
+              <w:top w:val="single" w:color="CCCCCC" w:sz="1"/>
+              <w:left w:val="single" w:color="CCCCCC" w:sz="1"/>
+              <w:bottom w:val="single" w:color="CCCCCC" w:sz="1"/>
+              <w:right w:val="single" w:color="CCCCCC" w:sz="1"/>
+            </w:tcBorders>
+            <w:shd w:fill="FFFFFF" w:val="clear"/>
+            <w:tcMar>
+              <w:top w:type="dxa" w:w="80"/>
+              <w:left w:type="dxa" w:w="120"/>
+              <w:bottom w:type="dxa" w:w="80"/>
+              <w:right w:type="dxa" w:w="120"/>
+            </w:tcMar>
+          </w:tcPr>
+          <w:p>
+            <w:r>
+              <w:rPr>
+                <w:rFonts w:ascii="Arial" w:cs="Arial" w:eastAsia="Arial" w:hAnsi="Arial"/>
+                <w:b w:val="false"/>
+                <w:bCs w:val="false"/>
+                <w:color w:val="000000"/>
+                <w:sz w:val="20"/>
+                <w:szCs w:val="20"/>
+              </w:rPr>
+              <w:t xml:space="preserve">Retained as production model</w:t>
+            </w:r>
+          </w:p>
+        </w:tc>
+      </w:tr>
+      <w:tr>
+        <w:tc>
+          <w:tcPr>
+            <w:tcW w:type="dxa" w:w="2200"/>
+            <w:tcBorders>
+              <w:top w:val="single" w:color="CCCCCC" w:sz="1"/>
+              <w:left w:val="single" w:color="CCCCCC" w:sz="1"/>
+              <w:bottom w:val="single" w:color="CCCCCC" w:sz="1"/>
+              <w:right w:val="single" w:color="CCCCCC" w:sz="1"/>
+            </w:tcBorders>
+            <w:shd w:fill="FFFFFF" w:val="clear"/>
+            <w:tcMar>
+              <w:top w:type="dxa" w:w="80"/>
+              <w:left w:type="dxa" w:w="120"/>
+              <w:bottom w:type="dxa" w:w="80"/>
+              <w:right w:type="dxa" w:w="120"/>
+            </w:tcMar>
+          </w:tcPr>
+          <w:p>
+            <w:r>
+              <w:rPr>
+                <w:rFonts w:ascii="Arial" w:cs="Arial" w:eastAsia="Arial" w:hAnsi="Arial"/>
+                <w:b w:val="false"/>
+                <w:bCs w:val="false"/>
+                <w:color w:val="000000"/>
+                <w:sz w:val="20"/>
+                <w:szCs w:val="20"/>
+              </w:rPr>
+              <w:t xml:space="preserve">Negation repeat=20</w:t>
+            </w:r>
+          </w:p>
+        </w:tc>
+        <w:tc>
+          <w:tcPr>
+            <w:tcW w:type="dxa" w:w="1800"/>
+            <w:tcBorders>
+              <w:top w:val="single" w:color="CCCCCC" w:sz="1"/>
+              <w:left w:val="single" w:color="CCCCCC" w:sz="1"/>
+              <w:bottom w:val="single" w:color="CCCCCC" w:sz="1"/>
+              <w:right w:val="single" w:color="CCCCCC" w:sz="1"/>
+            </w:tcBorders>
+            <w:shd w:fill="FFFFFF" w:val="clear"/>
+            <w:tcMar>
+              <w:top w:type="dxa" w:w="80"/>
+              <w:left w:type="dxa" w:w="120"/>
+              <w:bottom w:type="dxa" w:w="80"/>
+              <w:right w:type="dxa" w:w="120"/>
+            </w:tcMar>
+          </w:tcPr>
+          <w:p>
+            <w:r>
+              <w:rPr>
+                <w:rFonts w:ascii="Arial" w:cs="Arial" w:eastAsia="Arial" w:hAnsi="Arial"/>
+                <w:b w:val="false"/>
+                <w:bCs w:val="false"/>
+                <w:color w:val="000000"/>
+                <w:sz w:val="20"/>
+                <w:szCs w:val="20"/>
+              </w:rPr>
+              <w:t xml:space="preserve">92%</w:t>
+            </w:r>
+          </w:p>
+        </w:tc>
+        <w:tc>
+          <w:tcPr>
+            <w:tcW w:type="dxa" w:w="1800"/>
+            <w:tcBorders>
+              <w:top w:val="single" w:color="CCCCCC" w:sz="1"/>
+              <w:left w:val="single" w:color="CCCCCC" w:sz="1"/>
+              <w:bottom w:val="single" w:color="CCCCCC" w:sz="1"/>
+              <w:right w:val="single" w:color="CCCCCC" w:sz="1"/>
+            </w:tcBorders>
+            <w:shd w:fill="FFFFFF" w:val="clear"/>
+            <w:tcMar>
+              <w:top w:type="dxa" w:w="80"/>
+              <w:left w:type="dxa" w:w="120"/>
+              <w:bottom w:type="dxa" w:w="80"/>
+              <w:right w:type="dxa" w:w="120"/>
+            </w:tcMar>
+          </w:tcPr>
+          <w:p>
+            <w:r>
+              <w:rPr>
+                <w:rFonts w:ascii="Arial" w:cs="Arial" w:eastAsia="Arial" w:hAnsi="Arial"/>
+                <w:b w:val="false"/>
+                <w:bCs w:val="false"/>
+                <w:color w:val="000000"/>
+                <w:sz w:val="20"/>
+                <w:szCs w:val="20"/>
+              </w:rPr>
+              <w:t xml:space="preserve">50%</w:t>
+            </w:r>
+          </w:p>
+        </w:tc>
+        <w:tc>
+          <w:tcPr>
+            <w:tcW w:type="dxa" w:w="3560"/>
+            <w:tcBorders>
+              <w:top w:val="single" w:color="CCCCCC" w:sz="1"/>
+              <w:left w:val="single" w:color="CCCCCC" w:sz="1"/>
+              <w:bottom w:val="single" w:color="CCCCCC" w:sz="1"/>
+              <w:right w:val="single" w:color="CCCCCC" w:sz="1"/>
+            </w:tcBorders>
+            <w:shd w:fill="FFFFFF" w:val="clear"/>
+            <w:tcMar>
+              <w:top w:type="dxa" w:w="80"/>
+              <w:left w:type="dxa" w:w="120"/>
+              <w:bottom w:type="dxa" w:w="80"/>
+              <w:right w:type="dxa" w:w="120"/>
+            </w:tcMar>
+          </w:tcPr>
+          <w:p>
+            <w:r>
+              <w:rPr>
+                <w:rFonts w:ascii="Arial" w:cs="Arial" w:eastAsia="Arial" w:hAnsi="Arial"/>
+                <w:b w:val="false"/>
+                <w:bCs w:val="false"/>
+                <w:color w:val="000000"/>
+                <w:sz w:val="20"/>
+                <w:szCs w:val="20"/>
+              </w:rPr>
+              <w:t xml:space="preserve">Rejected — broke positives</w:t>
+            </w:r>
+          </w:p>
+        </w:tc>
+      </w:tr>
+      <w:tr>
+        <w:tc>
+          <w:tcPr>
+            <w:tcW w:type="dxa" w:w="2200"/>
+            <w:tcBorders>
+              <w:top w:val="single" w:color="CCCCCC" w:sz="1"/>
+              <w:left w:val="single" w:color="CCCCCC" w:sz="1"/>
+              <w:bottom w:val="single" w:color="CCCCCC" w:sz="1"/>
+              <w:right w:val="single" w:color="CCCCCC" w:sz="1"/>
+            </w:tcBorders>
+            <w:shd w:fill="FFFFFF" w:val="clear"/>
+            <w:tcMar>
+              <w:top w:type="dxa" w:w="80"/>
+              <w:left w:type="dxa" w:w="120"/>
+              <w:bottom w:type="dxa" w:w="80"/>
+              <w:right w:type="dxa" w:w="120"/>
+            </w:tcMar>
+          </w:tcPr>
+          <w:p>
+            <w:r>
+              <w:rPr>
+                <w:rFonts w:ascii="Arial" w:cs="Arial" w:eastAsia="Arial" w:hAnsi="Arial"/>
+                <w:b w:val="false"/>
+                <w:bCs w:val="false"/>
+                <w:color w:val="000000"/>
+                <w:sz w:val="20"/>
+                <w:szCs w:val="20"/>
+              </w:rPr>
+              <w:t xml:space="preserve">Negation repeat=5</w:t>
+            </w:r>
+          </w:p>
+        </w:tc>
+        <w:tc>
+          <w:tcPr>
+            <w:tcW w:type="dxa" w:w="1800"/>
+            <w:tcBorders>
+              <w:top w:val="single" w:color="CCCCCC" w:sz="1"/>
+              <w:left w:val="single" w:color="CCCCCC" w:sz="1"/>
+              <w:bottom w:val="single" w:color="CCCCCC" w:sz="1"/>
+              <w:right w:val="single" w:color="CCCCCC" w:sz="1"/>
+            </w:tcBorders>
+            <w:shd w:fill="FFFFFF" w:val="clear"/>
+            <w:tcMar>
+              <w:top w:type="dxa" w:w="80"/>
+              <w:left w:type="dxa" w:w="120"/>
+              <w:bottom w:type="dxa" w:w="80"/>
+              <w:right w:type="dxa" w:w="120"/>
+            </w:tcMar>
+          </w:tcPr>
+          <w:p>
+            <w:r>
+              <w:rPr>
+                <w:rFonts w:ascii="Arial" w:cs="Arial" w:eastAsia="Arial" w:hAnsi="Arial"/>
+                <w:b w:val="false"/>
+                <w:bCs w:val="false"/>
+                <w:color w:val="000000"/>
+                <w:sz w:val="20"/>
+                <w:szCs w:val="20"/>
+              </w:rPr>
+              <w:t xml:space="preserve">Better</w:t>
+            </w:r>
+          </w:p>
+        </w:tc>
+        <w:tc>
+          <w:tcPr>
+            <w:tcW w:type="dxa" w:w="1800"/>
+            <w:tcBorders>
+              <w:top w:val="single" w:color="CCCCCC" w:sz="1"/>
+              <w:left w:val="single" w:color="CCCCCC" w:sz="1"/>
+              <w:bottom w:val="single" w:color="CCCCCC" w:sz="1"/>
+              <w:right w:val="single" w:color="CCCCCC" w:sz="1"/>
+            </w:tcBorders>
+            <w:shd w:fill="FFFFFF" w:val="clear"/>
+            <w:tcMar>
+              <w:top w:type="dxa" w:w="80"/>
+              <w:left w:type="dxa" w:w="120"/>
+              <w:bottom w:type="dxa" w:w="80"/>
+              <w:right w:type="dxa" w:w="120"/>
+            </w:tcMar>
+          </w:tcPr>
+          <w:p>
+            <w:r>
+              <w:rPr>
+                <w:rFonts w:ascii="Arial" w:cs="Arial" w:eastAsia="Arial" w:hAnsi="Arial"/>
+                <w:b w:val="false"/>
+                <w:bCs w:val="false"/>
+                <w:color w:val="000000"/>
+                <w:sz w:val="20"/>
+                <w:szCs w:val="20"/>
+              </w:rPr>
+              <w:t xml:space="preserve">74%</w:t>
+            </w:r>
+          </w:p>
+        </w:tc>
+        <w:tc>
+          <w:tcPr>
+            <w:tcW w:type="dxa" w:w="3560"/>
+            <w:tcBorders>
+              <w:top w:val="single" w:color="CCCCCC" w:sz="1"/>
+              <w:left w:val="single" w:color="CCCCCC" w:sz="1"/>
+              <w:bottom w:val="single" w:color="CCCCCC" w:sz="1"/>
+              <w:right w:val="single" w:color="CCCCCC" w:sz="1"/>
+            </w:tcBorders>
+            <w:shd w:fill="FFFFFF" w:val="clear"/>
+            <w:tcMar>
+              <w:top w:type="dxa" w:w="80"/>
+              <w:left w:type="dxa" w:w="120"/>
+              <w:bottom w:type="dxa" w:w="80"/>
+              <w:right w:type="dxa" w:w="120"/>
+            </w:tcMar>
+          </w:tcPr>
+          <w:p>
+            <w:r>
+              <w:rPr>
+                <w:rFonts w:ascii="Arial" w:cs="Arial" w:eastAsia="Arial" w:hAnsi="Arial"/>
+                <w:b w:val="false"/>
+                <w:bCs w:val="false"/>
+                <w:color w:val="000000"/>
+                <w:sz w:val="20"/>
+                <w:szCs w:val="20"/>
+              </w:rPr>
+              <w:t xml:space="preserve">Rejected — still unbalanced</w:t>
+            </w:r>
+          </w:p>
+        </w:tc>
+      </w:tr>
+      <w:tr>
+        <w:tc>
+          <w:tcPr>
+            <w:tcW w:type="dxa" w:w="2200"/>
+            <w:tcBorders>
+              <w:top w:val="single" w:color="CCCCCC" w:sz="1"/>
+              <w:left w:val="single" w:color="CCCCCC" w:sz="1"/>
+              <w:bottom w:val="single" w:color="CCCCCC" w:sz="1"/>
+              <w:right w:val="single" w:color="CCCCCC" w:sz="1"/>
+            </w:tcBorders>
+            <w:shd w:fill="FFFFFF" w:val="clear"/>
+            <w:tcMar>
+              <w:top w:type="dxa" w:w="80"/>
+              <w:left w:type="dxa" w:w="120"/>
+              <w:bottom w:type="dxa" w:w="80"/>
+              <w:right w:type="dxa" w:w="120"/>
+            </w:tcMar>
+          </w:tcPr>
+          <w:p>
+            <w:r>
+              <w:rPr>
+                <w:rFonts w:ascii="Arial" w:cs="Arial" w:eastAsia="Arial" w:hAnsi="Arial"/>
+                <w:b w:val="false"/>
+                <w:bCs w:val="false"/>
+                <w:color w:val="000000"/>
+                <w:sz w:val="20"/>
+                <w:szCs w:val="20"/>
+              </w:rPr>
+              <w:t xml:space="preserve">Confidence threshold</w:t>
+            </w:r>
+          </w:p>
+        </w:tc>
+        <w:tc>
+          <w:tcPr>
+            <w:tcW w:type="dxa" w:w="1800"/>
+            <w:tcBorders>
+              <w:top w:val="single" w:color="CCCCCC" w:sz="1"/>
+              <w:left w:val="single" w:color="CCCCCC" w:sz="1"/>
+              <w:bottom w:val="single" w:color="CCCCCC" w:sz="1"/>
+              <w:right w:val="single" w:color="CCCCCC" w:sz="1"/>
+            </w:tcBorders>
+            <w:shd w:fill="FFFFFF" w:val="clear"/>
+            <w:tcMar>
+              <w:top w:type="dxa" w:w="80"/>
+              <w:left w:type="dxa" w:w="120"/>
+              <w:bottom w:type="dxa" w:w="80"/>
+              <w:right w:type="dxa" w:w="120"/>
+            </w:tcMar>
+          </w:tcPr>
+          <w:p>
+            <w:r>
+              <w:rPr>
+                <w:rFonts w:ascii="Arial" w:cs="Arial" w:eastAsia="Arial" w:hAnsi="Arial"/>
+                <w:b w:val="false"/>
+                <w:bCs w:val="false"/>
+                <w:color w:val="000000"/>
+                <w:sz w:val="20"/>
+                <w:szCs w:val="20"/>
+              </w:rPr>
+              <w:t xml:space="preserve">N/A</w:t>
+            </w:r>
+          </w:p>
+        </w:tc>
+        <w:tc>
+          <w:tcPr>
+            <w:tcW w:type="dxa" w:w="1800"/>
+            <w:tcBorders>
+              <w:top w:val="single" w:color="CCCCCC" w:sz="1"/>
+              <w:left w:val="single" w:color="CCCCCC" w:sz="1"/>
+              <w:bottom w:val="single" w:color="CCCCCC" w:sz="1"/>
+              <w:right w:val="single" w:color="CCCCCC" w:sz="1"/>
+            </w:tcBorders>
+            <w:shd w:fill="FFFFFF" w:val="clear"/>
+            <w:tcMar>
+              <w:top w:type="dxa" w:w="80"/>
+              <w:left w:type="dxa" w:w="120"/>
+              <w:bottom w:type="dxa" w:w="80"/>
+              <w:right w:type="dxa" w:w="120"/>
+            </w:tcMar>
+          </w:tcPr>
+          <w:p>
+            <w:r>
+              <w:rPr>
+                <w:rFonts w:ascii="Arial" w:cs="Arial" w:eastAsia="Arial" w:hAnsi="Arial"/>
+                <w:b w:val="false"/>
+                <w:bCs w:val="false"/>
+                <w:color w:val="000000"/>
+                <w:sz w:val="20"/>
+                <w:szCs w:val="20"/>
+              </w:rPr>
+              <w:t xml:space="preserve">Handles edge cases</w:t>
+            </w:r>
+          </w:p>
+        </w:tc>
+        <w:tc>
+          <w:tcPr>
+            <w:tcW w:type="dxa" w:w="3560"/>
+            <w:tcBorders>
+              <w:top w:val="single" w:color="CCCCCC" w:sz="1"/>
+              <w:left w:val="single" w:color="CCCCCC" w:sz="1"/>
+              <w:bottom w:val="single" w:color="CCCCCC" w:sz="1"/>
+              <w:right w:val="single" w:color="CCCCCC" w:sz="1"/>
+            </w:tcBorders>
+            <w:shd w:fill="FFFFFF" w:val="clear"/>
+            <w:tcMar>
+              <w:top w:type="dxa" w:w="80"/>
+              <w:left w:type="dxa" w:w="120"/>
+              <w:bottom w:type="dxa" w:w="80"/>
+              <w:right w:type="dxa" w:w="120"/>
+            </w:tcMar>
+          </w:tcPr>
+          <w:p>
+            <w:r>
+              <w:rPr>
+                <w:rFonts w:ascii="Arial" w:cs="Arial" w:eastAsia="Arial" w:hAnsi="Arial"/>
+                <w:b w:val="false"/>
+                <w:bCs w:val="false"/>
+                <w:color w:val="000000"/>
+                <w:sz w:val="20"/>
+                <w:szCs w:val="20"/>
+              </w:rPr>
+              <w:t xml:space="preserve">Implemented in customer.html</w:t>
+            </w:r>
+          </w:p>
+        </w:tc>
+      </w:tr>
+    </w:tbl>
+    <w:p>
+      <w:pPr>
+        <w:spacing w:after="80" w:before="80"/>
+      </w:pPr>
+      <w:r>
+        <w:t xml:space="preserve"/>
+      </w:r>
+    </w:p>
+    <w:p>
+      <w:r>
+        <w:br w:type="page"/>
+      </w:r>
+    </w:p>
+    <w:p>
+      <w:pPr>
+        <w:pBdr>
+          <w:bottom w:val="single" w:color="2E75B6" w:sz="6" w:space="4"/>
+        </w:pBdr>
+        <w:spacing w:after="200" w:before="400"/>
+      </w:pPr>
+      <w:r>
+        <w:rPr>
+          <w:rFonts w:ascii="Arial" w:cs="Arial" w:eastAsia="Arial" w:hAnsi="Arial"/>
+          <w:b/>
+          <w:bCs/>
+          <w:color w:val="1F4E79"/>
+          <w:sz w:val="28"/>
+          <w:szCs w:val="28"/>
+        </w:rPr>
+        <w:t xml:space="preserve">6. HuggingFace Model Comparison</w:t>
       </w:r>
     </w:p>
     <w:tbl>
@@ -6788,7 +7550,7 @@
                 <w:sz w:val="20"/>
                 <w:szCs w:val="20"/>
               </w:rPr>
-              <w:t xml:space="preserve">NLPTown (multi-platform)</w:t>
+              <w:t xml:space="preserve">NLPTown</w:t>
             </w:r>
           </w:p>
         </w:tc>
@@ -6976,7 +7738,7 @@
                 <w:sz w:val="20"/>
                 <w:szCs w:val="20"/>
               </w:rPr>
-              <w:t xml:space="preserve">LiYuan (Amazon-specific)</w:t>
+              <w:t xml:space="preserve">LiYuan (Amazon)</w:t>
             </w:r>
           </w:p>
         </w:tc>
@@ -7325,27 +8087,6 @@
         </w:tc>
       </w:tr>
     </w:tbl>
-    <w:p>
-      <w:pPr>
-        <w:spacing w:after="80" w:before="80"/>
-      </w:pPr>
-      <w:r>
-        <w:t xml:space="preserve"/>
-      </w:r>
-    </w:p>
-    <w:p>
-      <w:pPr>
-        <w:spacing w:after="80" w:before="80"/>
-      </w:pPr>
-      <w:r>
-        <w:rPr>
-          <w:rFonts w:ascii="Arial" w:cs="Arial" w:eastAsia="Arial" w:hAnsi="Arial"/>
-          <w:sz w:val="22"/>
-          <w:szCs w:val="22"/>
-        </w:rPr>
-        <w:t xml:space="preserve">LensWord outperformed all three pretrained models on every metric. Notably, even LiYuan — which was trained specifically on Amazon reviews — was surpassed by our custom model, demonstrating that a domain-specific model trained on targeted, balanced data can outperform larger pretrained models, particularly on minority classes.</w:t>
-      </w:r>
-    </w:p>
     <w:p>
       <w:pPr>
         <w:spacing w:after="80" w:before="80"/>
@@ -7392,27 +8133,6 @@
           <w:szCs w:val="24"/>
         </w:rPr>
         <w:t xml:space="preserve">7.1  System Design</w:t>
-      </w:r>
-    </w:p>
-    <w:p>
-      <w:pPr>
-        <w:spacing w:after="80" w:before="80"/>
-      </w:pPr>
-      <w:r>
-        <w:rPr>
-          <w:rFonts w:ascii="Arial" w:cs="Arial" w:eastAsia="Arial" w:hAnsi="Arial"/>
-          <w:sz w:val="22"/>
-          <w:szCs w:val="22"/>
-        </w:rPr>
-        <w:t xml:space="preserve">A Retrieval-Augmented Generation (RAG) system was integrated into the FastAPI prediction endpoint to provide context-aware customer service response suggestions beyond simple sentiment classification.</w:t>
-      </w:r>
-    </w:p>
-    <w:p>
-      <w:pPr>
-        <w:spacing w:after="80" w:before="80"/>
-      </w:pPr>
-      <w:r>
-        <w:t xml:space="preserve"/>
       </w:r>
     </w:p>
     <w:tbl>
@@ -7586,7 +8306,7 @@
                 <w:sz w:val="20"/>
                 <w:szCs w:val="20"/>
               </w:rPr>
-              <w:t xml:space="preserve">CSV file (14 entries)</w:t>
+              <w:t xml:space="preserve">CSV (14 entries)</w:t>
             </w:r>
           </w:p>
         </w:tc>
@@ -7617,7 +8337,7 @@
                 <w:sz w:val="20"/>
                 <w:szCs w:val="20"/>
               </w:rPr>
-              <w:t xml:space="preserve">Stores complaint examples and corresponding response templates</w:t>
+              <w:t xml:space="preserve">Complaint examples and response templates</w:t>
             </w:r>
           </w:p>
         </w:tc>
@@ -7681,7 +8401,7 @@
                 <w:sz w:val="20"/>
                 <w:szCs w:val="20"/>
               </w:rPr>
-              <w:t xml:space="preserve">SentenceTransformer (all-MiniLM-L6-v2)</w:t>
+              <w:t xml:space="preserve">SentenceTransformer all-MiniLM-L6-v2</w:t>
             </w:r>
           </w:p>
         </w:tc>
@@ -7712,7 +8432,7 @@
                 <w:sz w:val="20"/>
                 <w:szCs w:val="20"/>
               </w:rPr>
-              <w:t xml:space="preserve">Converts review text and knowledge base entries to semantic vectors</w:t>
+              <w:t xml:space="preserve">Converts text to 384-dim semantic vectors</w:t>
             </w:r>
           </w:p>
         </w:tc>
@@ -7807,7 +8527,7 @@
                 <w:sz w:val="20"/>
                 <w:szCs w:val="20"/>
               </w:rPr>
-              <w:t xml:space="preserve">Stores and retrieves embeddings by semantic similarity</w:t>
+              <w:t xml:space="preserve">Stores and searches embeddings by similarity</w:t>
             </w:r>
           </w:p>
         </w:tc>
@@ -7871,7 +8591,7 @@
                 <w:sz w:val="20"/>
                 <w:szCs w:val="20"/>
               </w:rPr>
-              <w:t xml:space="preserve">Cosine similarity search</w:t>
+              <w:t xml:space="preserve">Cosine similarity</w:t>
             </w:r>
           </w:p>
         </w:tc>
@@ -7902,7 +8622,7 @@
                 <w:sz w:val="20"/>
                 <w:szCs w:val="20"/>
               </w:rPr>
-              <w:t xml:space="preserve">Finds the most semantically similar complaint to the input review</w:t>
+              <w:t xml:space="preserve">Finds most semantically similar complaint</w:t>
             </w:r>
           </w:p>
         </w:tc>
@@ -7942,7 +8662,7 @@
           <w:sz w:val="22"/>
           <w:szCs w:val="22"/>
         </w:rPr>
-        <w:t xml:space="preserve">When the model predicts Negative or Neutral sentiment, the review text is embedded using the SentenceTransformer model and queried against the ChromaDB collection. The most semantically similar complaint entry is retrieved and its corresponding response is returned alongside the sentiment prediction. For Positive predictions, a standard thank-you response is returned directly without querying the knowledge base.</w:t>
+        <w:t xml:space="preserve">When the model predicts Negative or Neutral, the review text is embedded using SentenceTransformer and queried against ChromaDB. The most semantically similar complaint is retrieved and its paired response returned. For Positive predictions, a standard thank-you response is returned directly without querying the knowledge base.</w:t>
       </w:r>
     </w:p>
     <w:p>
@@ -7984,8 +8704,7 @@
       <w:tblGrid>
         <w:gridCol w:w="1400"/>
         <w:gridCol w:w="1200"/>
-        <w:gridCol w:w="1200"/>
-        <w:gridCol w:w="5560"/>
+        <w:gridCol w:w="6760"/>
       </w:tblGrid>
       <w:tr>
         <w:tc>
@@ -8052,7 +8771,7 @@
         </w:tc>
         <w:tc>
           <w:tcPr>
-            <w:tcW w:type="dxa" w:w="1200"/>
+            <w:tcW w:type="dxa" w:w="6760"/>
             <w:tcBorders>
               <w:top w:val="single" w:color="CCCCCC" w:sz="1"/>
               <w:left w:val="single" w:color="CCCCCC" w:sz="1"/>
@@ -8081,37 +8800,6 @@
             </w:r>
           </w:p>
         </w:tc>
-        <w:tc>
-          <w:tcPr>
-            <w:tcW w:type="dxa" w:w="5560"/>
-            <w:tcBorders>
-              <w:top w:val="single" w:color="CCCCCC" w:sz="1"/>
-              <w:left w:val="single" w:color="CCCCCC" w:sz="1"/>
-              <w:bottom w:val="single" w:color="CCCCCC" w:sz="1"/>
-              <w:right w:val="single" w:color="CCCCCC" w:sz="1"/>
-            </w:tcBorders>
-            <w:shd w:fill="D6E4F0" w:val="clear"/>
-            <w:tcMar>
-              <w:top w:type="dxa" w:w="80"/>
-              <w:left w:type="dxa" w:w="120"/>
-              <w:bottom w:type="dxa" w:w="80"/>
-              <w:right w:type="dxa" w:w="120"/>
-            </w:tcMar>
-          </w:tcPr>
-          <w:p>
-            <w:r>
-              <w:rPr>
-                <w:rFonts w:ascii="Arial" w:cs="Arial" w:eastAsia="Arial" w:hAnsi="Arial"/>
-                <w:b/>
-                <w:bCs/>
-                <w:color w:val="1F4E79"/>
-                <w:sz w:val="20"/>
-                <w:szCs w:val="20"/>
-              </w:rPr>
-              <w:t xml:space="preserve">Behavior</w:t>
-            </w:r>
-          </w:p>
-        </w:tc>
       </w:tr>
       <w:tr>
         <w:tc>
@@ -8178,63 +8866,32 @@
         </w:tc>
         <w:tc>
           <w:tcPr>
-            <w:tcW w:type="dxa" w:w="1200"/>
-            <w:tcBorders>
-              <w:top w:val="single" w:color="CCCCCC" w:sz="1"/>
-              <w:left w:val="single" w:color="CCCCCC" w:sz="1"/>
-              <w:bottom w:val="single" w:color="CCCCCC" w:sz="1"/>
-              <w:right w:val="single" w:color="CCCCCC" w:sz="1"/>
-            </w:tcBorders>
-            <w:shd w:fill="FFFFFF" w:val="clear"/>
-            <w:tcMar>
-              <w:top w:type="dxa" w:w="80"/>
-              <w:left w:type="dxa" w:w="120"/>
-              <w:bottom w:type="dxa" w:w="80"/>
-              <w:right w:type="dxa" w:w="120"/>
-            </w:tcMar>
-          </w:tcPr>
-          <w:p>
-            <w:r>
-              <w:rPr>
-                <w:rFonts w:ascii="Arial" w:cs="Arial" w:eastAsia="Arial" w:hAnsi="Arial"/>
-                <w:b w:val="false"/>
-                <w:bCs w:val="false"/>
-                <w:color w:val="000000"/>
-                <w:sz w:val="20"/>
-                <w:szCs w:val="20"/>
-              </w:rPr>
-              <w:t xml:space="preserve">HIGH</w:t>
-            </w:r>
-          </w:p>
-        </w:tc>
-        <w:tc>
-          <w:tcPr>
-            <w:tcW w:type="dxa" w:w="5560"/>
-            <w:tcBorders>
-              <w:top w:val="single" w:color="CCCCCC" w:sz="1"/>
-              <w:left w:val="single" w:color="CCCCCC" w:sz="1"/>
-              <w:bottom w:val="single" w:color="CCCCCC" w:sz="1"/>
-              <w:right w:val="single" w:color="CCCCCC" w:sz="1"/>
-            </w:tcBorders>
-            <w:shd w:fill="FFFFFF" w:val="clear"/>
-            <w:tcMar>
-              <w:top w:type="dxa" w:w="80"/>
-              <w:left w:type="dxa" w:w="120"/>
-              <w:bottom w:type="dxa" w:w="80"/>
-              <w:right w:type="dxa" w:w="120"/>
-            </w:tcMar>
-          </w:tcPr>
-          <w:p>
-            <w:r>
-              <w:rPr>
-                <w:rFonts w:ascii="Arial" w:cs="Arial" w:eastAsia="Arial" w:hAnsi="Arial"/>
-                <w:b w:val="false"/>
-                <w:bCs w:val="false"/>
-                <w:color w:val="000000"/>
-                <w:sz w:val="20"/>
-                <w:szCs w:val="20"/>
-              </w:rPr>
-              <w:t xml:space="preserve">RAG retrieves most relevant complaint response; flags for human agent review</w:t>
+            <w:tcW w:type="dxa" w:w="6760"/>
+            <w:tcBorders>
+              <w:top w:val="single" w:color="CCCCCC" w:sz="1"/>
+              <w:left w:val="single" w:color="CCCCCC" w:sz="1"/>
+              <w:bottom w:val="single" w:color="CCCCCC" w:sz="1"/>
+              <w:right w:val="single" w:color="CCCCCC" w:sz="1"/>
+            </w:tcBorders>
+            <w:shd w:fill="FFFFFF" w:val="clear"/>
+            <w:tcMar>
+              <w:top w:type="dxa" w:w="80"/>
+              <w:left w:type="dxa" w:w="120"/>
+              <w:bottom w:type="dxa" w:w="80"/>
+              <w:right w:type="dxa" w:w="120"/>
+            </w:tcMar>
+          </w:tcPr>
+          <w:p>
+            <w:r>
+              <w:rPr>
+                <w:rFonts w:ascii="Arial" w:cs="Arial" w:eastAsia="Arial" w:hAnsi="Arial"/>
+                <w:b w:val="false"/>
+                <w:bCs w:val="false"/>
+                <w:color w:val="000000"/>
+                <w:sz w:val="20"/>
+                <w:szCs w:val="20"/>
+              </w:rPr>
+              <w:t xml:space="preserve">HIGH — RAG retrieves relevant response</w:t>
             </w:r>
           </w:p>
         </w:tc>
@@ -8304,63 +8961,32 @@
         </w:tc>
         <w:tc>
           <w:tcPr>
-            <w:tcW w:type="dxa" w:w="1200"/>
-            <w:tcBorders>
-              <w:top w:val="single" w:color="CCCCCC" w:sz="1"/>
-              <w:left w:val="single" w:color="CCCCCC" w:sz="1"/>
-              <w:bottom w:val="single" w:color="CCCCCC" w:sz="1"/>
-              <w:right w:val="single" w:color="CCCCCC" w:sz="1"/>
-            </w:tcBorders>
-            <w:shd w:fill="FFFFFF" w:val="clear"/>
-            <w:tcMar>
-              <w:top w:type="dxa" w:w="80"/>
-              <w:left w:type="dxa" w:w="120"/>
-              <w:bottom w:type="dxa" w:w="80"/>
-              <w:right w:type="dxa" w:w="120"/>
-            </w:tcMar>
-          </w:tcPr>
-          <w:p>
-            <w:r>
-              <w:rPr>
-                <w:rFonts w:ascii="Arial" w:cs="Arial" w:eastAsia="Arial" w:hAnsi="Arial"/>
-                <w:b w:val="false"/>
-                <w:bCs w:val="false"/>
-                <w:color w:val="000000"/>
-                <w:sz w:val="20"/>
-                <w:szCs w:val="20"/>
-              </w:rPr>
-              <w:t xml:space="preserve">MEDIUM</w:t>
-            </w:r>
-          </w:p>
-        </w:tc>
-        <w:tc>
-          <w:tcPr>
-            <w:tcW w:type="dxa" w:w="5560"/>
-            <w:tcBorders>
-              <w:top w:val="single" w:color="CCCCCC" w:sz="1"/>
-              <w:left w:val="single" w:color="CCCCCC" w:sz="1"/>
-              <w:bottom w:val="single" w:color="CCCCCC" w:sz="1"/>
-              <w:right w:val="single" w:color="CCCCCC" w:sz="1"/>
-            </w:tcBorders>
-            <w:shd w:fill="FFFFFF" w:val="clear"/>
-            <w:tcMar>
-              <w:top w:type="dxa" w:w="80"/>
-              <w:left w:type="dxa" w:w="120"/>
-              <w:bottom w:type="dxa" w:w="80"/>
-              <w:right w:type="dxa" w:w="120"/>
-            </w:tcMar>
-          </w:tcPr>
-          <w:p>
-            <w:r>
-              <w:rPr>
-                <w:rFonts w:ascii="Arial" w:cs="Arial" w:eastAsia="Arial" w:hAnsi="Arial"/>
-                <w:b w:val="false"/>
-                <w:bCs w:val="false"/>
-                <w:color w:val="000000"/>
-                <w:sz w:val="20"/>
-                <w:szCs w:val="20"/>
-              </w:rPr>
-              <w:t xml:space="preserve">RAG retrieves follow-up suggestion; queued for proactive outreach</w:t>
+            <w:tcW w:type="dxa" w:w="6760"/>
+            <w:tcBorders>
+              <w:top w:val="single" w:color="CCCCCC" w:sz="1"/>
+              <w:left w:val="single" w:color="CCCCCC" w:sz="1"/>
+              <w:bottom w:val="single" w:color="CCCCCC" w:sz="1"/>
+              <w:right w:val="single" w:color="CCCCCC" w:sz="1"/>
+            </w:tcBorders>
+            <w:shd w:fill="FFFFFF" w:val="clear"/>
+            <w:tcMar>
+              <w:top w:type="dxa" w:w="80"/>
+              <w:left w:type="dxa" w:w="120"/>
+              <w:bottom w:type="dxa" w:w="80"/>
+              <w:right w:type="dxa" w:w="120"/>
+            </w:tcMar>
+          </w:tcPr>
+          <w:p>
+            <w:r>
+              <w:rPr>
+                <w:rFonts w:ascii="Arial" w:cs="Arial" w:eastAsia="Arial" w:hAnsi="Arial"/>
+                <w:b w:val="false"/>
+                <w:bCs w:val="false"/>
+                <w:color w:val="000000"/>
+                <w:sz w:val="20"/>
+                <w:szCs w:val="20"/>
+              </w:rPr>
+              <w:t xml:space="preserve">MEDIUM — RAG retrieves follow-up suggestion</w:t>
             </w:r>
           </w:p>
         </w:tc>
@@ -8430,63 +9056,32 @@
         </w:tc>
         <w:tc>
           <w:tcPr>
-            <w:tcW w:type="dxa" w:w="1200"/>
-            <w:tcBorders>
-              <w:top w:val="single" w:color="CCCCCC" w:sz="1"/>
-              <w:left w:val="single" w:color="CCCCCC" w:sz="1"/>
-              <w:bottom w:val="single" w:color="CCCCCC" w:sz="1"/>
-              <w:right w:val="single" w:color="CCCCCC" w:sz="1"/>
-            </w:tcBorders>
-            <w:shd w:fill="FFFFFF" w:val="clear"/>
-            <w:tcMar>
-              <w:top w:type="dxa" w:w="80"/>
-              <w:left w:type="dxa" w:w="120"/>
-              <w:bottom w:type="dxa" w:w="80"/>
-              <w:right w:type="dxa" w:w="120"/>
-            </w:tcMar>
-          </w:tcPr>
-          <w:p>
-            <w:r>
-              <w:rPr>
-                <w:rFonts w:ascii="Arial" w:cs="Arial" w:eastAsia="Arial" w:hAnsi="Arial"/>
-                <w:b w:val="false"/>
-                <w:bCs w:val="false"/>
-                <w:color w:val="000000"/>
-                <w:sz w:val="20"/>
-                <w:szCs w:val="20"/>
-              </w:rPr>
-              <w:t xml:space="preserve">LOW</w:t>
-            </w:r>
-          </w:p>
-        </w:tc>
-        <w:tc>
-          <w:tcPr>
-            <w:tcW w:type="dxa" w:w="5560"/>
-            <w:tcBorders>
-              <w:top w:val="single" w:color="CCCCCC" w:sz="1"/>
-              <w:left w:val="single" w:color="CCCCCC" w:sz="1"/>
-              <w:bottom w:val="single" w:color="CCCCCC" w:sz="1"/>
-              <w:right w:val="single" w:color="CCCCCC" w:sz="1"/>
-            </w:tcBorders>
-            <w:shd w:fill="FFFFFF" w:val="clear"/>
-            <w:tcMar>
-              <w:top w:type="dxa" w:w="80"/>
-              <w:left w:type="dxa" w:w="120"/>
-              <w:bottom w:type="dxa" w:w="80"/>
-              <w:right w:type="dxa" w:w="120"/>
-            </w:tcMar>
-          </w:tcPr>
-          <w:p>
-            <w:r>
-              <w:rPr>
-                <w:rFonts w:ascii="Arial" w:cs="Arial" w:eastAsia="Arial" w:hAnsi="Arial"/>
-                <w:b w:val="false"/>
-                <w:bCs w:val="false"/>
-                <w:color w:val="000000"/>
-                <w:sz w:val="20"/>
-                <w:szCs w:val="20"/>
-              </w:rPr>
-              <w:t xml:space="preserve">Standard thank-you response; no escalation required</w:t>
+            <w:tcW w:type="dxa" w:w="6760"/>
+            <w:tcBorders>
+              <w:top w:val="single" w:color="CCCCCC" w:sz="1"/>
+              <w:left w:val="single" w:color="CCCCCC" w:sz="1"/>
+              <w:bottom w:val="single" w:color="CCCCCC" w:sz="1"/>
+              <w:right w:val="single" w:color="CCCCCC" w:sz="1"/>
+            </w:tcBorders>
+            <w:shd w:fill="FFFFFF" w:val="clear"/>
+            <w:tcMar>
+              <w:top w:type="dxa" w:w="80"/>
+              <w:left w:type="dxa" w:w="120"/>
+              <w:bottom w:type="dxa" w:w="80"/>
+              <w:right w:type="dxa" w:w="120"/>
+            </w:tcMar>
+          </w:tcPr>
+          <w:p>
+            <w:r>
+              <w:rPr>
+                <w:rFonts w:ascii="Arial" w:cs="Arial" w:eastAsia="Arial" w:hAnsi="Arial"/>
+                <w:b w:val="false"/>
+                <w:bCs w:val="false"/>
+                <w:color w:val="000000"/>
+                <w:sz w:val="20"/>
+                <w:szCs w:val="20"/>
+              </w:rPr>
+              <w:t xml:space="preserve">LOW — Standard thank-you response</w:t>
             </w:r>
           </w:p>
         </w:tc>
@@ -8521,7 +9116,7 @@
           <w:sz w:val="28"/>
           <w:szCs w:val="28"/>
         </w:rPr>
-        <w:t xml:space="preserve">8. Deployment &amp; MLOps</w:t>
+        <w:t xml:space="preserve">8. Dual Interface System</w:t>
       </w:r>
     </w:p>
     <w:p>
@@ -8537,7 +9132,7 @@
           <w:sz w:val="24"/>
           <w:szCs w:val="24"/>
         </w:rPr>
-        <w:t xml:space="preserve">8.1  API Architecture</w:t>
+        <w:t xml:space="preserve">8.1  Business Dashboard (index.html)</w:t>
       </w:r>
     </w:p>
     <w:p>
@@ -8550,64 +9145,7 @@
           <w:sz w:val="22"/>
           <w:szCs w:val="22"/>
         </w:rPr>
-        <w:t xml:space="preserve">The model is served via a FastAPI application (api.py) running on Uvicorn. The API exposes two endpoints:</w:t>
-      </w:r>
-    </w:p>
-    <w:p>
-      <w:pPr>
-        <w:pStyle w:val="ListParagraph"/>
-        <w:numPr>
-          <w:ilvl w:val="0"/>
-          <w:numId w:val="2"/>
-        </w:numPr>
-        <w:spacing w:after="60" w:before="60"/>
-      </w:pPr>
-      <w:r>
-        <w:rPr>
-          <w:rFonts w:ascii="Arial" w:cs="Arial" w:eastAsia="Arial" w:hAnsi="Arial"/>
-          <w:sz w:val="22"/>
-          <w:szCs w:val="22"/>
-        </w:rPr>
-        <w:t xml:space="preserve">GET / — Health check confirming the API is running</w:t>
-      </w:r>
-    </w:p>
-    <w:p>
-      <w:pPr>
-        <w:pStyle w:val="ListParagraph"/>
-        <w:numPr>
-          <w:ilvl w:val="0"/>
-          <w:numId w:val="2"/>
-        </w:numPr>
-        <w:spacing w:after="60" w:before="60"/>
-      </w:pPr>
-      <w:r>
-        <w:rPr>
-          <w:rFonts w:ascii="Arial" w:cs="Arial" w:eastAsia="Arial" w:hAnsi="Arial"/>
-          <w:sz w:val="22"/>
-          <w:szCs w:val="22"/>
-        </w:rPr>
-        <w:t xml:space="preserve">POST /predict — Accepts review text, returns sentiment, confidence, probabilities, and RAG-generated response</w:t>
-      </w:r>
-    </w:p>
-    <w:p>
-      <w:pPr>
-        <w:spacing w:after="80" w:before="80"/>
-      </w:pPr>
-      <w:r>
-        <w:t xml:space="preserve"/>
-      </w:r>
-    </w:p>
-    <w:p>
-      <w:pPr>
-        <w:spacing w:after="80" w:before="80"/>
-      </w:pPr>
-      <w:r>
-        <w:rPr>
-          <w:rFonts w:ascii="Arial" w:cs="Arial" w:eastAsia="Arial" w:hAnsi="Arial"/>
-          <w:sz w:val="22"/>
-          <w:szCs w:val="22"/>
-        </w:rPr>
-        <w:t xml:space="preserve">CORS middleware was configured to allow cross-origin requests from the HTML frontend, enabling the JavaScript web application to communicate with the API seamlessly.</w:t>
+        <w:t xml:space="preserve">A JavaScript single-page application for internal business use showing real-time sentiment classification, probability bars for all three classes, priority level, and RAG-generated suggested response.</w:t>
       </w:r>
     </w:p>
     <w:p>
@@ -8631,7 +9169,7 @@
           <w:sz w:val="24"/>
           <w:szCs w:val="24"/>
         </w:rPr>
-        <w:t xml:space="preserve">8.2  Frontend</w:t>
+        <w:t xml:space="preserve">8.2  Customer Chat Interface (customer.html)</w:t>
       </w:r>
     </w:p>
     <w:p>
@@ -8644,7 +9182,61 @@
           <w:sz w:val="22"/>
           <w:szCs w:val="22"/>
         </w:rPr>
-        <w:t xml:space="preserve">A single-page JavaScript web application (index.html) was built as the user-facing interface. The frontend features real-time sentiment visualization with color-coded badges, animated probability bars for all three classes, and display of the RAG-generated suggested response with priority level. No external JavaScript frameworks were used — the application uses vanilla HTML, CSS, and JavaScript.</w:t>
+        <w:t xml:space="preserve">A conversational chatbot for direct customer interaction. Sentiment is detected silently and customers never see technical outputs. The interface runs a 5-step conversation flow based on detected sentiment:</w:t>
+      </w:r>
+    </w:p>
+    <w:p>
+      <w:pPr>
+        <w:pStyle w:val="ListParagraph"/>
+        <w:numPr>
+          <w:ilvl w:val="0"/>
+          <w:numId w:val="2"/>
+        </w:numPr>
+        <w:spacing w:after="60" w:before="60"/>
+      </w:pPr>
+      <w:r>
+        <w:rPr>
+          <w:rFonts w:ascii="Arial" w:cs="Arial" w:eastAsia="Arial" w:hAnsi="Arial"/>
+          <w:sz w:val="22"/>
+          <w:szCs w:val="22"/>
+        </w:rPr>
+        <w:t xml:space="preserve">Negative — empathetic resolution flow with quick replies, order number collection, replacement/refund options, and escalation promise</w:t>
+      </w:r>
+    </w:p>
+    <w:p>
+      <w:pPr>
+        <w:pStyle w:val="ListParagraph"/>
+        <w:numPr>
+          <w:ilvl w:val="0"/>
+          <w:numId w:val="2"/>
+        </w:numPr>
+        <w:spacing w:after="60" w:before="60"/>
+      </w:pPr>
+      <w:r>
+        <w:rPr>
+          <w:rFonts w:ascii="Arial" w:cs="Arial" w:eastAsia="Arial" w:hAnsi="Arial"/>
+          <w:sz w:val="22"/>
+          <w:szCs w:val="22"/>
+        </w:rPr>
+        <w:t xml:space="preserve">Neutral — feedback collection flow asking what could be improved with follow-up questions</w:t>
+      </w:r>
+    </w:p>
+    <w:p>
+      <w:pPr>
+        <w:pStyle w:val="ListParagraph"/>
+        <w:numPr>
+          <w:ilvl w:val="0"/>
+          <w:numId w:val="2"/>
+        </w:numPr>
+        <w:spacing w:after="60" w:before="60"/>
+      </w:pPr>
+      <w:r>
+        <w:rPr>
+          <w:rFonts w:ascii="Arial" w:cs="Arial" w:eastAsia="Arial" w:hAnsi="Arial"/>
+          <w:sz w:val="22"/>
+          <w:szCs w:val="22"/>
+        </w:rPr>
+        <w:t xml:space="preserve">Positive — warm appreciation flow with review sharing and loyalty program offers</w:t>
       </w:r>
     </w:p>
     <w:p>
@@ -8668,7 +9260,7 @@
           <w:sz w:val="24"/>
           <w:szCs w:val="24"/>
         </w:rPr>
-        <w:t xml:space="preserve">8.3  Docker Containerization</w:t>
+        <w:t xml:space="preserve">8.3  Confidence Threshold</w:t>
       </w:r>
     </w:p>
     <w:p>
@@ -8681,7 +9273,7 @@
           <w:sz w:val="22"/>
           <w:szCs w:val="22"/>
         </w:rPr>
-        <w:t xml:space="preserve">The complete application was containerized using Docker for portable, reproducible deployment. The Dockerfile uses a Python 3.11-slim base image, installs all dependencies from requirements.txt, copies the project files, and starts the Uvicorn server on port 8000. WSL 2 was required to enable Docker on the Windows development machines.</w:t>
+        <w:t xml:space="preserve">To handle edge cases where the model prediction confidence is low (particularly negation patterns), a confidence threshold of 75% was implemented in customer.html. When confidence falls below this threshold, the chatbot asks the customer directly: 'To make sure we help you in the best way possible, could you tell us — are you happy with your experience, or did something go wrong?' This ensures customers always receive an appropriate response regardless of model uncertainty.</w:t>
       </w:r>
     </w:p>
     <w:p>
@@ -8693,8 +9285,53 @@
       </w:r>
     </w:p>
     <w:p>
-      <w:pPr>
-        <w:spacing w:after="80" w:before="80"/>
+      <w:r>
+        <w:br w:type="page"/>
+      </w:r>
+    </w:p>
+    <w:p>
+      <w:pPr>
+        <w:pBdr>
+          <w:bottom w:val="single" w:color="2E75B6" w:sz="6" w:space="4"/>
+        </w:pBdr>
+        <w:spacing w:after="200" w:before="400"/>
+      </w:pPr>
+      <w:r>
+        <w:rPr>
+          <w:rFonts w:ascii="Arial" w:cs="Arial" w:eastAsia="Arial" w:hAnsi="Arial"/>
+          <w:b/>
+          <w:bCs/>
+          <w:color w:val="1F4E79"/>
+          <w:sz w:val="28"/>
+          <w:szCs w:val="28"/>
+        </w:rPr>
+        <w:t xml:space="preserve">9. Deployment &amp; MLOps</w:t>
+      </w:r>
+    </w:p>
+    <w:p>
+      <w:pPr>
+        <w:spacing w:after="150" w:before="300"/>
+      </w:pPr>
+      <w:r>
+        <w:rPr>
+          <w:rFonts w:ascii="Arial" w:cs="Arial" w:eastAsia="Arial" w:hAnsi="Arial"/>
+          <w:b/>
+          <w:bCs/>
+          <w:color w:val="2E75B6"/>
+          <w:sz w:val="24"/>
+          <w:szCs w:val="24"/>
+        </w:rPr>
+        <w:t xml:space="preserve">9.1  API Architecture</w:t>
+      </w:r>
+    </w:p>
+    <w:p>
+      <w:pPr>
+        <w:pStyle w:val="ListParagraph"/>
+        <w:numPr>
+          <w:ilvl w:val="0"/>
+          <w:numId w:val="2"/>
+        </w:numPr>
+        <w:spacing w:after="60" w:before="60"/>
       </w:pPr>
       <w:r>
         <w:rPr>
@@ -8702,7 +9339,131 @@
           <w:sz w:val="22"/>
           <w:szCs w:val="22"/>
         </w:rPr>
-        <w:t xml:space="preserve">Build and run commands:</w:t>
+        <w:t xml:space="preserve">GET / — Health check confirming API status</w:t>
+      </w:r>
+    </w:p>
+    <w:p>
+      <w:pPr>
+        <w:pStyle w:val="ListParagraph"/>
+        <w:numPr>
+          <w:ilvl w:val="0"/>
+          <w:numId w:val="2"/>
+        </w:numPr>
+        <w:spacing w:after="60" w:before="60"/>
+      </w:pPr>
+      <w:r>
+        <w:rPr>
+          <w:rFonts w:ascii="Arial" w:cs="Arial" w:eastAsia="Arial" w:hAnsi="Arial"/>
+          <w:sz w:val="22"/>
+          <w:szCs w:val="22"/>
+        </w:rPr>
+        <w:t xml:space="preserve">POST /predict — Returns sentiment, confidence, probabilities, action, priority and RAG response</w:t>
+      </w:r>
+    </w:p>
+    <w:p>
+      <w:pPr>
+        <w:spacing w:after="80" w:before="80"/>
+      </w:pPr>
+      <w:r>
+        <w:t xml:space="preserve"/>
+      </w:r>
+    </w:p>
+    <w:p>
+      <w:pPr>
+        <w:spacing w:after="150" w:before="300"/>
+      </w:pPr>
+      <w:r>
+        <w:rPr>
+          <w:rFonts w:ascii="Arial" w:cs="Arial" w:eastAsia="Arial" w:hAnsi="Arial"/>
+          <w:b/>
+          <w:bCs/>
+          <w:color w:val="2E75B6"/>
+          <w:sz w:val="24"/>
+          <w:szCs w:val="24"/>
+        </w:rPr>
+        <w:t xml:space="preserve">9.2  Docker Containerization</w:t>
+      </w:r>
+    </w:p>
+    <w:p>
+      <w:pPr>
+        <w:spacing w:after="80" w:before="80"/>
+      </w:pPr>
+      <w:r>
+        <w:rPr>
+          <w:rFonts w:ascii="Arial" w:cs="Arial" w:eastAsia="Arial" w:hAnsi="Arial"/>
+          <w:sz w:val="22"/>
+          <w:szCs w:val="22"/>
+        </w:rPr>
+        <w:t xml:space="preserve">The complete application was containerized using Docker with Python 3.11-slim. WSL 2 was required on Windows development machines.</w:t>
+      </w:r>
+    </w:p>
+    <w:p>
+      <w:pPr>
+        <w:spacing w:after="80" w:before="80"/>
+      </w:pPr>
+      <w:r>
+        <w:t xml:space="preserve"/>
+      </w:r>
+    </w:p>
+    <w:p>
+      <w:pPr>
+        <w:spacing w:after="150" w:before="300"/>
+      </w:pPr>
+      <w:r>
+        <w:rPr>
+          <w:rFonts w:ascii="Arial" w:cs="Arial" w:eastAsia="Arial" w:hAnsi="Arial"/>
+          <w:b/>
+          <w:bCs/>
+          <w:color w:val="2E75B6"/>
+          <w:sz w:val="24"/>
+          <w:szCs w:val="24"/>
+        </w:rPr>
+        <w:t xml:space="preserve">9.3  GPU Training on Google Colab</w:t>
+      </w:r>
+    </w:p>
+    <w:p>
+      <w:pPr>
+        <w:spacing w:after="80" w:before="80"/>
+      </w:pPr>
+      <w:r>
+        <w:rPr>
+          <w:rFonts w:ascii="Arial" w:cs="Arial" w:eastAsia="Arial" w:hAnsi="Arial"/>
+          <w:sz w:val="22"/>
+          <w:szCs w:val="22"/>
+        </w:rPr>
+        <w:t xml:space="preserve">All overfitting remediation and negation handling experiments were conducted on Google Colab T4 GPU, reducing training time from 15 minutes per run to 2-3 minutes. Training data was stored in Google Drive and accessed directly from Colab sessions.</w:t>
+      </w:r>
+    </w:p>
+    <w:p>
+      <w:pPr>
+        <w:spacing w:after="80" w:before="80"/>
+      </w:pPr>
+      <w:r>
+        <w:t xml:space="preserve"/>
+      </w:r>
+    </w:p>
+    <w:p>
+      <w:r>
+        <w:br w:type="page"/>
+      </w:r>
+    </w:p>
+    <w:p>
+      <w:pPr>
+        <w:pBdr>
+          <w:bottom w:val="single" w:color="2E75B6" w:sz="6" w:space="4"/>
+        </w:pBdr>
+        <w:spacing w:after="200" w:before="400"/>
+      </w:pPr>
+      <w:r>
+        <w:rPr>
+          <w:rFonts w:ascii="Arial" w:cs="Arial" w:eastAsia="Arial" w:hAnsi="Arial"/>
+          <w:b/>
+          <w:bCs/>
+          <w:color w:val="1F4E79"/>
+          <w:sz w:val="28"/>
+          <w:szCs w:val="28"/>
+        </w:rPr>
+        <w:t xml:space="preserve">10. HuggingFace Resources Used</w:t>
       </w:r>
     </w:p>
     <w:tbl>
@@ -8718,13 +9479,14 @@
         </w:tblBorders>
       </w:tblPr>
       <w:tblGrid>
-        <w:gridCol w:w="4000"/>
-        <w:gridCol w:w="5360"/>
+        <w:gridCol w:w="2800"/>
+        <w:gridCol w:w="1800"/>
+        <w:gridCol w:w="4760"/>
       </w:tblGrid>
       <w:tr>
         <w:tc>
           <w:tcPr>
-            <w:tcW w:type="dxa" w:w="4000"/>
+            <w:tcW w:type="dxa" w:w="2800"/>
             <w:tcBorders>
               <w:top w:val="single" w:color="CCCCCC" w:sz="1"/>
               <w:left w:val="single" w:color="CCCCCC" w:sz="1"/>
@@ -8749,13 +9511,13 @@
                 <w:sz w:val="20"/>
                 <w:szCs w:val="20"/>
               </w:rPr>
-              <w:t xml:space="preserve">Command</w:t>
-            </w:r>
-          </w:p>
-        </w:tc>
-        <w:tc>
-          <w:tcPr>
-            <w:tcW w:type="dxa" w:w="5360"/>
+              <w:t xml:space="preserve">Resource</w:t>
+            </w:r>
+          </w:p>
+        </w:tc>
+        <w:tc>
+          <w:tcPr>
+            <w:tcW w:type="dxa" w:w="1800"/>
             <w:tcBorders>
               <w:top w:val="single" w:color="CCCCCC" w:sz="1"/>
               <w:left w:val="single" w:color="CCCCCC" w:sz="1"/>
@@ -8780,6 +9542,37 @@
                 <w:sz w:val="20"/>
                 <w:szCs w:val="20"/>
               </w:rPr>
+              <w:t xml:space="preserve">Type</w:t>
+            </w:r>
+          </w:p>
+        </w:tc>
+        <w:tc>
+          <w:tcPr>
+            <w:tcW w:type="dxa" w:w="4760"/>
+            <w:tcBorders>
+              <w:top w:val="single" w:color="CCCCCC" w:sz="1"/>
+              <w:left w:val="single" w:color="CCCCCC" w:sz="1"/>
+              <w:bottom w:val="single" w:color="CCCCCC" w:sz="1"/>
+              <w:right w:val="single" w:color="CCCCCC" w:sz="1"/>
+            </w:tcBorders>
+            <w:shd w:fill="D6E4F0" w:val="clear"/>
+            <w:tcMar>
+              <w:top w:type="dxa" w:w="80"/>
+              <w:left w:type="dxa" w:w="120"/>
+              <w:bottom w:type="dxa" w:w="80"/>
+              <w:right w:type="dxa" w:w="120"/>
+            </w:tcMar>
+          </w:tcPr>
+          <w:p>
+            <w:r>
+              <w:rPr>
+                <w:rFonts w:ascii="Arial" w:cs="Arial" w:eastAsia="Arial" w:hAnsi="Arial"/>
+                <w:b/>
+                <w:bCs/>
+                <w:color w:val="1F4E79"/>
+                <w:sz w:val="20"/>
+                <w:szCs w:val="20"/>
+              </w:rPr>
               <w:t xml:space="preserve">Purpose</w:t>
             </w:r>
           </w:p>
@@ -8788,63 +9581,94 @@
       <w:tr>
         <w:tc>
           <w:tcPr>
-            <w:tcW w:type="dxa" w:w="4000"/>
-            <w:tcBorders>
-              <w:top w:val="single" w:color="CCCCCC" w:sz="1"/>
-              <w:left w:val="single" w:color="CCCCCC" w:sz="1"/>
-              <w:bottom w:val="single" w:color="CCCCCC" w:sz="1"/>
-              <w:right w:val="single" w:color="CCCCCC" w:sz="1"/>
-            </w:tcBorders>
-            <w:shd w:fill="FFFFFF" w:val="clear"/>
-            <w:tcMar>
-              <w:top w:type="dxa" w:w="80"/>
-              <w:left w:type="dxa" w:w="120"/>
-              <w:bottom w:type="dxa" w:w="80"/>
-              <w:right w:type="dxa" w:w="120"/>
-            </w:tcMar>
-          </w:tcPr>
-          <w:p>
-            <w:r>
-              <w:rPr>
-                <w:rFonts w:ascii="Arial" w:cs="Arial" w:eastAsia="Arial" w:hAnsi="Arial"/>
-                <w:b w:val="false"/>
-                <w:bCs w:val="false"/>
-                <w:color w:val="000000"/>
-                <w:sz w:val="20"/>
-                <w:szCs w:val="20"/>
-              </w:rPr>
-              <w:t xml:space="preserve">docker build -t lensword .</w:t>
-            </w:r>
-          </w:p>
-        </w:tc>
-        <w:tc>
-          <w:tcPr>
-            <w:tcW w:type="dxa" w:w="5360"/>
-            <w:tcBorders>
-              <w:top w:val="single" w:color="CCCCCC" w:sz="1"/>
-              <w:left w:val="single" w:color="CCCCCC" w:sz="1"/>
-              <w:bottom w:val="single" w:color="CCCCCC" w:sz="1"/>
-              <w:right w:val="single" w:color="CCCCCC" w:sz="1"/>
-            </w:tcBorders>
-            <w:shd w:fill="FFFFFF" w:val="clear"/>
-            <w:tcMar>
-              <w:top w:type="dxa" w:w="80"/>
-              <w:left w:type="dxa" w:w="120"/>
-              <w:bottom w:type="dxa" w:w="80"/>
-              <w:right w:type="dxa" w:w="120"/>
-            </w:tcMar>
-          </w:tcPr>
-          <w:p>
-            <w:r>
-              <w:rPr>
-                <w:rFonts w:ascii="Arial" w:cs="Arial" w:eastAsia="Arial" w:hAnsi="Arial"/>
-                <w:b w:val="false"/>
-                <w:bCs w:val="false"/>
-                <w:color w:val="000000"/>
-                <w:sz w:val="20"/>
-                <w:szCs w:val="20"/>
-              </w:rPr>
-              <w:t xml:space="preserve">Build the Docker image</w:t>
+            <w:tcW w:type="dxa" w:w="2800"/>
+            <w:tcBorders>
+              <w:top w:val="single" w:color="CCCCCC" w:sz="1"/>
+              <w:left w:val="single" w:color="CCCCCC" w:sz="1"/>
+              <w:bottom w:val="single" w:color="CCCCCC" w:sz="1"/>
+              <w:right w:val="single" w:color="CCCCCC" w:sz="1"/>
+            </w:tcBorders>
+            <w:shd w:fill="FFFFFF" w:val="clear"/>
+            <w:tcMar>
+              <w:top w:type="dxa" w:w="80"/>
+              <w:left w:type="dxa" w:w="120"/>
+              <w:bottom w:type="dxa" w:w="80"/>
+              <w:right w:type="dxa" w:w="120"/>
+            </w:tcMar>
+          </w:tcPr>
+          <w:p>
+            <w:r>
+              <w:rPr>
+                <w:rFonts w:ascii="Arial" w:cs="Arial" w:eastAsia="Arial" w:hAnsi="Arial"/>
+                <w:b w:val="false"/>
+                <w:bCs w:val="false"/>
+                <w:color w:val="000000"/>
+                <w:sz w:val="20"/>
+                <w:szCs w:val="20"/>
+              </w:rPr>
+              <w:t xml:space="preserve">Yelp/yelp_review_full</w:t>
+            </w:r>
+          </w:p>
+        </w:tc>
+        <w:tc>
+          <w:tcPr>
+            <w:tcW w:type="dxa" w:w="1800"/>
+            <w:tcBorders>
+              <w:top w:val="single" w:color="CCCCCC" w:sz="1"/>
+              <w:left w:val="single" w:color="CCCCCC" w:sz="1"/>
+              <w:bottom w:val="single" w:color="CCCCCC" w:sz="1"/>
+              <w:right w:val="single" w:color="CCCCCC" w:sz="1"/>
+            </w:tcBorders>
+            <w:shd w:fill="FFFFFF" w:val="clear"/>
+            <w:tcMar>
+              <w:top w:type="dxa" w:w="80"/>
+              <w:left w:type="dxa" w:w="120"/>
+              <w:bottom w:type="dxa" w:w="80"/>
+              <w:right w:type="dxa" w:w="120"/>
+            </w:tcMar>
+          </w:tcPr>
+          <w:p>
+            <w:r>
+              <w:rPr>
+                <w:rFonts w:ascii="Arial" w:cs="Arial" w:eastAsia="Arial" w:hAnsi="Arial"/>
+                <w:b w:val="false"/>
+                <w:bCs w:val="false"/>
+                <w:color w:val="000000"/>
+                <w:sz w:val="20"/>
+                <w:szCs w:val="20"/>
+              </w:rPr>
+              <w:t xml:space="preserve">Dataset</w:t>
+            </w:r>
+          </w:p>
+        </w:tc>
+        <w:tc>
+          <w:tcPr>
+            <w:tcW w:type="dxa" w:w="4760"/>
+            <w:tcBorders>
+              <w:top w:val="single" w:color="CCCCCC" w:sz="1"/>
+              <w:left w:val="single" w:color="CCCCCC" w:sz="1"/>
+              <w:bottom w:val="single" w:color="CCCCCC" w:sz="1"/>
+              <w:right w:val="single" w:color="CCCCCC" w:sz="1"/>
+            </w:tcBorders>
+            <w:shd w:fill="FFFFFF" w:val="clear"/>
+            <w:tcMar>
+              <w:top w:type="dxa" w:w="80"/>
+              <w:left w:type="dxa" w:w="120"/>
+              <w:bottom w:type="dxa" w:w="80"/>
+              <w:right w:type="dxa" w:w="120"/>
+            </w:tcMar>
+          </w:tcPr>
+          <w:p>
+            <w:r>
+              <w:rPr>
+                <w:rFonts w:ascii="Arial" w:cs="Arial" w:eastAsia="Arial" w:hAnsi="Arial"/>
+                <w:b w:val="false"/>
+                <w:bCs w:val="false"/>
+                <w:color w:val="000000"/>
+                <w:sz w:val="20"/>
+                <w:szCs w:val="20"/>
+              </w:rPr>
+              <w:t xml:space="preserve">6,000 additional training reviews</w:t>
             </w:r>
           </w:p>
         </w:tc>
@@ -8852,63 +9676,379 @@
       <w:tr>
         <w:tc>
           <w:tcPr>
-            <w:tcW w:type="dxa" w:w="4000"/>
-            <w:tcBorders>
-              <w:top w:val="single" w:color="CCCCCC" w:sz="1"/>
-              <w:left w:val="single" w:color="CCCCCC" w:sz="1"/>
-              <w:bottom w:val="single" w:color="CCCCCC" w:sz="1"/>
-              <w:right w:val="single" w:color="CCCCCC" w:sz="1"/>
-            </w:tcBorders>
-            <w:shd w:fill="FFFFFF" w:val="clear"/>
-            <w:tcMar>
-              <w:top w:type="dxa" w:w="80"/>
-              <w:left w:type="dxa" w:w="120"/>
-              <w:bottom w:type="dxa" w:w="80"/>
-              <w:right w:type="dxa" w:w="120"/>
-            </w:tcMar>
-          </w:tcPr>
-          <w:p>
-            <w:r>
-              <w:rPr>
-                <w:rFonts w:ascii="Arial" w:cs="Arial" w:eastAsia="Arial" w:hAnsi="Arial"/>
-                <w:b w:val="false"/>
-                <w:bCs w:val="false"/>
-                <w:color w:val="000000"/>
-                <w:sz w:val="20"/>
-                <w:szCs w:val="20"/>
-              </w:rPr>
-              <w:t xml:space="preserve">docker run -p 8000:8000 lensword</w:t>
-            </w:r>
-          </w:p>
-        </w:tc>
-        <w:tc>
-          <w:tcPr>
-            <w:tcW w:type="dxa" w:w="5360"/>
-            <w:tcBorders>
-              <w:top w:val="single" w:color="CCCCCC" w:sz="1"/>
-              <w:left w:val="single" w:color="CCCCCC" w:sz="1"/>
-              <w:bottom w:val="single" w:color="CCCCCC" w:sz="1"/>
-              <w:right w:val="single" w:color="CCCCCC" w:sz="1"/>
-            </w:tcBorders>
-            <w:shd w:fill="FFFFFF" w:val="clear"/>
-            <w:tcMar>
-              <w:top w:type="dxa" w:w="80"/>
-              <w:left w:type="dxa" w:w="120"/>
-              <w:bottom w:type="dxa" w:w="80"/>
-              <w:right w:type="dxa" w:w="120"/>
-            </w:tcMar>
-          </w:tcPr>
-          <w:p>
-            <w:r>
-              <w:rPr>
-                <w:rFonts w:ascii="Arial" w:cs="Arial" w:eastAsia="Arial" w:hAnsi="Arial"/>
-                <w:b w:val="false"/>
-                <w:bCs w:val="false"/>
-                <w:color w:val="000000"/>
-                <w:sz w:val="20"/>
-                <w:szCs w:val="20"/>
-              </w:rPr>
-              <w:t xml:space="preserve">Run the container and expose port 8000</w:t>
+            <w:tcW w:type="dxa" w:w="2800"/>
+            <w:tcBorders>
+              <w:top w:val="single" w:color="CCCCCC" w:sz="1"/>
+              <w:left w:val="single" w:color="CCCCCC" w:sz="1"/>
+              <w:bottom w:val="single" w:color="CCCCCC" w:sz="1"/>
+              <w:right w:val="single" w:color="CCCCCC" w:sz="1"/>
+            </w:tcBorders>
+            <w:shd w:fill="FFFFFF" w:val="clear"/>
+            <w:tcMar>
+              <w:top w:type="dxa" w:w="80"/>
+              <w:left w:type="dxa" w:w="120"/>
+              <w:bottom w:type="dxa" w:w="80"/>
+              <w:right w:type="dxa" w:w="120"/>
+            </w:tcMar>
+          </w:tcPr>
+          <w:p>
+            <w:r>
+              <w:rPr>
+                <w:rFonts w:ascii="Arial" w:cs="Arial" w:eastAsia="Arial" w:hAnsi="Arial"/>
+                <w:b w:val="false"/>
+                <w:bCs w:val="false"/>
+                <w:color w:val="000000"/>
+                <w:sz w:val="20"/>
+                <w:szCs w:val="20"/>
+              </w:rPr>
+              <w:t xml:space="preserve">nlptown/bert-base-multilingual-uncased-sentiment</w:t>
+            </w:r>
+          </w:p>
+        </w:tc>
+        <w:tc>
+          <w:tcPr>
+            <w:tcW w:type="dxa" w:w="1800"/>
+            <w:tcBorders>
+              <w:top w:val="single" w:color="CCCCCC" w:sz="1"/>
+              <w:left w:val="single" w:color="CCCCCC" w:sz="1"/>
+              <w:bottom w:val="single" w:color="CCCCCC" w:sz="1"/>
+              <w:right w:val="single" w:color="CCCCCC" w:sz="1"/>
+            </w:tcBorders>
+            <w:shd w:fill="FFFFFF" w:val="clear"/>
+            <w:tcMar>
+              <w:top w:type="dxa" w:w="80"/>
+              <w:left w:type="dxa" w:w="120"/>
+              <w:bottom w:type="dxa" w:w="80"/>
+              <w:right w:type="dxa" w:w="120"/>
+            </w:tcMar>
+          </w:tcPr>
+          <w:p>
+            <w:r>
+              <w:rPr>
+                <w:rFonts w:ascii="Arial" w:cs="Arial" w:eastAsia="Arial" w:hAnsi="Arial"/>
+                <w:b w:val="false"/>
+                <w:bCs w:val="false"/>
+                <w:color w:val="000000"/>
+                <w:sz w:val="20"/>
+                <w:szCs w:val="20"/>
+              </w:rPr>
+              <w:t xml:space="preserve">Pretrained model</w:t>
+            </w:r>
+          </w:p>
+        </w:tc>
+        <w:tc>
+          <w:tcPr>
+            <w:tcW w:type="dxa" w:w="4760"/>
+            <w:tcBorders>
+              <w:top w:val="single" w:color="CCCCCC" w:sz="1"/>
+              <w:left w:val="single" w:color="CCCCCC" w:sz="1"/>
+              <w:bottom w:val="single" w:color="CCCCCC" w:sz="1"/>
+              <w:right w:val="single" w:color="CCCCCC" w:sz="1"/>
+            </w:tcBorders>
+            <w:shd w:fill="FFFFFF" w:val="clear"/>
+            <w:tcMar>
+              <w:top w:type="dxa" w:w="80"/>
+              <w:left w:type="dxa" w:w="120"/>
+              <w:bottom w:type="dxa" w:w="80"/>
+              <w:right w:type="dxa" w:w="120"/>
+            </w:tcMar>
+          </w:tcPr>
+          <w:p>
+            <w:r>
+              <w:rPr>
+                <w:rFonts w:ascii="Arial" w:cs="Arial" w:eastAsia="Arial" w:hAnsi="Arial"/>
+                <w:b w:val="false"/>
+                <w:bCs w:val="false"/>
+                <w:color w:val="000000"/>
+                <w:sz w:val="20"/>
+                <w:szCs w:val="20"/>
+              </w:rPr>
+              <w:t xml:space="preserve">Comparison baseline</w:t>
+            </w:r>
+          </w:p>
+        </w:tc>
+      </w:tr>
+      <w:tr>
+        <w:tc>
+          <w:tcPr>
+            <w:tcW w:type="dxa" w:w="2800"/>
+            <w:tcBorders>
+              <w:top w:val="single" w:color="CCCCCC" w:sz="1"/>
+              <w:left w:val="single" w:color="CCCCCC" w:sz="1"/>
+              <w:bottom w:val="single" w:color="CCCCCC" w:sz="1"/>
+              <w:right w:val="single" w:color="CCCCCC" w:sz="1"/>
+            </w:tcBorders>
+            <w:shd w:fill="FFFFFF" w:val="clear"/>
+            <w:tcMar>
+              <w:top w:type="dxa" w:w="80"/>
+              <w:left w:type="dxa" w:w="120"/>
+              <w:bottom w:type="dxa" w:w="80"/>
+              <w:right w:type="dxa" w:w="120"/>
+            </w:tcMar>
+          </w:tcPr>
+          <w:p>
+            <w:r>
+              <w:rPr>
+                <w:rFonts w:ascii="Arial" w:cs="Arial" w:eastAsia="Arial" w:hAnsi="Arial"/>
+                <w:b w:val="false"/>
+                <w:bCs w:val="false"/>
+                <w:color w:val="000000"/>
+                <w:sz w:val="20"/>
+                <w:szCs w:val="20"/>
+              </w:rPr>
+              <w:t xml:space="preserve">LiYuan/amazon-review-sentiment-analysis</w:t>
+            </w:r>
+          </w:p>
+        </w:tc>
+        <w:tc>
+          <w:tcPr>
+            <w:tcW w:type="dxa" w:w="1800"/>
+            <w:tcBorders>
+              <w:top w:val="single" w:color="CCCCCC" w:sz="1"/>
+              <w:left w:val="single" w:color="CCCCCC" w:sz="1"/>
+              <w:bottom w:val="single" w:color="CCCCCC" w:sz="1"/>
+              <w:right w:val="single" w:color="CCCCCC" w:sz="1"/>
+            </w:tcBorders>
+            <w:shd w:fill="FFFFFF" w:val="clear"/>
+            <w:tcMar>
+              <w:top w:type="dxa" w:w="80"/>
+              <w:left w:type="dxa" w:w="120"/>
+              <w:bottom w:type="dxa" w:w="80"/>
+              <w:right w:type="dxa" w:w="120"/>
+            </w:tcMar>
+          </w:tcPr>
+          <w:p>
+            <w:r>
+              <w:rPr>
+                <w:rFonts w:ascii="Arial" w:cs="Arial" w:eastAsia="Arial" w:hAnsi="Arial"/>
+                <w:b w:val="false"/>
+                <w:bCs w:val="false"/>
+                <w:color w:val="000000"/>
+                <w:sz w:val="20"/>
+                <w:szCs w:val="20"/>
+              </w:rPr>
+              <w:t xml:space="preserve">Pretrained model</w:t>
+            </w:r>
+          </w:p>
+        </w:tc>
+        <w:tc>
+          <w:tcPr>
+            <w:tcW w:type="dxa" w:w="4760"/>
+            <w:tcBorders>
+              <w:top w:val="single" w:color="CCCCCC" w:sz="1"/>
+              <w:left w:val="single" w:color="CCCCCC" w:sz="1"/>
+              <w:bottom w:val="single" w:color="CCCCCC" w:sz="1"/>
+              <w:right w:val="single" w:color="CCCCCC" w:sz="1"/>
+            </w:tcBorders>
+            <w:shd w:fill="FFFFFF" w:val="clear"/>
+            <w:tcMar>
+              <w:top w:type="dxa" w:w="80"/>
+              <w:left w:type="dxa" w:w="120"/>
+              <w:bottom w:type="dxa" w:w="80"/>
+              <w:right w:type="dxa" w:w="120"/>
+            </w:tcMar>
+          </w:tcPr>
+          <w:p>
+            <w:r>
+              <w:rPr>
+                <w:rFonts w:ascii="Arial" w:cs="Arial" w:eastAsia="Arial" w:hAnsi="Arial"/>
+                <w:b w:val="false"/>
+                <w:bCs w:val="false"/>
+                <w:color w:val="000000"/>
+                <w:sz w:val="20"/>
+                <w:szCs w:val="20"/>
+              </w:rPr>
+              <w:t xml:space="preserve">Comparison baseline</w:t>
+            </w:r>
+          </w:p>
+        </w:tc>
+      </w:tr>
+      <w:tr>
+        <w:tc>
+          <w:tcPr>
+            <w:tcW w:type="dxa" w:w="2800"/>
+            <w:tcBorders>
+              <w:top w:val="single" w:color="CCCCCC" w:sz="1"/>
+              <w:left w:val="single" w:color="CCCCCC" w:sz="1"/>
+              <w:bottom w:val="single" w:color="CCCCCC" w:sz="1"/>
+              <w:right w:val="single" w:color="CCCCCC" w:sz="1"/>
+            </w:tcBorders>
+            <w:shd w:fill="FFFFFF" w:val="clear"/>
+            <w:tcMar>
+              <w:top w:type="dxa" w:w="80"/>
+              <w:left w:type="dxa" w:w="120"/>
+              <w:bottom w:type="dxa" w:w="80"/>
+              <w:right w:type="dxa" w:w="120"/>
+            </w:tcMar>
+          </w:tcPr>
+          <w:p>
+            <w:r>
+              <w:rPr>
+                <w:rFonts w:ascii="Arial" w:cs="Arial" w:eastAsia="Arial" w:hAnsi="Arial"/>
+                <w:b w:val="false"/>
+                <w:bCs w:val="false"/>
+                <w:color w:val="000000"/>
+                <w:sz w:val="20"/>
+                <w:szCs w:val="20"/>
+              </w:rPr>
+              <w:t xml:space="preserve">cardiffnlp/twitter-roberta-base-sentiment-latest</w:t>
+            </w:r>
+          </w:p>
+        </w:tc>
+        <w:tc>
+          <w:tcPr>
+            <w:tcW w:type="dxa" w:w="1800"/>
+            <w:tcBorders>
+              <w:top w:val="single" w:color="CCCCCC" w:sz="1"/>
+              <w:left w:val="single" w:color="CCCCCC" w:sz="1"/>
+              <w:bottom w:val="single" w:color="CCCCCC" w:sz="1"/>
+              <w:right w:val="single" w:color="CCCCCC" w:sz="1"/>
+            </w:tcBorders>
+            <w:shd w:fill="FFFFFF" w:val="clear"/>
+            <w:tcMar>
+              <w:top w:type="dxa" w:w="80"/>
+              <w:left w:type="dxa" w:w="120"/>
+              <w:bottom w:type="dxa" w:w="80"/>
+              <w:right w:type="dxa" w:w="120"/>
+            </w:tcMar>
+          </w:tcPr>
+          <w:p>
+            <w:r>
+              <w:rPr>
+                <w:rFonts w:ascii="Arial" w:cs="Arial" w:eastAsia="Arial" w:hAnsi="Arial"/>
+                <w:b w:val="false"/>
+                <w:bCs w:val="false"/>
+                <w:color w:val="000000"/>
+                <w:sz w:val="20"/>
+                <w:szCs w:val="20"/>
+              </w:rPr>
+              <w:t xml:space="preserve">Pretrained model</w:t>
+            </w:r>
+          </w:p>
+        </w:tc>
+        <w:tc>
+          <w:tcPr>
+            <w:tcW w:type="dxa" w:w="4760"/>
+            <w:tcBorders>
+              <w:top w:val="single" w:color="CCCCCC" w:sz="1"/>
+              <w:left w:val="single" w:color="CCCCCC" w:sz="1"/>
+              <w:bottom w:val="single" w:color="CCCCCC" w:sz="1"/>
+              <w:right w:val="single" w:color="CCCCCC" w:sz="1"/>
+            </w:tcBorders>
+            <w:shd w:fill="FFFFFF" w:val="clear"/>
+            <w:tcMar>
+              <w:top w:type="dxa" w:w="80"/>
+              <w:left w:type="dxa" w:w="120"/>
+              <w:bottom w:type="dxa" w:w="80"/>
+              <w:right w:type="dxa" w:w="120"/>
+            </w:tcMar>
+          </w:tcPr>
+          <w:p>
+            <w:r>
+              <w:rPr>
+                <w:rFonts w:ascii="Arial" w:cs="Arial" w:eastAsia="Arial" w:hAnsi="Arial"/>
+                <w:b w:val="false"/>
+                <w:bCs w:val="false"/>
+                <w:color w:val="000000"/>
+                <w:sz w:val="20"/>
+                <w:szCs w:val="20"/>
+              </w:rPr>
+              <w:t xml:space="preserve">Comparison baseline</w:t>
+            </w:r>
+          </w:p>
+        </w:tc>
+      </w:tr>
+      <w:tr>
+        <w:tc>
+          <w:tcPr>
+            <w:tcW w:type="dxa" w:w="2800"/>
+            <w:tcBorders>
+              <w:top w:val="single" w:color="CCCCCC" w:sz="1"/>
+              <w:left w:val="single" w:color="CCCCCC" w:sz="1"/>
+              <w:bottom w:val="single" w:color="CCCCCC" w:sz="1"/>
+              <w:right w:val="single" w:color="CCCCCC" w:sz="1"/>
+            </w:tcBorders>
+            <w:shd w:fill="FFFFFF" w:val="clear"/>
+            <w:tcMar>
+              <w:top w:type="dxa" w:w="80"/>
+              <w:left w:type="dxa" w:w="120"/>
+              <w:bottom w:type="dxa" w:w="80"/>
+              <w:right w:type="dxa" w:w="120"/>
+            </w:tcMar>
+          </w:tcPr>
+          <w:p>
+            <w:r>
+              <w:rPr>
+                <w:rFonts w:ascii="Arial" w:cs="Arial" w:eastAsia="Arial" w:hAnsi="Arial"/>
+                <w:b w:val="false"/>
+                <w:bCs w:val="false"/>
+                <w:color w:val="000000"/>
+                <w:sz w:val="20"/>
+                <w:szCs w:val="20"/>
+              </w:rPr>
+              <w:t xml:space="preserve">sentence-transformers/all-MiniLM-L6-v2</w:t>
+            </w:r>
+          </w:p>
+        </w:tc>
+        <w:tc>
+          <w:tcPr>
+            <w:tcW w:type="dxa" w:w="1800"/>
+            <w:tcBorders>
+              <w:top w:val="single" w:color="CCCCCC" w:sz="1"/>
+              <w:left w:val="single" w:color="CCCCCC" w:sz="1"/>
+              <w:bottom w:val="single" w:color="CCCCCC" w:sz="1"/>
+              <w:right w:val="single" w:color="CCCCCC" w:sz="1"/>
+            </w:tcBorders>
+            <w:shd w:fill="FFFFFF" w:val="clear"/>
+            <w:tcMar>
+              <w:top w:type="dxa" w:w="80"/>
+              <w:left w:type="dxa" w:w="120"/>
+              <w:bottom w:type="dxa" w:w="80"/>
+              <w:right w:type="dxa" w:w="120"/>
+            </w:tcMar>
+          </w:tcPr>
+          <w:p>
+            <w:r>
+              <w:rPr>
+                <w:rFonts w:ascii="Arial" w:cs="Arial" w:eastAsia="Arial" w:hAnsi="Arial"/>
+                <w:b w:val="false"/>
+                <w:bCs w:val="false"/>
+                <w:color w:val="000000"/>
+                <w:sz w:val="20"/>
+                <w:szCs w:val="20"/>
+              </w:rPr>
+              <w:t xml:space="preserve">Pretrained model</w:t>
+            </w:r>
+          </w:p>
+        </w:tc>
+        <w:tc>
+          <w:tcPr>
+            <w:tcW w:type="dxa" w:w="4760"/>
+            <w:tcBorders>
+              <w:top w:val="single" w:color="CCCCCC" w:sz="1"/>
+              <w:left w:val="single" w:color="CCCCCC" w:sz="1"/>
+              <w:bottom w:val="single" w:color="CCCCCC" w:sz="1"/>
+              <w:right w:val="single" w:color="CCCCCC" w:sz="1"/>
+            </w:tcBorders>
+            <w:shd w:fill="FFFFFF" w:val="clear"/>
+            <w:tcMar>
+              <w:top w:type="dxa" w:w="80"/>
+              <w:left w:type="dxa" w:w="120"/>
+              <w:bottom w:type="dxa" w:w="80"/>
+              <w:right w:type="dxa" w:w="120"/>
+            </w:tcMar>
+          </w:tcPr>
+          <w:p>
+            <w:r>
+              <w:rPr>
+                <w:rFonts w:ascii="Arial" w:cs="Arial" w:eastAsia="Arial" w:hAnsi="Arial"/>
+                <w:b w:val="false"/>
+                <w:bCs w:val="false"/>
+                <w:color w:val="000000"/>
+                <w:sz w:val="20"/>
+                <w:szCs w:val="20"/>
+              </w:rPr>
+              <w:t xml:space="preserve">RAG embedding (384-dim vectors)</w:t>
             </w:r>
           </w:p>
         </w:tc>
@@ -8943,7 +10083,7 @@
           <w:sz w:val="28"/>
           <w:szCs w:val="28"/>
         </w:rPr>
-        <w:t xml:space="preserve">9. Limitations &amp; Future Work</w:t>
+        <w:t xml:space="preserve">11. Limitations &amp; Future Work</w:t>
       </w:r>
     </w:p>
     <w:p>
@@ -8959,7 +10099,7 @@
           <w:sz w:val="24"/>
           <w:szCs w:val="24"/>
         </w:rPr>
-        <w:t xml:space="preserve">9.1  Current Limitations</w:t>
+        <w:t xml:space="preserve">11.1  Current Limitations</w:t>
       </w:r>
     </w:p>
     <w:p>
@@ -8977,7 +10117,7 @@
           <w:sz w:val="22"/>
           <w:szCs w:val="22"/>
         </w:rPr>
-        <w:t xml:space="preserve">The model was trained on Amazon product and Yelp restaurant reviews — performance may degrade on out-of-domain text such as social media posts or technical reviews</w:t>
+        <w:t xml:space="preserve">Mild overfitting observed (10% gap between train and validation accuracy)</w:t>
       </w:r>
     </w:p>
     <w:p>
@@ -8995,7 +10135,7 @@
           <w:sz w:val="22"/>
           <w:szCs w:val="22"/>
         </w:rPr>
-        <w:t xml:space="preserve">Short reviews (1-3 words) provide insufficient context for confident classification</w:t>
+        <w:t xml:space="preserve">Negation handling weakness — short phrases with implicit negative sentiment can be misclassified</w:t>
       </w:r>
     </w:p>
     <w:p>
@@ -9013,7 +10153,7 @@
           <w:sz w:val="22"/>
           <w:szCs w:val="22"/>
         </w:rPr>
-        <w:t xml:space="preserve">Reviews expressing negative sentiment through implicit context rather than explicit negative vocabulary remain challenging</w:t>
+        <w:t xml:space="preserve">Short reviews of 1-3 words provide insufficient context for confident classification</w:t>
       </w:r>
     </w:p>
     <w:p>
@@ -9031,7 +10171,7 @@
           <w:sz w:val="22"/>
           <w:szCs w:val="22"/>
         </w:rPr>
-        <w:t xml:space="preserve">The RAG knowledge base contains 14 entries — a production system would benefit from a significantly larger and more diverse knowledge base</w:t>
+        <w:t xml:space="preserve">RAG knowledge base contains only 14 entries</w:t>
       </w:r>
     </w:p>
     <w:p>
@@ -9049,7 +10189,7 @@
           <w:sz w:val="22"/>
           <w:szCs w:val="22"/>
         </w:rPr>
-        <w:t xml:space="preserve">The model does not currently support languages other than English</w:t>
+        <w:t xml:space="preserve">English language only</w:t>
       </w:r>
     </w:p>
     <w:p>
@@ -9073,7 +10213,7 @@
           <w:sz w:val="24"/>
           <w:szCs w:val="24"/>
         </w:rPr>
-        <w:t xml:space="preserve">9.2  Future Work</w:t>
+        <w:t xml:space="preserve">11.2  Future Work</w:t>
       </w:r>
     </w:p>
     <w:p>
@@ -9091,7 +10231,7 @@
           <w:sz w:val="22"/>
           <w:szCs w:val="22"/>
         </w:rPr>
-        <w:t xml:space="preserve">Fine-tune a pretrained transformer model (DistilBERT or RoBERTa) specifically on the combined Amazon-Yelp dataset to potentially improve minority class detection further</w:t>
+        <w:t xml:space="preserve">Collect more diverse labeled data to address overfitting and negation handling at the root cause level</w:t>
       </w:r>
     </w:p>
     <w:p>
@@ -9109,7 +10249,7 @@
           <w:sz w:val="22"/>
           <w:szCs w:val="22"/>
         </w:rPr>
-        <w:t xml:space="preserve">Expand the RAG knowledge base with domain-specific response templates sourced from real customer service interactions</w:t>
+        <w:t xml:space="preserve">Fine-tune a pretrained transformer (DistilBERT or RoBERTa) on the combined dataset</w:t>
       </w:r>
     </w:p>
     <w:p>
@@ -9127,7 +10267,7 @@
           <w:sz w:val="22"/>
           <w:szCs w:val="22"/>
         </w:rPr>
-        <w:t xml:space="preserve">Implement persistent ChromaDB storage to replace the current in-memory setup for production deployments</w:t>
+        <w:t xml:space="preserve">Expand the RAG knowledge base with real customer service interactions</w:t>
       </w:r>
     </w:p>
     <w:p>
@@ -9145,7 +10285,7 @@
           <w:sz w:val="22"/>
           <w:szCs w:val="22"/>
         </w:rPr>
-        <w:t xml:space="preserve">Add multilingual support to serve non-English speaking markets</w:t>
+        <w:t xml:space="preserve">Deploy to cloud infrastructure for public accessibility</w:t>
       </w:r>
     </w:p>
     <w:p>
@@ -9163,25 +10303,7 @@
           <w:sz w:val="22"/>
           <w:szCs w:val="22"/>
         </w:rPr>
-        <w:t xml:space="preserve">Deploy to a cloud platform (AWS/GCP/Azure) for public accessibility and scalability testing</w:t>
-      </w:r>
-    </w:p>
-    <w:p>
-      <w:pPr>
-        <w:pStyle w:val="ListParagraph"/>
-        <w:numPr>
-          <w:ilvl w:val="0"/>
-          <w:numId w:val="2"/>
-        </w:numPr>
-        <w:spacing w:after="60" w:before="60"/>
-      </w:pPr>
-      <w:r>
-        <w:rPr>
-          <w:rFonts w:ascii="Arial" w:cs="Arial" w:eastAsia="Arial" w:hAnsi="Arial"/>
-          <w:sz w:val="22"/>
-          <w:szCs w:val="22"/>
-        </w:rPr>
-        <w:t xml:space="preserve">Implement real-time monitoring and model drift detection for production use</w:t>
+        <w:t xml:space="preserve">Add multilingual support</w:t>
       </w:r>
     </w:p>
     <w:p>
@@ -9213,7 +10335,7 @@
           <w:sz w:val="28"/>
           <w:szCs w:val="28"/>
         </w:rPr>
-        <w:t xml:space="preserve">10. Conclusion</w:t>
+        <w:t xml:space="preserve">12. Conclusion</w:t>
       </w:r>
     </w:p>
     <w:p>
@@ -9226,7 +10348,7 @@
           <w:sz w:val="22"/>
           <w:szCs w:val="22"/>
         </w:rPr>
-        <w:t xml:space="preserve">LensWord successfully demonstrates that a custom-trained domain-specific deep learning model can outperform large pretrained models when trained on appropriately balanced, domain-relevant data. Through iterative experimentation — addressing class imbalance with SMOTE, improving training stability with a learning rate scheduler, and expanding the dataset with Yelp reviews — the model's Macro F1 score improved from 67.99% to 88.40%, with dramatic improvements in minority class detection (Negative F1: 0.52 → 0.89, Neutral F1: 0.56 → 0.86).</w:t>
+        <w:t xml:space="preserve">LensWord demonstrates that a custom-trained domain-specific model can outperform large pretrained models when trained on appropriately balanced data. Macro F1 improved from 67.99% to 88.40% through iterative experimentation. The project produced several meaningful engineering insights: the importance of dataset balance over model complexity, the risks of aggressive class weight adjustment, the value of documenting failures honestly, and the insight that targeted data augmentation for specific linguistic patterns requires careful calibration to avoid introducing new misclassifications.</w:t>
       </w:r>
     </w:p>
     <w:p>
@@ -9247,108 +10369,7 @@
           <w:sz w:val="22"/>
           <w:szCs w:val="22"/>
         </w:rPr>
-        <w:t xml:space="preserve">The integration of a RAG-powered response suggestion system elevates LensWord beyond a classification tool into a practical customer service assistant, providing actionable outputs that can be directly integrated into e-commerce support workflows. The complete system — from data pipeline through model training to deployed API and frontend — represents a production-ready AI/ML engineering deliverable.</w:t>
-      </w:r>
-    </w:p>
-    <w:p>
-      <w:pPr>
-        <w:spacing w:after="80" w:before="80"/>
-      </w:pPr>
-      <w:r>
-        <w:t xml:space="preserve"/>
-      </w:r>
-    </w:p>
-    <w:p>
-      <w:pPr>
-        <w:spacing w:after="80" w:before="80"/>
-      </w:pPr>
-      <w:r>
-        <w:rPr>
-          <w:rFonts w:ascii="Arial" w:cs="Arial" w:eastAsia="Arial" w:hAnsi="Arial"/>
-          <w:sz w:val="22"/>
-          <w:szCs w:val="22"/>
-        </w:rPr>
-        <w:t xml:space="preserve">Key contributions of this project include:</w:t>
-      </w:r>
-    </w:p>
-    <w:p>
-      <w:pPr>
-        <w:pStyle w:val="ListParagraph"/>
-        <w:numPr>
-          <w:ilvl w:val="0"/>
-          <w:numId w:val="2"/>
-        </w:numPr>
-        <w:spacing w:after="60" w:before="60"/>
-      </w:pPr>
-      <w:r>
-        <w:rPr>
-          <w:rFonts w:ascii="Arial" w:cs="Arial" w:eastAsia="Arial" w:hAnsi="Arial"/>
-          <w:sz w:val="22"/>
-          <w:szCs w:val="22"/>
-        </w:rPr>
-        <w:t xml:space="preserve">A reproducible end-to-end NLP pipeline from raw review data to deployed API</w:t>
-      </w:r>
-    </w:p>
-    <w:p>
-      <w:pPr>
-        <w:pStyle w:val="ListParagraph"/>
-        <w:numPr>
-          <w:ilvl w:val="0"/>
-          <w:numId w:val="2"/>
-        </w:numPr>
-        <w:spacing w:after="60" w:before="60"/>
-      </w:pPr>
-      <w:r>
-        <w:rPr>
-          <w:rFonts w:ascii="Arial" w:cs="Arial" w:eastAsia="Arial" w:hAnsi="Arial"/>
-          <w:sz w:val="22"/>
-          <w:szCs w:val="22"/>
-        </w:rPr>
-        <w:t xml:space="preserve">Rigorous experimental documentation including a documented failure case (class weight overcorrection) demonstrating analytical maturity</w:t>
-      </w:r>
-    </w:p>
-    <w:p>
-      <w:pPr>
-        <w:pStyle w:val="ListParagraph"/>
-        <w:numPr>
-          <w:ilvl w:val="0"/>
-          <w:numId w:val="2"/>
-        </w:numPr>
-        <w:spacing w:after="60" w:before="60"/>
-      </w:pPr>
-      <w:r>
-        <w:rPr>
-          <w:rFonts w:ascii="Arial" w:cs="Arial" w:eastAsia="Arial" w:hAnsi="Arial"/>
-          <w:sz w:val="22"/>
-          <w:szCs w:val="22"/>
-        </w:rPr>
-        <w:t xml:space="preserve">A novel combination of Bidirectional LSTM sentiment classification with RAG-powered response retrieval</w:t>
-      </w:r>
-    </w:p>
-    <w:p>
-      <w:pPr>
-        <w:pStyle w:val="ListParagraph"/>
-        <w:numPr>
-          <w:ilvl w:val="0"/>
-          <w:numId w:val="2"/>
-        </w:numPr>
-        <w:spacing w:after="60" w:before="60"/>
-      </w:pPr>
-      <w:r>
-        <w:rPr>
-          <w:rFonts w:ascii="Arial" w:cs="Arial" w:eastAsia="Arial" w:hAnsi="Arial"/>
-          <w:sz w:val="22"/>
-          <w:szCs w:val="22"/>
-        </w:rPr>
-        <w:t xml:space="preserve">Empirical evidence that dataset expansion and balance are more impactful than architectural complexity for this problem domain</w:t>
-      </w:r>
-    </w:p>
-    <w:p>
-      <w:pPr>
-        <w:spacing w:after="80" w:before="80"/>
-      </w:pPr>
-      <w:r>
-        <w:t xml:space="preserve"/>
+        <w:t xml:space="preserve">The dual-interface system combining a business analytics dashboard with a customer-facing conversational chatbot — complete with a confidence threshold for handling edge cases — demonstrates practical product thinking beyond model accuracy metrics.</w:t>
       </w:r>
     </w:p>
     <w:p>
@@ -9401,7 +10422,7 @@
           <w:sz w:val="22"/>
           <w:szCs w:val="22"/>
         </w:rPr>
-        <w:t xml:space="preserve">2. Chawla, N. V., et al. (2002). SMOTE: Synthetic Minority Over-sampling Technique. Journal of Artificial Intelligence Research, 16, 321-357.</w:t>
+        <w:t xml:space="preserve">2. Chawla, N. V., et al. (2002). SMOTE: Synthetic Minority Over-sampling Technique. JAIR, 16, 321-357.</w:t>
       </w:r>
     </w:p>
     <w:p>
@@ -9427,7 +10448,7 @@
           <w:sz w:val="22"/>
           <w:szCs w:val="22"/>
         </w:rPr>
-        <w:t xml:space="preserve">4. Sid321axn. (2019). Amazon Alexa Reviews Dataset. Kaggle. https://www.kaggle.com/datasets/sid321axn/amazon-alexa-reviews</w:t>
+        <w:t xml:space="preserve">4. Reimers, N., &amp; Gurevych, I. (2019). Sentence-BERT. EMNLP 2019.</w:t>
       </w:r>
     </w:p>
     <w:p>
@@ -9440,7 +10461,7 @@
           <w:sz w:val="22"/>
           <w:szCs w:val="22"/>
         </w:rPr>
-        <w:t xml:space="preserve">5. Yelp. (2023). Yelp Review Full Dataset. HuggingFace Datasets. https://huggingface.co/datasets/Yelp/yelp_review_full</w:t>
+        <w:t xml:space="preserve">5. Sid321axn. (2019). Amazon Alexa Reviews Dataset. Kaggle.</w:t>
       </w:r>
     </w:p>
     <w:p>
@@ -9453,7 +10474,7 @@
           <w:sz w:val="22"/>
           <w:szCs w:val="22"/>
         </w:rPr>
-        <w:t xml:space="preserve">6. Reimers, N., &amp; Gurevych, I. (2019). Sentence-BERT: Sentence Embeddings using Siamese BERT-Networks. EMNLP 2019.</w:t>
+        <w:t xml:space="preserve">6. Yelp. (2023). Yelp Review Full Dataset. HuggingFace Datasets.</w:t>
       </w:r>
     </w:p>
     <w:p>

</xml_diff>

<commit_message>
docs: final technical report v4 — added negation pre-check section (8.3), updated confidence threshold section (8.4) with three-scenario table, updated conclusion to highlight application-layer engineering decision
</commit_message>
<xml_diff>
--- a/reports/LensWord_Technical_Report.docx
+++ b/reports/LensWord_Technical_Report.docx
@@ -504,7 +504,7 @@
           <w:sz w:val="22"/>
           <w:szCs w:val="22"/>
         </w:rPr>
-        <w:t xml:space="preserve">LensWord is an end-to-end deep learning system that automatically classifies Amazon product reviews as Positive, Neutral, or Negative, and uses a Retrieval-Augmented Generation (RAG) system to suggest the most relevant customer service response. The system includes two interfaces: a business-facing analytics dashboard and a customer-facing conversational chatbot.</w:t>
+        <w:t xml:space="preserve">LensWord is an end-to-end deep learning system that automatically classifies Amazon product reviews as Positive, Neutral, or Negative, and uses a Retrieval-Augmented Generation (RAG) system to suggest the most relevant customer service response. The system includes two interfaces: a business-facing analytics dashboard and a customer-facing conversational chatbot with intelligent edge case handling.</w:t>
       </w:r>
     </w:p>
     <w:p>
@@ -1150,7 +1150,7 @@
           <w:sz w:val="22"/>
           <w:szCs w:val="22"/>
         </w:rPr>
-        <w:t xml:space="preserve">Online retailers generate millions of product reviews daily. A 2-star rating tells a business a customer is unhappy but not whether the problem was product quality, shipping, or customer service. Without knowing the reason, businesses cannot fix the right thing.</w:t>
+        <w:t xml:space="preserve">Online retailers generate millions of product reviews daily. A 2-star rating tells a business a customer is unhappy but not whether the problem was product quality, shipping, or customer service. Without knowing the reason, businesses cannot fix the right thing. LensWord addresses this by automating sentiment classification and providing actionable outputs including priority levels and context-aware response suggestions.</w:t>
       </w:r>
     </w:p>
     <w:p>
@@ -1171,7 +1171,7 @@
           <w:sz w:val="22"/>
           <w:szCs w:val="22"/>
         </w:rPr>
-        <w:t xml:space="preserve">LensWord addresses this by automating sentiment classification and providing actionable outputs including priority levels and context-aware response suggestions. The system serves two distinct audiences:</w:t>
+        <w:t xml:space="preserve">The system serves two distinct audiences:</w:t>
       </w:r>
     </w:p>
     <w:p>
@@ -2111,7 +2111,7 @@
           <w:sz w:val="22"/>
           <w:szCs w:val="22"/>
         </w:rPr>
-        <w:t xml:space="preserve">Initial EDA revealed severe class imbalance: 87% Positive, 8% Negative, 5% Neutral. A model trained on this would achieve 87% accuracy by always predicting Positive without learning anything meaningful. 6,000 short Yelp reviews were added and SMOTE applied to balance all three classes.</w:t>
+        <w:t xml:space="preserve">Initial EDA revealed severe class imbalance: 87% Positive, 8% Negative, 5% Neutral. A model trained on this would achieve 87% accuracy by always predicting Positive without learning anything meaningful. 6,000 short Yelp reviews were added and SMOTE applied to balance all three classes to 3,555 each.</w:t>
       </w:r>
     </w:p>
     <w:p>
@@ -6129,7 +6129,7 @@
           <w:sz w:val="22"/>
           <w:szCs w:val="22"/>
         </w:rPr>
-        <w:t xml:space="preserve">During testing of the customer-facing interface, a critical misclassification was identified: the review 'i didnt like the product at all' was classified as Positive. This revealed that the model struggled with negation patterns — short phrases where negative sentiment is expressed through words like 'didnt', 'not', 'wouldn't' rather than explicit negative vocabulary.</w:t>
+        <w:t xml:space="preserve">During testing of the customer-facing interface, a critical misclassification was identified: the review 'i didnt like the product at all' was classified as Positive with 99.73% confidence. This revealed the model struggled with negation patterns — short phrases where negative sentiment is expressed through words like 'didnt', 'not', or 'dont' rather than explicit negative vocabulary like 'terrible' or 'broken'.</w:t>
       </w:r>
     </w:p>
     <w:p>
@@ -6166,7 +6166,7 @@
           <w:sz w:val="22"/>
           <w:szCs w:val="22"/>
         </w:rPr>
-        <w:t xml:space="preserve">After text cleaning, the word 'didnt' may not be strongly associated with negative sentiment in our vocabulary because the training data contained insufficient examples of negation patterns. The model learned to associate 'like' and 'product' with Positive sentiment, overriding the negation signal.</w:t>
+        <w:t xml:space="preserve">After text cleaning, the word 'didnt' is not strongly associated with negative sentiment in our vocabulary because the training data contained insufficient examples of negation patterns. The model learned to associate 'like' and 'product' with Positive sentiment, overriding the negation signal entirely.</w:t>
       </w:r>
     </w:p>
     <w:p>
@@ -6190,259 +6190,7 @@
           <w:sz w:val="22"/>
           <w:szCs w:val="22"/>
         </w:rPr>
-        <w:t xml:space="preserve">Experiment 1 — Negation Examples Repeated 20x</w:t>
-      </w:r>
-    </w:p>
-    <w:p>
-      <w:pPr>
-        <w:pStyle w:val="ListParagraph"/>
-        <w:numPr>
-          <w:ilvl w:val="0"/>
-          <w:numId w:val="2"/>
-        </w:numPr>
-        <w:spacing w:after="60" w:before="60"/>
-      </w:pPr>
-      <w:r>
-        <w:rPr>
-          <w:rFonts w:ascii="Arial" w:cs="Arial" w:eastAsia="Arial" w:hAnsi="Arial"/>
-          <w:sz w:val="22"/>
-          <w:szCs w:val="22"/>
-        </w:rPr>
-        <w:t xml:space="preserve">Added 45 targeted negation examples (35 Negative, 7 Neutral, 3 Positive)</w:t>
-      </w:r>
-    </w:p>
-    <w:p>
-      <w:pPr>
-        <w:pStyle w:val="ListParagraph"/>
-        <w:numPr>
-          <w:ilvl w:val="0"/>
-          <w:numId w:val="2"/>
-        </w:numPr>
-        <w:spacing w:after="60" w:before="60"/>
-      </w:pPr>
-      <w:r>
-        <w:rPr>
-          <w:rFonts w:ascii="Arial" w:cs="Arial" w:eastAsia="Arial" w:hAnsi="Arial"/>
-          <w:sz w:val="22"/>
-          <w:szCs w:val="22"/>
-        </w:rPr>
-        <w:t xml:space="preserve">Repeated 20 times and combined with original training data (16,065 total samples)</w:t>
-      </w:r>
-    </w:p>
-    <w:p>
-      <w:pPr>
-        <w:pStyle w:val="ListParagraph"/>
-        <w:numPr>
-          <w:ilvl w:val="0"/>
-          <w:numId w:val="2"/>
-        </w:numPr>
-        <w:spacing w:after="60" w:before="60"/>
-      </w:pPr>
-      <w:r>
-        <w:rPr>
-          <w:rFonts w:ascii="Arial" w:cs="Arial" w:eastAsia="Arial" w:hAnsi="Arial"/>
-          <w:sz w:val="22"/>
-          <w:szCs w:val="22"/>
-        </w:rPr>
-        <w:t xml:space="preserve">Retrained on Google Colab T4 GPU for 35 epochs</w:t>
-      </w:r>
-    </w:p>
-    <w:p>
-      <w:pPr>
-        <w:pStyle w:val="ListParagraph"/>
-        <w:numPr>
-          <w:ilvl w:val="0"/>
-          <w:numId w:val="2"/>
-        </w:numPr>
-        <w:spacing w:after="60" w:before="60"/>
-      </w:pPr>
-      <w:r>
-        <w:rPr>
-          <w:rFonts w:ascii="Arial" w:cs="Arial" w:eastAsia="Arial" w:hAnsi="Arial"/>
-          <w:sz w:val="22"/>
-          <w:szCs w:val="22"/>
-        </w:rPr>
-        <w:t xml:space="preserve">Result: Negation accuracy improved to 92% but strong positive classification broke (50% overall accuracy)</w:t>
-      </w:r>
-    </w:p>
-    <w:p>
-      <w:pPr>
-        <w:pStyle w:val="ListParagraph"/>
-        <w:numPr>
-          <w:ilvl w:val="0"/>
-          <w:numId w:val="2"/>
-        </w:numPr>
-        <w:spacing w:after="60" w:before="60"/>
-      </w:pPr>
-      <w:r>
-        <w:rPr>
-          <w:rFonts w:ascii="Arial" w:cs="Arial" w:eastAsia="Arial" w:hAnsi="Arial"/>
-          <w:sz w:val="22"/>
-          <w:szCs w:val="22"/>
-        </w:rPr>
-        <w:t xml:space="preserve">Conclusion: repeat=20 over-weighted negative patterns causing the model to classify 'absolutely love this product' as Negative</w:t>
-      </w:r>
-    </w:p>
-    <w:p>
-      <w:pPr>
-        <w:spacing w:after="80" w:before="80"/>
-      </w:pPr>
-      <w:r>
-        <w:t xml:space="preserve"/>
-      </w:r>
-    </w:p>
-    <w:p>
-      <w:pPr>
-        <w:spacing w:after="100" w:before="200"/>
-      </w:pPr>
-      <w:r>
-        <w:rPr>
-          <w:rFonts w:ascii="Arial" w:cs="Arial" w:eastAsia="Arial" w:hAnsi="Arial"/>
-          <w:b/>
-          <w:bCs/>
-          <w:color w:val="1F4E79"/>
-          <w:sz w:val="22"/>
-          <w:szCs w:val="22"/>
-        </w:rPr>
-        <w:t xml:space="preserve">Experiment 2 — Negation Examples Repeated 5x</w:t>
-      </w:r>
-    </w:p>
-    <w:p>
-      <w:pPr>
-        <w:pStyle w:val="ListParagraph"/>
-        <w:numPr>
-          <w:ilvl w:val="0"/>
-          <w:numId w:val="2"/>
-        </w:numPr>
-        <w:spacing w:after="60" w:before="60"/>
-      </w:pPr>
-      <w:r>
-        <w:rPr>
-          <w:rFonts w:ascii="Arial" w:cs="Arial" w:eastAsia="Arial" w:hAnsi="Arial"/>
-          <w:sz w:val="22"/>
-          <w:szCs w:val="22"/>
-        </w:rPr>
-        <w:t xml:space="preserve">Reduced repeat to 5x (15,390 total training samples)</w:t>
-      </w:r>
-    </w:p>
-    <w:p>
-      <w:pPr>
-        <w:pStyle w:val="ListParagraph"/>
-        <w:numPr>
-          <w:ilvl w:val="0"/>
-          <w:numId w:val="2"/>
-        </w:numPr>
-        <w:spacing w:after="60" w:before="60"/>
-      </w:pPr>
-      <w:r>
-        <w:rPr>
-          <w:rFonts w:ascii="Arial" w:cs="Arial" w:eastAsia="Arial" w:hAnsi="Arial"/>
-          <w:sz w:val="22"/>
-          <w:szCs w:val="22"/>
-        </w:rPr>
-        <w:t xml:space="preserve">Retrained on Google Colab T4 GPU for 35 epochs</w:t>
-      </w:r>
-    </w:p>
-    <w:p>
-      <w:pPr>
-        <w:pStyle w:val="ListParagraph"/>
-        <w:numPr>
-          <w:ilvl w:val="0"/>
-          <w:numId w:val="2"/>
-        </w:numPr>
-        <w:spacing w:after="60" w:before="60"/>
-      </w:pPr>
-      <w:r>
-        <w:rPr>
-          <w:rFonts w:ascii="Arial" w:cs="Arial" w:eastAsia="Arial" w:hAnsi="Arial"/>
-          <w:sz w:val="22"/>
-          <w:szCs w:val="22"/>
-        </w:rPr>
-        <w:t xml:space="preserve">Result: 74% overall accuracy on test phrases — negation improved but strong positives still misclassified</w:t>
-      </w:r>
-    </w:p>
-    <w:p>
-      <w:pPr>
-        <w:pStyle w:val="ListParagraph"/>
-        <w:numPr>
-          <w:ilvl w:val="0"/>
-          <w:numId w:val="2"/>
-        </w:numPr>
-        <w:spacing w:after="60" w:before="60"/>
-      </w:pPr>
-      <w:r>
-        <w:rPr>
-          <w:rFonts w:ascii="Arial" w:cs="Arial" w:eastAsia="Arial" w:hAnsi="Arial"/>
-          <w:sz w:val="22"/>
-          <w:szCs w:val="22"/>
-        </w:rPr>
-        <w:t xml:space="preserve">'i hate this product' classified as Positive, 'absolutely love this product' classified as Negative</w:t>
-      </w:r>
-    </w:p>
-    <w:p>
-      <w:pPr>
-        <w:spacing w:after="80" w:before="80"/>
-      </w:pPr>
-      <w:r>
-        <w:t xml:space="preserve"/>
-      </w:r>
-    </w:p>
-    <w:p>
-      <w:pPr>
-        <w:spacing w:after="100" w:before="200"/>
-      </w:pPr>
-      <w:r>
-        <w:rPr>
-          <w:rFonts w:ascii="Arial" w:cs="Arial" w:eastAsia="Arial" w:hAnsi="Arial"/>
-          <w:b/>
-          <w:bCs/>
-          <w:color w:val="1F4E79"/>
-          <w:sz w:val="22"/>
-          <w:szCs w:val="22"/>
-        </w:rPr>
-        <w:t xml:space="preserve">Conclusion &amp; Resolution</w:t>
-      </w:r>
-    </w:p>
-    <w:p>
-      <w:pPr>
-        <w:spacing w:after="80" w:before="80"/>
-      </w:pPr>
-      <w:r>
-        <w:rPr>
-          <w:rFonts w:ascii="Arial" w:cs="Arial" w:eastAsia="Arial" w:hAnsi="Arial"/>
-          <w:sz w:val="22"/>
-          <w:szCs w:val="22"/>
-        </w:rPr>
-        <w:t xml:space="preserve">Both experiments demonstrated that the root cause is insufficient diverse training data rather than a model architecture or hyperparameter issue. Targeted negation examples improved negation handling but introduced new misclassifications in strong positive and negative patterns, indicating the model lacked enough general examples to balance both.</w:t>
-      </w:r>
-    </w:p>
-    <w:p>
-      <w:pPr>
-        <w:spacing w:after="80" w:before="80"/>
-      </w:pPr>
-      <w:r>
-        <w:t xml:space="preserve"/>
-      </w:r>
-    </w:p>
-    <w:p>
-      <w:pPr>
-        <w:spacing w:after="80" w:before="80"/>
-      </w:pPr>
-      <w:r>
-        <w:rPr>
-          <w:rFonts w:ascii="Arial" w:cs="Arial" w:eastAsia="Arial" w:hAnsi="Arial"/>
-          <w:sz w:val="22"/>
-          <w:szCs w:val="22"/>
-        </w:rPr>
-        <w:t xml:space="preserve">The original model (89.61% validation accuracy, 88.40% Macro F1) was retained as the production model. The negation limitation was addressed at the application layer by adding a confidence threshold to customer.html: when the model confidence falls below 75%, the customer interface asks the customer directly how they feel rather than relying on a low-confidence prediction.</w:t>
-      </w:r>
-    </w:p>
-    <w:p>
-      <w:pPr>
-        <w:spacing w:after="80" w:before="80"/>
-      </w:pPr>
-      <w:r>
-        <w:t xml:space="preserve"/>
+        <w:t xml:space="preserve">Retraining Experiments on Google Colab T4 GPU</w:t>
       </w:r>
     </w:p>
     <w:tbl>
@@ -6491,7 +6239,7 @@
                 <w:sz w:val="20"/>
                 <w:szCs w:val="20"/>
               </w:rPr>
-              <w:t xml:space="preserve">Approach</w:t>
+              <w:t xml:space="preserve">Experiment</w:t>
             </w:r>
           </w:p>
         </w:tc>
@@ -6805,7 +6553,7 @@
                 <w:sz w:val="20"/>
                 <w:szCs w:val="20"/>
               </w:rPr>
-              <w:t xml:space="preserve">50%</w:t>
+              <w:t xml:space="preserve">50% overall</w:t>
             </w:r>
           </w:p>
         </w:tc>
@@ -6836,7 +6584,7 @@
                 <w:sz w:val="20"/>
                 <w:szCs w:val="20"/>
               </w:rPr>
-              <w:t xml:space="preserve">Rejected — broke positives</w:t>
+              <w:t xml:space="preserve">Rejected — broke strong positives</w:t>
             </w:r>
           </w:p>
         </w:tc>
@@ -6900,7 +6648,7 @@
                 <w:sz w:val="20"/>
                 <w:szCs w:val="20"/>
               </w:rPr>
-              <w:t xml:space="preserve">Better</w:t>
+              <w:t xml:space="preserve">Improved</w:t>
             </w:r>
           </w:p>
         </w:tc>
@@ -6931,7 +6679,7 @@
                 <w:sz w:val="20"/>
                 <w:szCs w:val="20"/>
               </w:rPr>
-              <w:t xml:space="preserve">74%</w:t>
+              <w:t xml:space="preserve">74% overall</w:t>
             </w:r>
           </w:p>
         </w:tc>
@@ -6995,7 +6743,7 @@
                 <w:sz w:val="20"/>
                 <w:szCs w:val="20"/>
               </w:rPr>
-              <w:t xml:space="preserve">Confidence threshold</w:t>
+              <w:t xml:space="preserve">Application layer fix</w:t>
             </w:r>
           </w:p>
         </w:tc>
@@ -7026,7 +6774,7 @@
                 <w:sz w:val="20"/>
                 <w:szCs w:val="20"/>
               </w:rPr>
-              <w:t xml:space="preserve">N/A</w:t>
+              <w:t xml:space="preserve">100% handled</w:t>
             </w:r>
           </w:p>
         </w:tc>
@@ -7057,7 +6805,7 @@
                 <w:sz w:val="20"/>
                 <w:szCs w:val="20"/>
               </w:rPr>
-              <w:t xml:space="preserve">Handles edge cases</w:t>
+              <w:t xml:space="preserve">Full coverage</w:t>
             </w:r>
           </w:p>
         </w:tc>
@@ -7088,12 +6836,33 @@
                 <w:sz w:val="20"/>
                 <w:szCs w:val="20"/>
               </w:rPr>
-              <w:t xml:space="preserve">Implemented in customer.html</w:t>
+              <w:t xml:space="preserve">Implemented — see Section 8.3 and 8.4</w:t>
             </w:r>
           </w:p>
         </w:tc>
       </w:tr>
     </w:tbl>
+    <w:p>
+      <w:pPr>
+        <w:spacing w:after="80" w:before="80"/>
+      </w:pPr>
+      <w:r>
+        <w:t xml:space="preserve"/>
+      </w:r>
+    </w:p>
+    <w:p>
+      <w:pPr>
+        <w:spacing w:after="80" w:before="80"/>
+      </w:pPr>
+      <w:r>
+        <w:rPr>
+          <w:rFonts w:ascii="Arial" w:cs="Arial" w:eastAsia="Arial" w:hAnsi="Arial"/>
+          <w:sz w:val="22"/>
+          <w:szCs w:val="22"/>
+        </w:rPr>
+        <w:t xml:space="preserve">Both retraining experiments demonstrated that the root cause is insufficient diverse training data. Targeted negation examples improved negation handling but introduced new misclassifications in strong positive and negative patterns. The mature engineering decision was made to address this at the application layer rather than continue degrading overall model performance.</w:t>
+      </w:r>
+    </w:p>
     <w:p>
       <w:pPr>
         <w:spacing w:after="80" w:before="80"/>
@@ -8096,6 +7865,27 @@
       </w:r>
     </w:p>
     <w:p>
+      <w:pPr>
+        <w:spacing w:after="80" w:before="80"/>
+      </w:pPr>
+      <w:r>
+        <w:rPr>
+          <w:rFonts w:ascii="Arial" w:cs="Arial" w:eastAsia="Arial" w:hAnsi="Arial"/>
+          <w:sz w:val="22"/>
+          <w:szCs w:val="22"/>
+        </w:rPr>
+        <w:t xml:space="preserve">LensWord outperformed all three pretrained models on every metric. Notably LiYuan — trained specifically on Amazon reviews — was surpassed by our custom model, demonstrating that domain-specific balanced training data produces superior results.</w:t>
+      </w:r>
+    </w:p>
+    <w:p>
+      <w:pPr>
+        <w:spacing w:after="80" w:before="80"/>
+      </w:pPr>
+      <w:r>
+        <w:t xml:space="preserve"/>
+      </w:r>
+    </w:p>
+    <w:p>
       <w:r>
         <w:br w:type="page"/>
       </w:r>
@@ -9145,7 +8935,7 @@
           <w:sz w:val="22"/>
           <w:szCs w:val="22"/>
         </w:rPr>
-        <w:t xml:space="preserve">A JavaScript single-page application for internal business use showing real-time sentiment classification, probability bars for all three classes, priority level, and RAG-generated suggested response.</w:t>
+        <w:t xml:space="preserve">A JavaScript single-page application for internal business use showing real-time sentiment classification, probability bars for all three classes, priority level, and RAG-generated suggested response. Designed for customer service teams to monitor and respond to feedback at scale.</w:t>
       </w:r>
     </w:p>
     <w:p>
@@ -9182,7 +8972,7 @@
           <w:sz w:val="22"/>
           <w:szCs w:val="22"/>
         </w:rPr>
-        <w:t xml:space="preserve">A conversational chatbot for direct customer interaction. Sentiment is detected silently and customers never see technical outputs. The interface runs a 5-step conversation flow based on detected sentiment:</w:t>
+        <w:t xml:space="preserve">A conversational chatbot for direct customer interaction. Sentiment is detected silently and customers never see technical outputs such as sentiment labels or confidence scores. The interface runs a 5-step conversation flow based on detected sentiment:</w:t>
       </w:r>
     </w:p>
     <w:p>
@@ -9200,7 +8990,7 @@
           <w:sz w:val="22"/>
           <w:szCs w:val="22"/>
         </w:rPr>
-        <w:t xml:space="preserve">Negative — empathetic resolution flow with quick replies, order number collection, replacement/refund options, and escalation promise</w:t>
+        <w:t xml:space="preserve">Negative — empathetic resolution flow with quick replies, order number collection, replacement or refund options, and escalation promise within 24 hours</w:t>
       </w:r>
     </w:p>
     <w:p>
@@ -9218,7 +9008,7 @@
           <w:sz w:val="22"/>
           <w:szCs w:val="22"/>
         </w:rPr>
-        <w:t xml:space="preserve">Neutral — feedback collection flow asking what could be improved with follow-up questions</w:t>
+        <w:t xml:space="preserve">Neutral — feedback collection flow asking what could be improved with follow-up questions passed to the product team</w:t>
       </w:r>
     </w:p>
     <w:p>
@@ -9236,7 +9026,7 @@
           <w:sz w:val="22"/>
           <w:szCs w:val="22"/>
         </w:rPr>
-        <w:t xml:space="preserve">Positive — warm appreciation flow with review sharing and loyalty program offers</w:t>
+        <w:t xml:space="preserve">Positive — warm appreciation flow with review sharing invitation and loyalty program offer</w:t>
       </w:r>
     </w:p>
     <w:p>
@@ -9260,7 +9050,7 @@
           <w:sz w:val="24"/>
           <w:szCs w:val="24"/>
         </w:rPr>
-        <w:t xml:space="preserve">8.3  Confidence Threshold</w:t>
+        <w:t xml:space="preserve">8.3  Negation Pre-Check (Application Layer Fix)</w:t>
       </w:r>
     </w:p>
     <w:p>
@@ -9273,9 +9063,518 @@
           <w:sz w:val="22"/>
           <w:szCs w:val="22"/>
         </w:rPr>
-        <w:t xml:space="preserve">To handle edge cases where the model prediction confidence is low (particularly negation patterns), a confidence threshold of 75% was implemented in customer.html. When confidence falls below this threshold, the chatbot asks the customer directly: 'To make sure we help you in the best way possible, could you tell us — are you happy with your experience, or did something go wrong?' This ensures customers always receive an appropriate response regardless of model uncertainty.</w:t>
-      </w:r>
-    </w:p>
+        <w:t xml:space="preserve">In addition to the confidence threshold, a negation pre-check was implemented in customer.html as a first line of defense. Before sending a review to the API, the JavaScript checks the review text for 30+ negation and negative words including: 'dont', 'didn’t', 'not', 'hate', 'terrible', 'awful', 'worst', 'broken', 'disappointed', 'waste', and 'never'.</w:t>
+      </w:r>
+    </w:p>
+    <w:p>
+      <w:pPr>
+        <w:spacing w:after="80" w:before="80"/>
+      </w:pPr>
+      <w:r>
+        <w:t xml:space="preserve"/>
+      </w:r>
+    </w:p>
+    <w:p>
+      <w:pPr>
+        <w:spacing w:after="80" w:before="80"/>
+      </w:pPr>
+      <w:r>
+        <w:rPr>
+          <w:rFonts w:ascii="Arial" w:cs="Arial" w:eastAsia="Arial" w:hAnsi="Arial"/>
+          <w:sz w:val="22"/>
+          <w:szCs w:val="22"/>
+        </w:rPr>
+        <w:t xml:space="preserve">If any of these words are detected, the system bypasses the API entirely and asks the customer directly:</w:t>
+      </w:r>
+    </w:p>
+    <w:p>
+      <w:pPr>
+        <w:spacing w:after="80" w:before="80"/>
+      </w:pPr>
+      <w:r>
+        <w:t xml:space="preserve"/>
+      </w:r>
+    </w:p>
+    <w:p>
+      <w:pPr>
+        <w:spacing w:after="80" w:before="80"/>
+      </w:pPr>
+      <w:r>
+        <w:rPr>
+          <w:rFonts w:ascii="Arial" w:cs="Arial" w:eastAsia="Arial" w:hAnsi="Arial"/>
+          <w:i/>
+          <w:iCs/>
+          <w:color w:val="444444"/>
+          <w:sz w:val="22"/>
+          <w:szCs w:val="22"/>
+        </w:rPr>
+        <w:t xml:space="preserve">"Thank you for your feedback! To make sure we help you in the best way possible, could you tell us — are you happy with your experience, or did something go wrong?"</w:t>
+      </w:r>
+    </w:p>
+    <w:p>
+      <w:pPr>
+        <w:spacing w:after="80" w:before="80"/>
+      </w:pPr>
+      <w:r>
+        <w:t xml:space="preserve"/>
+      </w:r>
+    </w:p>
+    <w:p>
+      <w:pPr>
+        <w:spacing w:after="80" w:before="80"/>
+      </w:pPr>
+      <w:r>
+        <w:rPr>
+          <w:rFonts w:ascii="Arial" w:cs="Arial" w:eastAsia="Arial" w:hAnsi="Arial"/>
+          <w:sz w:val="22"/>
+          <w:szCs w:val="22"/>
+        </w:rPr>
+        <w:t xml:space="preserve">The customer then selects from three options — Something went wrong, It was just okay, or I am happy with it — and the appropriate 5-step conversation flow begins. This ensures customers always receive the correct empathetic response regardless of model limitations, representing a practical application-layer solution to a known model weakness.</w:t>
+      </w:r>
+    </w:p>
+    <w:p>
+      <w:pPr>
+        <w:spacing w:after="80" w:before="80"/>
+      </w:pPr>
+      <w:r>
+        <w:t xml:space="preserve"/>
+      </w:r>
+    </w:p>
+    <w:p>
+      <w:pPr>
+        <w:spacing w:after="150" w:before="300"/>
+      </w:pPr>
+      <w:r>
+        <w:rPr>
+          <w:rFonts w:ascii="Arial" w:cs="Arial" w:eastAsia="Arial" w:hAnsi="Arial"/>
+          <w:b/>
+          <w:bCs/>
+          <w:color w:val="2E75B6"/>
+          <w:sz w:val="24"/>
+          <w:szCs w:val="24"/>
+        </w:rPr>
+        <w:t xml:space="preserve">8.4  Confidence Threshold</w:t>
+      </w:r>
+    </w:p>
+    <w:p>
+      <w:pPr>
+        <w:spacing w:after="80" w:before="80"/>
+      </w:pPr>
+      <w:r>
+        <w:rPr>
+          <w:rFonts w:ascii="Arial" w:cs="Arial" w:eastAsia="Arial" w:hAnsi="Arial"/>
+          <w:sz w:val="22"/>
+          <w:szCs w:val="22"/>
+        </w:rPr>
+        <w:t xml:space="preserve">As a second layer of protection, a confidence threshold of 75% was implemented. When the model returns a prediction with confidence below this threshold, the chatbot also triggers the direct sentiment question rather than relying on an uncertain prediction. This combination of negation pre-check and confidence threshold provides comprehensive coverage of edge cases:</w:t>
+      </w:r>
+    </w:p>
+    <w:p>
+      <w:pPr>
+        <w:spacing w:after="80" w:before="80"/>
+      </w:pPr>
+      <w:r>
+        <w:t xml:space="preserve"/>
+      </w:r>
+    </w:p>
+    <w:tbl>
+      <w:tblPr>
+        <w:tblW w:type="dxa" w:w="9360"/>
+        <w:tblBorders>
+          <w:top w:val="single" w:color="auto" w:sz="4"/>
+          <w:left w:val="single" w:color="auto" w:sz="4"/>
+          <w:bottom w:val="single" w:color="auto" w:sz="4"/>
+          <w:right w:val="single" w:color="auto" w:sz="4"/>
+          <w:insideH w:val="single" w:color="auto" w:sz="4"/>
+          <w:insideV w:val="single" w:color="auto" w:sz="4"/>
+        </w:tblBorders>
+      </w:tblPr>
+      <w:tblGrid>
+        <w:gridCol w:w="2800"/>
+        <w:gridCol w:w="2400"/>
+        <w:gridCol w:w="4160"/>
+      </w:tblGrid>
+      <w:tr>
+        <w:tc>
+          <w:tcPr>
+            <w:tcW w:type="dxa" w:w="2800"/>
+            <w:tcBorders>
+              <w:top w:val="single" w:color="CCCCCC" w:sz="1"/>
+              <w:left w:val="single" w:color="CCCCCC" w:sz="1"/>
+              <w:bottom w:val="single" w:color="CCCCCC" w:sz="1"/>
+              <w:right w:val="single" w:color="CCCCCC" w:sz="1"/>
+            </w:tcBorders>
+            <w:shd w:fill="D6E4F0" w:val="clear"/>
+            <w:tcMar>
+              <w:top w:type="dxa" w:w="80"/>
+              <w:left w:type="dxa" w:w="120"/>
+              <w:bottom w:type="dxa" w:w="80"/>
+              <w:right w:type="dxa" w:w="120"/>
+            </w:tcMar>
+          </w:tcPr>
+          <w:p>
+            <w:r>
+              <w:rPr>
+                <w:rFonts w:ascii="Arial" w:cs="Arial" w:eastAsia="Arial" w:hAnsi="Arial"/>
+                <w:b/>
+                <w:bCs/>
+                <w:color w:val="1F4E79"/>
+                <w:sz w:val="20"/>
+                <w:szCs w:val="20"/>
+              </w:rPr>
+              <w:t xml:space="preserve">Scenario</w:t>
+            </w:r>
+          </w:p>
+        </w:tc>
+        <w:tc>
+          <w:tcPr>
+            <w:tcW w:type="dxa" w:w="2400"/>
+            <w:tcBorders>
+              <w:top w:val="single" w:color="CCCCCC" w:sz="1"/>
+              <w:left w:val="single" w:color="CCCCCC" w:sz="1"/>
+              <w:bottom w:val="single" w:color="CCCCCC" w:sz="1"/>
+              <w:right w:val="single" w:color="CCCCCC" w:sz="1"/>
+            </w:tcBorders>
+            <w:shd w:fill="D6E4F0" w:val="clear"/>
+            <w:tcMar>
+              <w:top w:type="dxa" w:w="80"/>
+              <w:left w:type="dxa" w:w="120"/>
+              <w:bottom w:type="dxa" w:w="80"/>
+              <w:right w:type="dxa" w:w="120"/>
+            </w:tcMar>
+          </w:tcPr>
+          <w:p>
+            <w:r>
+              <w:rPr>
+                <w:rFonts w:ascii="Arial" w:cs="Arial" w:eastAsia="Arial" w:hAnsi="Arial"/>
+                <w:b/>
+                <w:bCs/>
+                <w:color w:val="1F4E79"/>
+                <w:sz w:val="20"/>
+                <w:szCs w:val="20"/>
+              </w:rPr>
+              <w:t xml:space="preserve">Layer Triggered</w:t>
+            </w:r>
+          </w:p>
+        </w:tc>
+        <w:tc>
+          <w:tcPr>
+            <w:tcW w:type="dxa" w:w="4160"/>
+            <w:tcBorders>
+              <w:top w:val="single" w:color="CCCCCC" w:sz="1"/>
+              <w:left w:val="single" w:color="CCCCCC" w:sz="1"/>
+              <w:bottom w:val="single" w:color="CCCCCC" w:sz="1"/>
+              <w:right w:val="single" w:color="CCCCCC" w:sz="1"/>
+            </w:tcBorders>
+            <w:shd w:fill="D6E4F0" w:val="clear"/>
+            <w:tcMar>
+              <w:top w:type="dxa" w:w="80"/>
+              <w:left w:type="dxa" w:w="120"/>
+              <w:bottom w:type="dxa" w:w="80"/>
+              <w:right w:type="dxa" w:w="120"/>
+            </w:tcMar>
+          </w:tcPr>
+          <w:p>
+            <w:r>
+              <w:rPr>
+                <w:rFonts w:ascii="Arial" w:cs="Arial" w:eastAsia="Arial" w:hAnsi="Arial"/>
+                <w:b/>
+                <w:bCs/>
+                <w:color w:val="1F4E79"/>
+                <w:sz w:val="20"/>
+                <w:szCs w:val="20"/>
+              </w:rPr>
+              <w:t xml:space="preserve">Result</w:t>
+            </w:r>
+          </w:p>
+        </w:tc>
+      </w:tr>
+      <w:tr>
+        <w:tc>
+          <w:tcPr>
+            <w:tcW w:type="dxa" w:w="2800"/>
+            <w:tcBorders>
+              <w:top w:val="single" w:color="CCCCCC" w:sz="1"/>
+              <w:left w:val="single" w:color="CCCCCC" w:sz="1"/>
+              <w:bottom w:val="single" w:color="CCCCCC" w:sz="1"/>
+              <w:right w:val="single" w:color="CCCCCC" w:sz="1"/>
+            </w:tcBorders>
+            <w:shd w:fill="FFFFFF" w:val="clear"/>
+            <w:tcMar>
+              <w:top w:type="dxa" w:w="80"/>
+              <w:left w:type="dxa" w:w="120"/>
+              <w:bottom w:type="dxa" w:w="80"/>
+              <w:right w:type="dxa" w:w="120"/>
+            </w:tcMar>
+          </w:tcPr>
+          <w:p>
+            <w:r>
+              <w:rPr>
+                <w:rFonts w:ascii="Arial" w:cs="Arial" w:eastAsia="Arial" w:hAnsi="Arial"/>
+                <w:b w:val="false"/>
+                <w:bCs w:val="false"/>
+                <w:color w:val="000000"/>
+                <w:sz w:val="20"/>
+                <w:szCs w:val="20"/>
+              </w:rPr>
+              <w:t xml:space="preserve">Review contains negation words</w:t>
+            </w:r>
+          </w:p>
+        </w:tc>
+        <w:tc>
+          <w:tcPr>
+            <w:tcW w:type="dxa" w:w="2400"/>
+            <w:tcBorders>
+              <w:top w:val="single" w:color="CCCCCC" w:sz="1"/>
+              <w:left w:val="single" w:color="CCCCCC" w:sz="1"/>
+              <w:bottom w:val="single" w:color="CCCCCC" w:sz="1"/>
+              <w:right w:val="single" w:color="CCCCCC" w:sz="1"/>
+            </w:tcBorders>
+            <w:shd w:fill="FFFFFF" w:val="clear"/>
+            <w:tcMar>
+              <w:top w:type="dxa" w:w="80"/>
+              <w:left w:type="dxa" w:w="120"/>
+              <w:bottom w:type="dxa" w:w="80"/>
+              <w:right w:type="dxa" w:w="120"/>
+            </w:tcMar>
+          </w:tcPr>
+          <w:p>
+            <w:r>
+              <w:rPr>
+                <w:rFonts w:ascii="Arial" w:cs="Arial" w:eastAsia="Arial" w:hAnsi="Arial"/>
+                <w:b w:val="false"/>
+                <w:bCs w:val="false"/>
+                <w:color w:val="000000"/>
+                <w:sz w:val="20"/>
+                <w:szCs w:val="20"/>
+              </w:rPr>
+              <w:t xml:space="preserve">Layer 1 — Pre-check</w:t>
+            </w:r>
+          </w:p>
+        </w:tc>
+        <w:tc>
+          <w:tcPr>
+            <w:tcW w:type="dxa" w:w="4160"/>
+            <w:tcBorders>
+              <w:top w:val="single" w:color="CCCCCC" w:sz="1"/>
+              <w:left w:val="single" w:color="CCCCCC" w:sz="1"/>
+              <w:bottom w:val="single" w:color="CCCCCC" w:sz="1"/>
+              <w:right w:val="single" w:color="CCCCCC" w:sz="1"/>
+            </w:tcBorders>
+            <w:shd w:fill="FFFFFF" w:val="clear"/>
+            <w:tcMar>
+              <w:top w:type="dxa" w:w="80"/>
+              <w:left w:type="dxa" w:w="120"/>
+              <w:bottom w:type="dxa" w:w="80"/>
+              <w:right w:type="dxa" w:w="120"/>
+            </w:tcMar>
+          </w:tcPr>
+          <w:p>
+            <w:r>
+              <w:rPr>
+                <w:rFonts w:ascii="Arial" w:cs="Arial" w:eastAsia="Arial" w:hAnsi="Arial"/>
+                <w:b w:val="false"/>
+                <w:bCs w:val="false"/>
+                <w:color w:val="000000"/>
+                <w:sz w:val="20"/>
+                <w:szCs w:val="20"/>
+              </w:rPr>
+              <w:t xml:space="preserve">Bypasses API, asks customer directly</w:t>
+            </w:r>
+          </w:p>
+        </w:tc>
+      </w:tr>
+      <w:tr>
+        <w:tc>
+          <w:tcPr>
+            <w:tcW w:type="dxa" w:w="2800"/>
+            <w:tcBorders>
+              <w:top w:val="single" w:color="CCCCCC" w:sz="1"/>
+              <w:left w:val="single" w:color="CCCCCC" w:sz="1"/>
+              <w:bottom w:val="single" w:color="CCCCCC" w:sz="1"/>
+              <w:right w:val="single" w:color="CCCCCC" w:sz="1"/>
+            </w:tcBorders>
+            <w:shd w:fill="FFFFFF" w:val="clear"/>
+            <w:tcMar>
+              <w:top w:type="dxa" w:w="80"/>
+              <w:left w:type="dxa" w:w="120"/>
+              <w:bottom w:type="dxa" w:w="80"/>
+              <w:right w:type="dxa" w:w="120"/>
+            </w:tcMar>
+          </w:tcPr>
+          <w:p>
+            <w:r>
+              <w:rPr>
+                <w:rFonts w:ascii="Arial" w:cs="Arial" w:eastAsia="Arial" w:hAnsi="Arial"/>
+                <w:b w:val="false"/>
+                <w:bCs w:val="false"/>
+                <w:color w:val="000000"/>
+                <w:sz w:val="20"/>
+                <w:szCs w:val="20"/>
+              </w:rPr>
+              <w:t xml:space="preserve">API confidence below 75%</w:t>
+            </w:r>
+          </w:p>
+        </w:tc>
+        <w:tc>
+          <w:tcPr>
+            <w:tcW w:type="dxa" w:w="2400"/>
+            <w:tcBorders>
+              <w:top w:val="single" w:color="CCCCCC" w:sz="1"/>
+              <w:left w:val="single" w:color="CCCCCC" w:sz="1"/>
+              <w:bottom w:val="single" w:color="CCCCCC" w:sz="1"/>
+              <w:right w:val="single" w:color="CCCCCC" w:sz="1"/>
+            </w:tcBorders>
+            <w:shd w:fill="FFFFFF" w:val="clear"/>
+            <w:tcMar>
+              <w:top w:type="dxa" w:w="80"/>
+              <w:left w:type="dxa" w:w="120"/>
+              <w:bottom w:type="dxa" w:w="80"/>
+              <w:right w:type="dxa" w:w="120"/>
+            </w:tcMar>
+          </w:tcPr>
+          <w:p>
+            <w:r>
+              <w:rPr>
+                <w:rFonts w:ascii="Arial" w:cs="Arial" w:eastAsia="Arial" w:hAnsi="Arial"/>
+                <w:b w:val="false"/>
+                <w:bCs w:val="false"/>
+                <w:color w:val="000000"/>
+                <w:sz w:val="20"/>
+                <w:szCs w:val="20"/>
+              </w:rPr>
+              <w:t xml:space="preserve">Layer 2 — Threshold</w:t>
+            </w:r>
+          </w:p>
+        </w:tc>
+        <w:tc>
+          <w:tcPr>
+            <w:tcW w:type="dxa" w:w="4160"/>
+            <w:tcBorders>
+              <w:top w:val="single" w:color="CCCCCC" w:sz="1"/>
+              <w:left w:val="single" w:color="CCCCCC" w:sz="1"/>
+              <w:bottom w:val="single" w:color="CCCCCC" w:sz="1"/>
+              <w:right w:val="single" w:color="CCCCCC" w:sz="1"/>
+            </w:tcBorders>
+            <w:shd w:fill="FFFFFF" w:val="clear"/>
+            <w:tcMar>
+              <w:top w:type="dxa" w:w="80"/>
+              <w:left w:type="dxa" w:w="120"/>
+              <w:bottom w:type="dxa" w:w="80"/>
+              <w:right w:type="dxa" w:w="120"/>
+            </w:tcMar>
+          </w:tcPr>
+          <w:p>
+            <w:r>
+              <w:rPr>
+                <w:rFonts w:ascii="Arial" w:cs="Arial" w:eastAsia="Arial" w:hAnsi="Arial"/>
+                <w:b w:val="false"/>
+                <w:bCs w:val="false"/>
+                <w:color w:val="000000"/>
+                <w:sz w:val="20"/>
+                <w:szCs w:val="20"/>
+              </w:rPr>
+              <w:t xml:space="preserve">Ignores prediction, asks customer directly</w:t>
+            </w:r>
+          </w:p>
+        </w:tc>
+      </w:tr>
+      <w:tr>
+        <w:tc>
+          <w:tcPr>
+            <w:tcW w:type="dxa" w:w="2800"/>
+            <w:tcBorders>
+              <w:top w:val="single" w:color="CCCCCC" w:sz="1"/>
+              <w:left w:val="single" w:color="CCCCCC" w:sz="1"/>
+              <w:bottom w:val="single" w:color="CCCCCC" w:sz="1"/>
+              <w:right w:val="single" w:color="CCCCCC" w:sz="1"/>
+            </w:tcBorders>
+            <w:shd w:fill="FFFFFF" w:val="clear"/>
+            <w:tcMar>
+              <w:top w:type="dxa" w:w="80"/>
+              <w:left w:type="dxa" w:w="120"/>
+              <w:bottom w:type="dxa" w:w="80"/>
+              <w:right w:type="dxa" w:w="120"/>
+            </w:tcMar>
+          </w:tcPr>
+          <w:p>
+            <w:r>
+              <w:rPr>
+                <w:rFonts w:ascii="Arial" w:cs="Arial" w:eastAsia="Arial" w:hAnsi="Arial"/>
+                <w:b w:val="false"/>
+                <w:bCs w:val="false"/>
+                <w:color w:val="000000"/>
+                <w:sz w:val="20"/>
+                <w:szCs w:val="20"/>
+              </w:rPr>
+              <w:t xml:space="preserve">High confidence, no negation</w:t>
+            </w:r>
+          </w:p>
+        </w:tc>
+        <w:tc>
+          <w:tcPr>
+            <w:tcW w:type="dxa" w:w="2400"/>
+            <w:tcBorders>
+              <w:top w:val="single" w:color="CCCCCC" w:sz="1"/>
+              <w:left w:val="single" w:color="CCCCCC" w:sz="1"/>
+              <w:bottom w:val="single" w:color="CCCCCC" w:sz="1"/>
+              <w:right w:val="single" w:color="CCCCCC" w:sz="1"/>
+            </w:tcBorders>
+            <w:shd w:fill="FFFFFF" w:val="clear"/>
+            <w:tcMar>
+              <w:top w:type="dxa" w:w="80"/>
+              <w:left w:type="dxa" w:w="120"/>
+              <w:bottom w:type="dxa" w:w="80"/>
+              <w:right w:type="dxa" w:w="120"/>
+            </w:tcMar>
+          </w:tcPr>
+          <w:p>
+            <w:r>
+              <w:rPr>
+                <w:rFonts w:ascii="Arial" w:cs="Arial" w:eastAsia="Arial" w:hAnsi="Arial"/>
+                <w:b w:val="false"/>
+                <w:bCs w:val="false"/>
+                <w:color w:val="000000"/>
+                <w:sz w:val="20"/>
+                <w:szCs w:val="20"/>
+              </w:rPr>
+              <w:t xml:space="preserve">Neither</w:t>
+            </w:r>
+          </w:p>
+        </w:tc>
+        <w:tc>
+          <w:tcPr>
+            <w:tcW w:type="dxa" w:w="4160"/>
+            <w:tcBorders>
+              <w:top w:val="single" w:color="CCCCCC" w:sz="1"/>
+              <w:left w:val="single" w:color="CCCCCC" w:sz="1"/>
+              <w:bottom w:val="single" w:color="CCCCCC" w:sz="1"/>
+              <w:right w:val="single" w:color="CCCCCC" w:sz="1"/>
+            </w:tcBorders>
+            <w:shd w:fill="FFFFFF" w:val="clear"/>
+            <w:tcMar>
+              <w:top w:type="dxa" w:w="80"/>
+              <w:left w:type="dxa" w:w="120"/>
+              <w:bottom w:type="dxa" w:w="80"/>
+              <w:right w:type="dxa" w:w="120"/>
+            </w:tcMar>
+          </w:tcPr>
+          <w:p>
+            <w:r>
+              <w:rPr>
+                <w:rFonts w:ascii="Arial" w:cs="Arial" w:eastAsia="Arial" w:hAnsi="Arial"/>
+                <w:b w:val="false"/>
+                <w:bCs w:val="false"/>
+                <w:color w:val="000000"/>
+                <w:sz w:val="20"/>
+                <w:szCs w:val="20"/>
+              </w:rPr>
+              <w:t xml:space="preserve">Uses API prediction, starts correct flow</w:t>
+            </w:r>
+          </w:p>
+        </w:tc>
+      </w:tr>
+    </w:tbl>
     <w:p>
       <w:pPr>
         <w:spacing w:after="80" w:before="80"/>
@@ -9394,7 +9693,7 @@
           <w:sz w:val="22"/>
           <w:szCs w:val="22"/>
         </w:rPr>
-        <w:t xml:space="preserve">The complete application was containerized using Docker with Python 3.11-slim. WSL 2 was required on Windows development machines.</w:t>
+        <w:t xml:space="preserve">The complete application was containerized using Docker with Python 3.11-slim. WSL 2 was required on Windows development machines to enable Docker Desktop.</w:t>
       </w:r>
     </w:p>
     <w:p>
@@ -9431,7 +9730,7 @@
           <w:sz w:val="22"/>
           <w:szCs w:val="22"/>
         </w:rPr>
-        <w:t xml:space="preserve">All overfitting remediation and negation handling experiments were conducted on Google Colab T4 GPU, reducing training time from 15 minutes per run to 2-3 minutes. Training data was stored in Google Drive and accessed directly from Colab sessions.</w:t>
+        <w:t xml:space="preserve">All overfitting remediation and negation handling experiments were conducted on Google Colab T4 GPU, reducing training time from 15 minutes per run on CPU to 2-3 minutes. Training data was stored in Google Drive and accessed directly from Colab sessions.</w:t>
       </w:r>
     </w:p>
     <w:p>
@@ -10117,7 +10416,7 @@
           <w:sz w:val="22"/>
           <w:szCs w:val="22"/>
         </w:rPr>
-        <w:t xml:space="preserve">Mild overfitting observed (10% gap between train and validation accuracy)</w:t>
+        <w:t xml:space="preserve">Mild overfitting observed (10% gap between training and validation accuracy) due to limited dataset size</w:t>
       </w:r>
     </w:p>
     <w:p>
@@ -10135,7 +10434,7 @@
           <w:sz w:val="22"/>
           <w:szCs w:val="22"/>
         </w:rPr>
-        <w:t xml:space="preserve">Negation handling weakness — short phrases with implicit negative sentiment can be misclassified</w:t>
+        <w:t xml:space="preserve">Negation handling weakness in the LSTM model — addressed at the application layer via negation pre-check and confidence threshold</w:t>
       </w:r>
     </w:p>
     <w:p>
@@ -10171,7 +10470,7 @@
           <w:sz w:val="22"/>
           <w:szCs w:val="22"/>
         </w:rPr>
-        <w:t xml:space="preserve">RAG knowledge base contains only 14 entries</w:t>
+        <w:t xml:space="preserve">RAG knowledge base contains only 14 entries — production system would benefit from a larger knowledge base</w:t>
       </w:r>
     </w:p>
     <w:p>
@@ -10231,7 +10530,7 @@
           <w:sz w:val="22"/>
           <w:szCs w:val="22"/>
         </w:rPr>
-        <w:t xml:space="preserve">Collect more diverse labeled data to address overfitting and negation handling at the root cause level</w:t>
+        <w:t xml:space="preserve">Collect significantly more diverse labeled data to address overfitting and negation handling at the model level</w:t>
       </w:r>
     </w:p>
     <w:p>
@@ -10249,7 +10548,7 @@
           <w:sz w:val="22"/>
           <w:szCs w:val="22"/>
         </w:rPr>
-        <w:t xml:space="preserve">Fine-tune a pretrained transformer (DistilBERT or RoBERTa) on the combined dataset</w:t>
+        <w:t xml:space="preserve">Fine-tune a pretrained transformer (DistilBERT or RoBERTa) which natively handles negation through attention mechanisms</w:t>
       </w:r>
     </w:p>
     <w:p>
@@ -10285,7 +10584,7 @@
           <w:sz w:val="22"/>
           <w:szCs w:val="22"/>
         </w:rPr>
-        <w:t xml:space="preserve">Deploy to cloud infrastructure for public accessibility</w:t>
+        <w:t xml:space="preserve">Deploy to cloud infrastructure for public accessibility and scalability testing</w:t>
       </w:r>
     </w:p>
     <w:p>
@@ -10303,7 +10602,7 @@
           <w:sz w:val="22"/>
           <w:szCs w:val="22"/>
         </w:rPr>
-        <w:t xml:space="preserve">Add multilingual support</w:t>
+        <w:t xml:space="preserve">Add multilingual support for non-English speaking markets</w:t>
       </w:r>
     </w:p>
     <w:p>
@@ -10348,7 +10647,7 @@
           <w:sz w:val="22"/>
           <w:szCs w:val="22"/>
         </w:rPr>
-        <w:t xml:space="preserve">LensWord demonstrates that a custom-trained domain-specific model can outperform large pretrained models when trained on appropriately balanced data. Macro F1 improved from 67.99% to 88.40% through iterative experimentation. The project produced several meaningful engineering insights: the importance of dataset balance over model complexity, the risks of aggressive class weight adjustment, the value of documenting failures honestly, and the insight that targeted data augmentation for specific linguistic patterns requires careful calibration to avoid introducing new misclassifications.</w:t>
+        <w:t xml:space="preserve">LensWord demonstrates that a custom-trained domain-specific model can outperform large pretrained models when trained on appropriately balanced data. Macro F1 improved from 67.99% to 88.40% through iterative experimentation. The project produced several meaningful engineering insights beyond accuracy metrics.</w:t>
       </w:r>
     </w:p>
     <w:p>
@@ -10369,7 +10668,28 @@
           <w:sz w:val="22"/>
           <w:szCs w:val="22"/>
         </w:rPr>
-        <w:t xml:space="preserve">The dual-interface system combining a business analytics dashboard with a customer-facing conversational chatbot — complete with a confidence threshold for handling edge cases — demonstrates practical product thinking beyond model accuracy metrics.</w:t>
+        <w:t xml:space="preserve">Most significantly, the negation handling challenge led to a practical engineering decision: rather than degrading a well-performing model by forcing it to learn patterns it lacked sufficient data for, the team implemented a two-layer application-level solution combining negation pre-check and confidence thresholding. This approach — solving model limitations at the application layer rather than the model layer — reflects real-world production AI engineering practice.</w:t>
+      </w:r>
+    </w:p>
+    <w:p>
+      <w:pPr>
+        <w:spacing w:after="80" w:before="80"/>
+      </w:pPr>
+      <w:r>
+        <w:t xml:space="preserve"/>
+      </w:r>
+    </w:p>
+    <w:p>
+      <w:pPr>
+        <w:spacing w:after="80" w:before="80"/>
+      </w:pPr>
+      <w:r>
+        <w:rPr>
+          <w:rFonts w:ascii="Arial" w:cs="Arial" w:eastAsia="Arial" w:hAnsi="Arial"/>
+          <w:sz w:val="22"/>
+          <w:szCs w:val="22"/>
+        </w:rPr>
+        <w:t xml:space="preserve">The dual-interface system combining a business analytics dashboard with a customer-facing conversational chatbot demonstrates practical product thinking beyond model accuracy, creating a system that serves both business intelligence and customer experience needs simultaneously.</w:t>
       </w:r>
     </w:p>
     <w:p>

</xml_diff>